<commit_message>
feat: complete HomeEase 60% FYP milestone (Milestones 1-5)
- Integrated live Supabase backend with PostgreSQL tables, RLS policies, triggers, and Abbottabad seed data
- Implemented SupabaseAuthService with GoTrue role-based access control (Household vs Worker)
- Built WorkerRepository, JobRepository, and BookingRepository with PostgREST joins and deterministic fallback
- Integrated AIRecommendationEngine with Cosine skill match, Haversine spatial decay, Bayesian rating prior, and XAI badges
- Implemented interval overlap conflict engine (S_req < E_exist AND E_req > S_exist) for booking creation
- Connected HomeEaseFlow state machine, post_job_screen, worker_job_feed_screen, and booking_request_screen
- Cleaned Flutter analyze deprecations (0 errors, 0 warnings)
- Built comprehensive 214-test suite passing 100%
</commit_message>
<xml_diff>
--- a/Docs/30 Percent/HomeEase-SDD.docx
+++ b/Docs/30 Percent/HomeEase-SDD.docx
@@ -30,7 +30,7 @@
           <w:szCs w:val="44"/>
         </w:rPr>
         <w:drawing>
-          <wp:anchor distT="0" distB="0" distL="114300" distR="114300" simplePos="0" relativeHeight="251734528" behindDoc="0" locked="0" layoutInCell="1" allowOverlap="1" wp14:anchorId="1E1FAD3C" wp14:editId="24B37A9F">
+          <wp:anchor distT="0" distB="0" distL="114300" distR="114300" simplePos="0" relativeHeight="251696128" behindDoc="0" locked="0" layoutInCell="1" allowOverlap="1" wp14:anchorId="1E1FAD3C" wp14:editId="24B37A9F">
             <wp:simplePos x="0" y="0"/>
             <wp:positionH relativeFrom="column">
               <wp:posOffset>12700</wp:posOffset>
@@ -553,6 +553,8 @@
             <w:pStyle w:val="TOC1"/>
             <w:rPr>
               <w:rFonts w:ascii="Times New Roman" w:hAnsi="Times New Roman" w:cs="Times New Roman"/>
+              <w:b w:val="0"/>
+              <w:bCs w:val="0"/>
               <w:kern w:val="2"/>
               <w14:ligatures w14:val="standardContextual"/>
             </w:rPr>
@@ -575,19 +577,19 @@
             </w:rPr>
             <w:fldChar w:fldCharType="separate"/>
           </w:r>
-          <w:hyperlink w:anchor="_Toc234323940" w:history="1">
+          <w:hyperlink w:anchor="_Toc234926735" w:history="1">
             <w:r>
               <w:rPr>
                 <w:rStyle w:val="Hyperlink"/>
+                <w:rFonts w:ascii="Times New Roman" w:hAnsi="Times New Roman" w:cs="Times New Roman"/>
+              </w:rPr>
+              <w:t>1.</w:t>
+            </w:r>
+            <w:r>
+              <w:rPr>
                 <w:rFonts w:ascii="Times New Roman" w:hAnsi="Times New Roman" w:cs="Times New Roman"/>
                 <w:b w:val="0"/>
                 <w:bCs w:val="0"/>
-              </w:rPr>
-              <w:t>1.</w:t>
-            </w:r>
-            <w:r>
-              <w:rPr>
-                <w:rFonts w:ascii="Times New Roman" w:hAnsi="Times New Roman" w:cs="Times New Roman"/>
                 <w:kern w:val="2"/>
                 <w14:ligatures w14:val="standardContextual"/>
               </w:rPr>
@@ -619,7 +621,7 @@
                 <w:rFonts w:ascii="Times New Roman" w:hAnsi="Times New Roman" w:cs="Times New Roman"/>
                 <w:webHidden/>
               </w:rPr>
-              <w:instrText xml:space="preserve"> PAGEREF _Toc234323940 \h </w:instrText>
+              <w:instrText xml:space="preserve"> PAGEREF _Toc234926735 \h </w:instrText>
             </w:r>
             <w:r>
               <w:rPr>
@@ -639,7 +641,7 @@
                 <w:rFonts w:ascii="Times New Roman" w:hAnsi="Times New Roman" w:cs="Times New Roman"/>
                 <w:webHidden/>
               </w:rPr>
-              <w:t>5</w:t>
+              <w:t>6</w:t>
             </w:r>
             <w:r>
               <w:rPr>
@@ -657,7 +659,6 @@
               <w:tab w:val="left" w:pos="960"/>
               <w:tab w:val="right" w:leader="dot" w:pos="9350"/>
             </w:tabs>
-            <w:spacing w:after="0"/>
             <w:rPr>
               <w:rFonts w:ascii="Times New Roman" w:hAnsi="Times New Roman" w:cs="Times New Roman"/>
               <w:noProof/>
@@ -665,7 +666,7 @@
               <w14:ligatures w14:val="standardContextual"/>
             </w:rPr>
           </w:pPr>
-          <w:hyperlink w:anchor="_Toc234323941" w:history="1">
+          <w:hyperlink w:anchor="_Toc234926736" w:history="1">
             <w:r>
               <w:rPr>
                 <w:rStyle w:val="Hyperlink"/>
@@ -713,7 +714,7 @@
                 <w:noProof/>
                 <w:webHidden/>
               </w:rPr>
-              <w:instrText xml:space="preserve"> PAGEREF _Toc234323941 \h </w:instrText>
+              <w:instrText xml:space="preserve"> PAGEREF _Toc234926736 \h </w:instrText>
             </w:r>
             <w:r>
               <w:rPr>
@@ -736,7 +737,7 @@
                 <w:noProof/>
                 <w:webHidden/>
               </w:rPr>
-              <w:t>5</w:t>
+              <w:t>6</w:t>
             </w:r>
             <w:r>
               <w:rPr>
@@ -755,7 +756,6 @@
               <w:tab w:val="left" w:pos="960"/>
               <w:tab w:val="right" w:leader="dot" w:pos="9350"/>
             </w:tabs>
-            <w:spacing w:after="0"/>
             <w:rPr>
               <w:rFonts w:ascii="Times New Roman" w:hAnsi="Times New Roman" w:cs="Times New Roman"/>
               <w:noProof/>
@@ -763,7 +763,7 @@
               <w14:ligatures w14:val="standardContextual"/>
             </w:rPr>
           </w:pPr>
-          <w:hyperlink w:anchor="_Toc234323942" w:history="1">
+          <w:hyperlink w:anchor="_Toc234926737" w:history="1">
             <w:r>
               <w:rPr>
                 <w:rStyle w:val="Hyperlink"/>
@@ -811,7 +811,7 @@
                 <w:noProof/>
                 <w:webHidden/>
               </w:rPr>
-              <w:instrText xml:space="preserve"> PAGEREF _Toc234323942 \h </w:instrText>
+              <w:instrText xml:space="preserve"> PAGEREF _Toc234926737 \h </w:instrText>
             </w:r>
             <w:r>
               <w:rPr>
@@ -834,7 +834,7 @@
                 <w:noProof/>
                 <w:webHidden/>
               </w:rPr>
-              <w:t>5</w:t>
+              <w:t>6</w:t>
             </w:r>
             <w:r>
               <w:rPr>
@@ -851,11 +851,13 @@
             <w:pStyle w:val="TOC1"/>
             <w:rPr>
               <w:rFonts w:ascii="Times New Roman" w:hAnsi="Times New Roman" w:cs="Times New Roman"/>
+              <w:b w:val="0"/>
+              <w:bCs w:val="0"/>
               <w:kern w:val="2"/>
               <w14:ligatures w14:val="standardContextual"/>
             </w:rPr>
           </w:pPr>
-          <w:hyperlink w:anchor="_Toc234323943" w:history="1">
+          <w:hyperlink w:anchor="_Toc234926738" w:history="1">
             <w:r>
               <w:rPr>
                 <w:rStyle w:val="Hyperlink"/>
@@ -866,6 +868,8 @@
             <w:r>
               <w:rPr>
                 <w:rFonts w:ascii="Times New Roman" w:hAnsi="Times New Roman" w:cs="Times New Roman"/>
+                <w:b w:val="0"/>
+                <w:bCs w:val="0"/>
                 <w:kern w:val="2"/>
                 <w14:ligatures w14:val="standardContextual"/>
               </w:rPr>
@@ -897,7 +901,7 @@
                 <w:rFonts w:ascii="Times New Roman" w:hAnsi="Times New Roman" w:cs="Times New Roman"/>
                 <w:webHidden/>
               </w:rPr>
-              <w:instrText xml:space="preserve"> PAGEREF _Toc234323943 \h </w:instrText>
+              <w:instrText xml:space="preserve"> PAGEREF _Toc234926738 \h </w:instrText>
             </w:r>
             <w:r>
               <w:rPr>
@@ -917,7 +921,7 @@
                 <w:rFonts w:ascii="Times New Roman" w:hAnsi="Times New Roman" w:cs="Times New Roman"/>
                 <w:webHidden/>
               </w:rPr>
-              <w:t>6</w:t>
+              <w:t>7</w:t>
             </w:r>
             <w:r>
               <w:rPr>
@@ -935,7 +939,6 @@
               <w:tab w:val="left" w:pos="960"/>
               <w:tab w:val="right" w:leader="dot" w:pos="9350"/>
             </w:tabs>
-            <w:spacing w:after="0"/>
             <w:rPr>
               <w:rFonts w:ascii="Times New Roman" w:hAnsi="Times New Roman" w:cs="Times New Roman"/>
               <w:noProof/>
@@ -943,7 +946,7 @@
               <w14:ligatures w14:val="standardContextual"/>
             </w:rPr>
           </w:pPr>
-          <w:hyperlink w:anchor="_Toc234323944" w:history="1">
+          <w:hyperlink w:anchor="_Toc234926739" w:history="1">
             <w:r>
               <w:rPr>
                 <w:rStyle w:val="Hyperlink"/>
@@ -991,7 +994,7 @@
                 <w:noProof/>
                 <w:webHidden/>
               </w:rPr>
-              <w:instrText xml:space="preserve"> PAGEREF _Toc234323944 \h </w:instrText>
+              <w:instrText xml:space="preserve"> PAGEREF _Toc234926739 \h </w:instrText>
             </w:r>
             <w:r>
               <w:rPr>
@@ -1014,7 +1017,7 @@
                 <w:noProof/>
                 <w:webHidden/>
               </w:rPr>
-              <w:t>6</w:t>
+              <w:t>7</w:t>
             </w:r>
             <w:r>
               <w:rPr>
@@ -1033,7 +1036,6 @@
               <w:tab w:val="left" w:pos="960"/>
               <w:tab w:val="right" w:leader="dot" w:pos="9350"/>
             </w:tabs>
-            <w:spacing w:after="0"/>
             <w:rPr>
               <w:rFonts w:ascii="Times New Roman" w:hAnsi="Times New Roman" w:cs="Times New Roman"/>
               <w:noProof/>
@@ -1041,7 +1043,7 @@
               <w14:ligatures w14:val="standardContextual"/>
             </w:rPr>
           </w:pPr>
-          <w:hyperlink w:anchor="_Toc234323945" w:history="1">
+          <w:hyperlink w:anchor="_Toc234926740" w:history="1">
             <w:r>
               <w:rPr>
                 <w:rStyle w:val="Hyperlink"/>
@@ -1089,7 +1091,7 @@
                 <w:noProof/>
                 <w:webHidden/>
               </w:rPr>
-              <w:instrText xml:space="preserve"> PAGEREF _Toc234323945 \h </w:instrText>
+              <w:instrText xml:space="preserve"> PAGEREF _Toc234926740 \h </w:instrText>
             </w:r>
             <w:r>
               <w:rPr>
@@ -1112,7 +1114,7 @@
                 <w:noProof/>
                 <w:webHidden/>
               </w:rPr>
-              <w:t>7</w:t>
+              <w:t>8</w:t>
             </w:r>
             <w:r>
               <w:rPr>
@@ -1129,11 +1131,13 @@
             <w:pStyle w:val="TOC1"/>
             <w:rPr>
               <w:rFonts w:ascii="Times New Roman" w:hAnsi="Times New Roman" w:cs="Times New Roman"/>
+              <w:b w:val="0"/>
+              <w:bCs w:val="0"/>
               <w:kern w:val="2"/>
               <w14:ligatures w14:val="standardContextual"/>
             </w:rPr>
           </w:pPr>
-          <w:hyperlink w:anchor="_Toc234323946" w:history="1">
+          <w:hyperlink w:anchor="_Toc234926741" w:history="1">
             <w:r>
               <w:rPr>
                 <w:rStyle w:val="Hyperlink"/>
@@ -1144,6 +1148,8 @@
             <w:r>
               <w:rPr>
                 <w:rFonts w:ascii="Times New Roman" w:hAnsi="Times New Roman" w:cs="Times New Roman"/>
+                <w:b w:val="0"/>
+                <w:bCs w:val="0"/>
                 <w:kern w:val="2"/>
                 <w14:ligatures w14:val="standardContextual"/>
               </w:rPr>
@@ -1175,7 +1181,7 @@
                 <w:rFonts w:ascii="Times New Roman" w:hAnsi="Times New Roman" w:cs="Times New Roman"/>
                 <w:webHidden/>
               </w:rPr>
-              <w:instrText xml:space="preserve"> PAGEREF _Toc234323946 \h </w:instrText>
+              <w:instrText xml:space="preserve"> PAGEREF _Toc234926741 \h </w:instrText>
             </w:r>
             <w:r>
               <w:rPr>
@@ -1195,7 +1201,7 @@
                 <w:rFonts w:ascii="Times New Roman" w:hAnsi="Times New Roman" w:cs="Times New Roman"/>
                 <w:webHidden/>
               </w:rPr>
-              <w:t>7</w:t>
+              <w:t>8</w:t>
             </w:r>
             <w:r>
               <w:rPr>
@@ -1213,7 +1219,6 @@
               <w:tab w:val="left" w:pos="960"/>
               <w:tab w:val="right" w:leader="dot" w:pos="9350"/>
             </w:tabs>
-            <w:spacing w:after="0"/>
             <w:rPr>
               <w:rFonts w:ascii="Times New Roman" w:hAnsi="Times New Roman" w:cs="Times New Roman"/>
               <w:noProof/>
@@ -1221,7 +1226,7 @@
               <w14:ligatures w14:val="standardContextual"/>
             </w:rPr>
           </w:pPr>
-          <w:hyperlink w:anchor="_Toc234323947" w:history="1">
+          <w:hyperlink w:anchor="_Toc234926742" w:history="1">
             <w:r>
               <w:rPr>
                 <w:rStyle w:val="Hyperlink"/>
@@ -1269,7 +1274,7 @@
                 <w:noProof/>
                 <w:webHidden/>
               </w:rPr>
-              <w:instrText xml:space="preserve"> PAGEREF _Toc234323947 \h </w:instrText>
+              <w:instrText xml:space="preserve"> PAGEREF _Toc234926742 \h </w:instrText>
             </w:r>
             <w:r>
               <w:rPr>
@@ -1292,7 +1297,7 @@
                 <w:noProof/>
                 <w:webHidden/>
               </w:rPr>
-              <w:t>7</w:t>
+              <w:t>8</w:t>
             </w:r>
             <w:r>
               <w:rPr>
@@ -1311,7 +1316,6 @@
               <w:tab w:val="left" w:pos="960"/>
               <w:tab w:val="right" w:leader="dot" w:pos="9350"/>
             </w:tabs>
-            <w:spacing w:after="0"/>
             <w:rPr>
               <w:rFonts w:ascii="Times New Roman" w:hAnsi="Times New Roman" w:cs="Times New Roman"/>
               <w:noProof/>
@@ -1319,7 +1323,7 @@
               <w14:ligatures w14:val="standardContextual"/>
             </w:rPr>
           </w:pPr>
-          <w:hyperlink w:anchor="_Toc234323948" w:history="1">
+          <w:hyperlink w:anchor="_Toc234926743" w:history="1">
             <w:r>
               <w:rPr>
                 <w:rStyle w:val="Hyperlink"/>
@@ -1367,7 +1371,7 @@
                 <w:noProof/>
                 <w:webHidden/>
               </w:rPr>
-              <w:instrText xml:space="preserve"> PAGEREF _Toc234323948 \h </w:instrText>
+              <w:instrText xml:space="preserve"> PAGEREF _Toc234926743 \h </w:instrText>
             </w:r>
             <w:r>
               <w:rPr>
@@ -1390,7 +1394,7 @@
                 <w:noProof/>
                 <w:webHidden/>
               </w:rPr>
-              <w:t>9</w:t>
+              <w:t>10</w:t>
             </w:r>
             <w:r>
               <w:rPr>
@@ -1409,7 +1413,6 @@
               <w:tab w:val="left" w:pos="960"/>
               <w:tab w:val="right" w:leader="dot" w:pos="9350"/>
             </w:tabs>
-            <w:spacing w:after="0"/>
             <w:rPr>
               <w:rFonts w:ascii="Times New Roman" w:hAnsi="Times New Roman" w:cs="Times New Roman"/>
               <w:noProof/>
@@ -1417,7 +1420,7 @@
               <w14:ligatures w14:val="standardContextual"/>
             </w:rPr>
           </w:pPr>
-          <w:hyperlink w:anchor="_Toc234323949" w:history="1">
+          <w:hyperlink w:anchor="_Toc234926744" w:history="1">
             <w:r>
               <w:rPr>
                 <w:rStyle w:val="Hyperlink"/>
@@ -1465,7 +1468,7 @@
                 <w:noProof/>
                 <w:webHidden/>
               </w:rPr>
-              <w:instrText xml:space="preserve"> PAGEREF _Toc234323949 \h </w:instrText>
+              <w:instrText xml:space="preserve"> PAGEREF _Toc234926744 \h </w:instrText>
             </w:r>
             <w:r>
               <w:rPr>
@@ -1488,7 +1491,7 @@
                 <w:noProof/>
                 <w:webHidden/>
               </w:rPr>
-              <w:t>10</w:t>
+              <w:t>11</w:t>
             </w:r>
             <w:r>
               <w:rPr>
@@ -1507,7 +1510,6 @@
               <w:tab w:val="left" w:pos="960"/>
               <w:tab w:val="right" w:leader="dot" w:pos="9350"/>
             </w:tabs>
-            <w:spacing w:after="0"/>
             <w:rPr>
               <w:rFonts w:ascii="Times New Roman" w:hAnsi="Times New Roman" w:cs="Times New Roman"/>
               <w:noProof/>
@@ -1515,7 +1517,7 @@
               <w14:ligatures w14:val="standardContextual"/>
             </w:rPr>
           </w:pPr>
-          <w:hyperlink w:anchor="_Toc234323950" w:history="1">
+          <w:hyperlink w:anchor="_Toc234926745" w:history="1">
             <w:r>
               <w:rPr>
                 <w:rStyle w:val="Hyperlink"/>
@@ -1563,7 +1565,7 @@
                 <w:noProof/>
                 <w:webHidden/>
               </w:rPr>
-              <w:instrText xml:space="preserve"> PAGEREF _Toc234323950 \h </w:instrText>
+              <w:instrText xml:space="preserve"> PAGEREF _Toc234926745 \h </w:instrText>
             </w:r>
             <w:r>
               <w:rPr>
@@ -1586,7 +1588,7 @@
                 <w:noProof/>
                 <w:webHidden/>
               </w:rPr>
-              <w:t>11</w:t>
+              <w:t>12</w:t>
             </w:r>
             <w:r>
               <w:rPr>
@@ -1603,11 +1605,13 @@
             <w:pStyle w:val="TOC1"/>
             <w:rPr>
               <w:rFonts w:ascii="Times New Roman" w:hAnsi="Times New Roman" w:cs="Times New Roman"/>
+              <w:b w:val="0"/>
+              <w:bCs w:val="0"/>
               <w:kern w:val="2"/>
               <w14:ligatures w14:val="standardContextual"/>
             </w:rPr>
           </w:pPr>
-          <w:hyperlink w:anchor="_Toc234323951" w:history="1">
+          <w:hyperlink w:anchor="_Toc234926746" w:history="1">
             <w:r>
               <w:rPr>
                 <w:rStyle w:val="Hyperlink"/>
@@ -1618,6 +1622,8 @@
             <w:r>
               <w:rPr>
                 <w:rFonts w:ascii="Times New Roman" w:hAnsi="Times New Roman" w:cs="Times New Roman"/>
+                <w:b w:val="0"/>
+                <w:bCs w:val="0"/>
                 <w:kern w:val="2"/>
                 <w14:ligatures w14:val="standardContextual"/>
               </w:rPr>
@@ -1649,7 +1655,7 @@
                 <w:rFonts w:ascii="Times New Roman" w:hAnsi="Times New Roman" w:cs="Times New Roman"/>
                 <w:webHidden/>
               </w:rPr>
-              <w:instrText xml:space="preserve"> PAGEREF _Toc234323951 \h </w:instrText>
+              <w:instrText xml:space="preserve"> PAGEREF _Toc234926746 \h </w:instrText>
             </w:r>
             <w:r>
               <w:rPr>
@@ -1669,7 +1675,7 @@
                 <w:rFonts w:ascii="Times New Roman" w:hAnsi="Times New Roman" w:cs="Times New Roman"/>
                 <w:webHidden/>
               </w:rPr>
-              <w:t>12</w:t>
+              <w:t>13</w:t>
             </w:r>
             <w:r>
               <w:rPr>
@@ -1687,7 +1693,6 @@
               <w:tab w:val="left" w:pos="960"/>
               <w:tab w:val="right" w:leader="dot" w:pos="9350"/>
             </w:tabs>
-            <w:spacing w:after="0"/>
             <w:rPr>
               <w:rFonts w:ascii="Times New Roman" w:hAnsi="Times New Roman" w:cs="Times New Roman"/>
               <w:noProof/>
@@ -1695,7 +1700,7 @@
               <w14:ligatures w14:val="standardContextual"/>
             </w:rPr>
           </w:pPr>
-          <w:hyperlink w:anchor="_Toc234323952" w:history="1">
+          <w:hyperlink w:anchor="_Toc234926747" w:history="1">
             <w:r>
               <w:rPr>
                 <w:rStyle w:val="Hyperlink"/>
@@ -1743,7 +1748,7 @@
                 <w:noProof/>
                 <w:webHidden/>
               </w:rPr>
-              <w:instrText xml:space="preserve"> PAGEREF _Toc234323952 \h </w:instrText>
+              <w:instrText xml:space="preserve"> PAGEREF _Toc234926747 \h </w:instrText>
             </w:r>
             <w:r>
               <w:rPr>
@@ -1766,7 +1771,7 @@
                 <w:noProof/>
                 <w:webHidden/>
               </w:rPr>
-              <w:t>12</w:t>
+              <w:t>13</w:t>
             </w:r>
             <w:r>
               <w:rPr>
@@ -1785,7 +1790,6 @@
               <w:tab w:val="left" w:pos="960"/>
               <w:tab w:val="right" w:leader="dot" w:pos="9350"/>
             </w:tabs>
-            <w:spacing w:after="0"/>
             <w:rPr>
               <w:rFonts w:ascii="Times New Roman" w:hAnsi="Times New Roman" w:cs="Times New Roman"/>
               <w:noProof/>
@@ -1793,7 +1797,7 @@
               <w14:ligatures w14:val="standardContextual"/>
             </w:rPr>
           </w:pPr>
-          <w:hyperlink w:anchor="_Toc234323953" w:history="1">
+          <w:hyperlink w:anchor="_Toc234926748" w:history="1">
             <w:r>
               <w:rPr>
                 <w:rStyle w:val="Hyperlink"/>
@@ -1817,7 +1821,7 @@
                 <w:rFonts w:ascii="Times New Roman" w:hAnsi="Times New Roman" w:cs="Times New Roman"/>
                 <w:noProof/>
               </w:rPr>
-              <w:t>Sequence Diagram Descriptions</w:t>
+              <w:t xml:space="preserve">Sequence Diagram </w:t>
             </w:r>
             <w:r>
               <w:rPr>
@@ -1841,7 +1845,7 @@
                 <w:noProof/>
                 <w:webHidden/>
               </w:rPr>
-              <w:instrText xml:space="preserve"> PAGEREF _Toc234323953 \h </w:instrText>
+              <w:instrText xml:space="preserve"> PAGEREF _Toc234926748 \h </w:instrText>
             </w:r>
             <w:r>
               <w:rPr>
@@ -1864,7 +1868,7 @@
                 <w:noProof/>
                 <w:webHidden/>
               </w:rPr>
-              <w:t>13</w:t>
+              <w:t>14</w:t>
             </w:r>
             <w:r>
               <w:rPr>
@@ -1883,7 +1887,6 @@
               <w:tab w:val="left" w:pos="960"/>
               <w:tab w:val="right" w:leader="dot" w:pos="9350"/>
             </w:tabs>
-            <w:spacing w:after="0"/>
             <w:rPr>
               <w:rFonts w:ascii="Times New Roman" w:hAnsi="Times New Roman" w:cs="Times New Roman"/>
               <w:noProof/>
@@ -1891,7 +1894,7 @@
               <w14:ligatures w14:val="standardContextual"/>
             </w:rPr>
           </w:pPr>
-          <w:hyperlink w:anchor="_Toc234323954" w:history="1">
+          <w:hyperlink w:anchor="_Toc234926749" w:history="1">
             <w:r>
               <w:rPr>
                 <w:rStyle w:val="Hyperlink"/>
@@ -1939,7 +1942,7 @@
                 <w:noProof/>
                 <w:webHidden/>
               </w:rPr>
-              <w:instrText xml:space="preserve"> PAGEREF _Toc234323954 \h </w:instrText>
+              <w:instrText xml:space="preserve"> PAGEREF _Toc234926749 \h </w:instrText>
             </w:r>
             <w:r>
               <w:rPr>
@@ -1962,7 +1965,7 @@
                 <w:noProof/>
                 <w:webHidden/>
               </w:rPr>
-              <w:t>14</w:t>
+              <w:t>15</w:t>
             </w:r>
             <w:r>
               <w:rPr>
@@ -1979,11 +1982,13 @@
             <w:pStyle w:val="TOC1"/>
             <w:rPr>
               <w:rFonts w:ascii="Times New Roman" w:hAnsi="Times New Roman" w:cs="Times New Roman"/>
+              <w:b w:val="0"/>
+              <w:bCs w:val="0"/>
               <w:kern w:val="2"/>
               <w14:ligatures w14:val="standardContextual"/>
             </w:rPr>
           </w:pPr>
-          <w:hyperlink w:anchor="_Toc234323955" w:history="1">
+          <w:hyperlink w:anchor="_Toc234926750" w:history="1">
             <w:r>
               <w:rPr>
                 <w:rStyle w:val="Hyperlink"/>
@@ -1994,6 +1999,8 @@
             <w:r>
               <w:rPr>
                 <w:rFonts w:ascii="Times New Roman" w:hAnsi="Times New Roman" w:cs="Times New Roman"/>
+                <w:b w:val="0"/>
+                <w:bCs w:val="0"/>
                 <w:kern w:val="2"/>
                 <w14:ligatures w14:val="standardContextual"/>
               </w:rPr>
@@ -2025,7 +2032,7 @@
                 <w:rFonts w:ascii="Times New Roman" w:hAnsi="Times New Roman" w:cs="Times New Roman"/>
                 <w:webHidden/>
               </w:rPr>
-              <w:instrText xml:space="preserve"> PAGEREF _Toc234323955 \h </w:instrText>
+              <w:instrText xml:space="preserve"> PAGEREF _Toc234926750 \h </w:instrText>
             </w:r>
             <w:r>
               <w:rPr>
@@ -2045,7 +2052,7 @@
                 <w:rFonts w:ascii="Times New Roman" w:hAnsi="Times New Roman" w:cs="Times New Roman"/>
                 <w:webHidden/>
               </w:rPr>
-              <w:t>15</w:t>
+              <w:t>16</w:t>
             </w:r>
             <w:r>
               <w:rPr>
@@ -2063,7 +2070,6 @@
               <w:tab w:val="left" w:pos="960"/>
               <w:tab w:val="right" w:leader="dot" w:pos="9350"/>
             </w:tabs>
-            <w:spacing w:after="0"/>
             <w:rPr>
               <w:rFonts w:ascii="Times New Roman" w:hAnsi="Times New Roman" w:cs="Times New Roman"/>
               <w:noProof/>
@@ -2071,7 +2077,7 @@
               <w14:ligatures w14:val="standardContextual"/>
             </w:rPr>
           </w:pPr>
-          <w:hyperlink w:anchor="_Toc234323956" w:history="1">
+          <w:hyperlink w:anchor="_Toc234926751" w:history="1">
             <w:r>
               <w:rPr>
                 <w:rStyle w:val="Hyperlink"/>
@@ -2119,7 +2125,7 @@
                 <w:noProof/>
                 <w:webHidden/>
               </w:rPr>
-              <w:instrText xml:space="preserve"> PAGEREF _Toc234323956 \h </w:instrText>
+              <w:instrText xml:space="preserve"> PAGEREF _Toc234926751 \h </w:instrText>
             </w:r>
             <w:r>
               <w:rPr>
@@ -2142,7 +2148,7 @@
                 <w:noProof/>
                 <w:webHidden/>
               </w:rPr>
-              <w:t>15</w:t>
+              <w:t>16</w:t>
             </w:r>
             <w:r>
               <w:rPr>
@@ -2161,7 +2167,6 @@
               <w:tab w:val="left" w:pos="960"/>
               <w:tab w:val="right" w:leader="dot" w:pos="9350"/>
             </w:tabs>
-            <w:spacing w:after="0"/>
             <w:rPr>
               <w:rFonts w:ascii="Times New Roman" w:hAnsi="Times New Roman" w:cs="Times New Roman"/>
               <w:noProof/>
@@ -2169,7 +2174,7 @@
               <w14:ligatures w14:val="standardContextual"/>
             </w:rPr>
           </w:pPr>
-          <w:hyperlink w:anchor="_Toc234323957" w:history="1">
+          <w:hyperlink w:anchor="_Toc234926752" w:history="1">
             <w:r>
               <w:rPr>
                 <w:rStyle w:val="Hyperlink"/>
@@ -2217,7 +2222,7 @@
                 <w:noProof/>
                 <w:webHidden/>
               </w:rPr>
-              <w:instrText xml:space="preserve"> PAGEREF _Toc234323957 \h </w:instrText>
+              <w:instrText xml:space="preserve"> PAGEREF _Toc234926752 \h </w:instrText>
             </w:r>
             <w:r>
               <w:rPr>
@@ -2240,7 +2245,7 @@
                 <w:noProof/>
                 <w:webHidden/>
               </w:rPr>
-              <w:t>16</w:t>
+              <w:t>17</w:t>
             </w:r>
             <w:r>
               <w:rPr>
@@ -2259,7 +2264,6 @@
               <w:tab w:val="left" w:pos="960"/>
               <w:tab w:val="right" w:leader="dot" w:pos="9350"/>
             </w:tabs>
-            <w:spacing w:after="0"/>
             <w:rPr>
               <w:rFonts w:ascii="Times New Roman" w:hAnsi="Times New Roman" w:cs="Times New Roman"/>
               <w:noProof/>
@@ -2267,7 +2271,7 @@
               <w14:ligatures w14:val="standardContextual"/>
             </w:rPr>
           </w:pPr>
-          <w:hyperlink w:anchor="_Toc234323958" w:history="1">
+          <w:hyperlink w:anchor="_Toc234926753" w:history="1">
             <w:r>
               <w:rPr>
                 <w:rStyle w:val="Hyperlink"/>
@@ -2315,7 +2319,7 @@
                 <w:noProof/>
                 <w:webHidden/>
               </w:rPr>
-              <w:instrText xml:space="preserve"> PAGEREF _Toc234323958 \h </w:instrText>
+              <w:instrText xml:space="preserve"> PAGEREF _Toc234926753 \h </w:instrText>
             </w:r>
             <w:r>
               <w:rPr>
@@ -2338,7 +2342,7 @@
                 <w:noProof/>
                 <w:webHidden/>
               </w:rPr>
-              <w:t>20</w:t>
+              <w:t>21</w:t>
             </w:r>
             <w:r>
               <w:rPr>
@@ -2355,11 +2359,13 @@
             <w:pStyle w:val="TOC1"/>
             <w:rPr>
               <w:rFonts w:ascii="Times New Roman" w:hAnsi="Times New Roman" w:cs="Times New Roman"/>
+              <w:b w:val="0"/>
+              <w:bCs w:val="0"/>
               <w:kern w:val="2"/>
               <w14:ligatures w14:val="standardContextual"/>
             </w:rPr>
           </w:pPr>
-          <w:hyperlink w:anchor="_Toc234323959" w:history="1">
+          <w:hyperlink w:anchor="_Toc234926754" w:history="1">
             <w:r>
               <w:rPr>
                 <w:rStyle w:val="Hyperlink"/>
@@ -2370,6 +2376,8 @@
             <w:r>
               <w:rPr>
                 <w:rFonts w:ascii="Times New Roman" w:hAnsi="Times New Roman" w:cs="Times New Roman"/>
+                <w:b w:val="0"/>
+                <w:bCs w:val="0"/>
                 <w:kern w:val="2"/>
                 <w14:ligatures w14:val="standardContextual"/>
               </w:rPr>
@@ -2401,7 +2409,7 @@
                 <w:rFonts w:ascii="Times New Roman" w:hAnsi="Times New Roman" w:cs="Times New Roman"/>
                 <w:webHidden/>
               </w:rPr>
-              <w:instrText xml:space="preserve"> PAGEREF _Toc234323959 \h </w:instrText>
+              <w:instrText xml:space="preserve"> PAGEREF _Toc234926754 \h </w:instrText>
             </w:r>
             <w:r>
               <w:rPr>
@@ -2421,7 +2429,7 @@
                 <w:rFonts w:ascii="Times New Roman" w:hAnsi="Times New Roman" w:cs="Times New Roman"/>
                 <w:webHidden/>
               </w:rPr>
-              <w:t>21</w:t>
+              <w:t>22</w:t>
             </w:r>
             <w:r>
               <w:rPr>
@@ -2437,11 +2445,13 @@
             <w:pStyle w:val="TOC1"/>
             <w:rPr>
               <w:rFonts w:ascii="Times New Roman" w:hAnsi="Times New Roman" w:cs="Times New Roman"/>
+              <w:b w:val="0"/>
+              <w:bCs w:val="0"/>
               <w:kern w:val="2"/>
               <w14:ligatures w14:val="standardContextual"/>
             </w:rPr>
           </w:pPr>
-          <w:hyperlink w:anchor="_Toc234323960" w:history="1">
+          <w:hyperlink w:anchor="_Toc234926755" w:history="1">
             <w:r>
               <w:rPr>
                 <w:rStyle w:val="Hyperlink"/>
@@ -2452,6 +2462,8 @@
             <w:r>
               <w:rPr>
                 <w:rFonts w:ascii="Times New Roman" w:hAnsi="Times New Roman" w:cs="Times New Roman"/>
+                <w:b w:val="0"/>
+                <w:bCs w:val="0"/>
                 <w:kern w:val="2"/>
                 <w14:ligatures w14:val="standardContextual"/>
               </w:rPr>
@@ -2483,7 +2495,7 @@
                 <w:rFonts w:ascii="Times New Roman" w:hAnsi="Times New Roman" w:cs="Times New Roman"/>
                 <w:webHidden/>
               </w:rPr>
-              <w:instrText xml:space="preserve"> PAGEREF _Toc234323960 \h </w:instrText>
+              <w:instrText xml:space="preserve"> PAGEREF _Toc234926755 \h </w:instrText>
             </w:r>
             <w:r>
               <w:rPr>
@@ -2503,7 +2515,7 @@
                 <w:rFonts w:ascii="Times New Roman" w:hAnsi="Times New Roman" w:cs="Times New Roman"/>
                 <w:webHidden/>
               </w:rPr>
-              <w:t>24</w:t>
+              <w:t>25</w:t>
             </w:r>
             <w:r>
               <w:rPr>
@@ -2519,11 +2531,13 @@
             <w:pStyle w:val="TOC1"/>
             <w:rPr>
               <w:rFonts w:ascii="Times New Roman" w:hAnsi="Times New Roman" w:cs="Times New Roman"/>
+              <w:b w:val="0"/>
+              <w:bCs w:val="0"/>
               <w:kern w:val="2"/>
               <w14:ligatures w14:val="standardContextual"/>
             </w:rPr>
           </w:pPr>
-          <w:hyperlink w:anchor="_Toc234323961" w:history="1">
+          <w:hyperlink w:anchor="_Toc234926756" w:history="1">
             <w:r>
               <w:rPr>
                 <w:rStyle w:val="Hyperlink"/>
@@ -2534,6 +2548,8 @@
             <w:r>
               <w:rPr>
                 <w:rFonts w:ascii="Times New Roman" w:hAnsi="Times New Roman" w:cs="Times New Roman"/>
+                <w:b w:val="0"/>
+                <w:bCs w:val="0"/>
                 <w:kern w:val="2"/>
                 <w14:ligatures w14:val="standardContextual"/>
               </w:rPr>
@@ -2565,7 +2581,7 @@
                 <w:rFonts w:ascii="Times New Roman" w:hAnsi="Times New Roman" w:cs="Times New Roman"/>
                 <w:webHidden/>
               </w:rPr>
-              <w:instrText xml:space="preserve"> PAGEREF _Toc234323961 \h </w:instrText>
+              <w:instrText xml:space="preserve"> PAGEREF _Toc234926756 \h </w:instrText>
             </w:r>
             <w:r>
               <w:rPr>
@@ -2585,7 +2601,7 @@
                 <w:rFonts w:ascii="Times New Roman" w:hAnsi="Times New Roman" w:cs="Times New Roman"/>
                 <w:webHidden/>
               </w:rPr>
-              <w:t>26</w:t>
+              <w:t>28</w:t>
             </w:r>
             <w:r>
               <w:rPr>
@@ -2603,7 +2619,6 @@
               <w:tab w:val="left" w:pos="960"/>
               <w:tab w:val="right" w:leader="dot" w:pos="9350"/>
             </w:tabs>
-            <w:spacing w:after="0"/>
             <w:rPr>
               <w:rFonts w:ascii="Times New Roman" w:hAnsi="Times New Roman" w:cs="Times New Roman"/>
               <w:noProof/>
@@ -2611,14 +2626,14 @@
               <w14:ligatures w14:val="standardContextual"/>
             </w:rPr>
           </w:pPr>
-          <w:hyperlink w:anchor="_Toc234323962" w:history="1">
+          <w:hyperlink w:anchor="_Toc234926757" w:history="1">
             <w:r>
               <w:rPr>
                 <w:rStyle w:val="Hyperlink"/>
                 <w:rFonts w:ascii="Times New Roman" w:hAnsi="Times New Roman" w:cs="Times New Roman"/>
                 <w:noProof/>
               </w:rPr>
-              <w:t>8.1.</w:t>
+              <w:t>8.1</w:t>
             </w:r>
             <w:r>
               <w:rPr>
@@ -2635,7 +2650,7 @@
                 <w:rFonts w:ascii="Times New Roman" w:hAnsi="Times New Roman" w:cs="Times New Roman"/>
                 <w:noProof/>
               </w:rPr>
-              <w:t>User Interface Overview</w:t>
+              <w:t>Mobile App</w:t>
             </w:r>
             <w:r>
               <w:rPr>
@@ -2659,7 +2674,7 @@
                 <w:noProof/>
                 <w:webHidden/>
               </w:rPr>
-              <w:instrText xml:space="preserve"> PAGEREF _Toc234323962 \h </w:instrText>
+              <w:instrText xml:space="preserve"> PAGEREF _Toc234926757 \h </w:instrText>
             </w:r>
             <w:r>
               <w:rPr>
@@ -2682,7 +2697,7 @@
                 <w:noProof/>
                 <w:webHidden/>
               </w:rPr>
-              <w:t>26</w:t>
+              <w:t>28</w:t>
             </w:r>
             <w:r>
               <w:rPr>
@@ -2699,11 +2714,13 @@
             <w:pStyle w:val="TOC1"/>
             <w:rPr>
               <w:rFonts w:ascii="Times New Roman" w:hAnsi="Times New Roman" w:cs="Times New Roman"/>
+              <w:b w:val="0"/>
+              <w:bCs w:val="0"/>
               <w:kern w:val="2"/>
               <w14:ligatures w14:val="standardContextual"/>
             </w:rPr>
           </w:pPr>
-          <w:hyperlink w:anchor="_Toc234323963" w:history="1">
+          <w:hyperlink w:anchor="_Toc234926758" w:history="1">
             <w:r>
               <w:rPr>
                 <w:rStyle w:val="Hyperlink"/>
@@ -2714,6 +2731,8 @@
             <w:r>
               <w:rPr>
                 <w:rFonts w:ascii="Times New Roman" w:hAnsi="Times New Roman" w:cs="Times New Roman"/>
+                <w:b w:val="0"/>
+                <w:bCs w:val="0"/>
                 <w:kern w:val="2"/>
                 <w14:ligatures w14:val="standardContextual"/>
               </w:rPr>
@@ -2724,7 +2743,7 @@
                 <w:rStyle w:val="Hyperlink"/>
                 <w:rFonts w:ascii="Times New Roman" w:hAnsi="Times New Roman" w:cs="Times New Roman"/>
               </w:rPr>
-              <w:t>Appendix</w:t>
+              <w:t>Appendix A: Glossary of Terms &amp; Acronyms</w:t>
             </w:r>
             <w:r>
               <w:rPr>
@@ -2745,7 +2764,7 @@
                 <w:rFonts w:ascii="Times New Roman" w:hAnsi="Times New Roman" w:cs="Times New Roman"/>
                 <w:webHidden/>
               </w:rPr>
-              <w:instrText xml:space="preserve"> PAGEREF _Toc234323963 \h </w:instrText>
+              <w:instrText xml:space="preserve"> PAGEREF _Toc234926758 \h </w:instrText>
             </w:r>
             <w:r>
               <w:rPr>
@@ -2765,11 +2784,108 @@
                 <w:rFonts w:ascii="Times New Roman" w:hAnsi="Times New Roman" w:cs="Times New Roman"/>
                 <w:webHidden/>
               </w:rPr>
-              <w:t>26</w:t>
-            </w:r>
-            <w:r>
-              <w:rPr>
-                <w:rFonts w:ascii="Times New Roman" w:hAnsi="Times New Roman" w:cs="Times New Roman"/>
+              <w:t>29</w:t>
+            </w:r>
+            <w:r>
+              <w:rPr>
+                <w:rFonts w:ascii="Times New Roman" w:hAnsi="Times New Roman" w:cs="Times New Roman"/>
+                <w:webHidden/>
+              </w:rPr>
+              <w:fldChar w:fldCharType="end"/>
+            </w:r>
+          </w:hyperlink>
+        </w:p>
+        <w:p>
+          <w:pPr>
+            <w:pStyle w:val="TOC2"/>
+            <w:tabs>
+              <w:tab w:val="left" w:pos="960"/>
+              <w:tab w:val="right" w:leader="dot" w:pos="9350"/>
+            </w:tabs>
+            <w:rPr>
+              <w:rFonts w:ascii="Times New Roman" w:hAnsi="Times New Roman" w:cs="Times New Roman"/>
+              <w:noProof/>
+              <w:kern w:val="2"/>
+              <w14:ligatures w14:val="standardContextual"/>
+            </w:rPr>
+          </w:pPr>
+          <w:hyperlink w:anchor="_Toc234926759" w:history="1">
+            <w:r>
+              <w:rPr>
+                <w:rStyle w:val="Hyperlink"/>
+                <w:rFonts w:ascii="Times New Roman" w:hAnsi="Times New Roman" w:cs="Times New Roman"/>
+                <w:noProof/>
+              </w:rPr>
+              <w:t>9.1.</w:t>
+            </w:r>
+            <w:r>
+              <w:rPr>
+                <w:rFonts w:ascii="Times New Roman" w:hAnsi="Times New Roman" w:cs="Times New Roman"/>
+                <w:noProof/>
+                <w:kern w:val="2"/>
+                <w14:ligatures w14:val="standardContextual"/>
+              </w:rPr>
+              <w:tab/>
+            </w:r>
+            <w:r>
+              <w:rPr>
+                <w:rStyle w:val="Hyperlink"/>
+                <w:rFonts w:ascii="Times New Roman" w:hAnsi="Times New Roman" w:cs="Times New Roman"/>
+                <w:noProof/>
+              </w:rPr>
+              <w:t>A.1 Glossary of Terms &amp; Acronyms</w:t>
+            </w:r>
+            <w:r>
+              <w:rPr>
+                <w:rFonts w:ascii="Times New Roman" w:hAnsi="Times New Roman" w:cs="Times New Roman"/>
+                <w:noProof/>
+                <w:webHidden/>
+              </w:rPr>
+              <w:tab/>
+            </w:r>
+            <w:r>
+              <w:rPr>
+                <w:rFonts w:ascii="Times New Roman" w:hAnsi="Times New Roman" w:cs="Times New Roman"/>
+                <w:noProof/>
+                <w:webHidden/>
+              </w:rPr>
+              <w:fldChar w:fldCharType="begin"/>
+            </w:r>
+            <w:r>
+              <w:rPr>
+                <w:rFonts w:ascii="Times New Roman" w:hAnsi="Times New Roman" w:cs="Times New Roman"/>
+                <w:noProof/>
+                <w:webHidden/>
+              </w:rPr>
+              <w:instrText xml:space="preserve"> PAGEREF _Toc234926759 \h </w:instrText>
+            </w:r>
+            <w:r>
+              <w:rPr>
+                <w:rFonts w:ascii="Times New Roman" w:hAnsi="Times New Roman" w:cs="Times New Roman"/>
+                <w:noProof/>
+                <w:webHidden/>
+              </w:rPr>
+            </w:r>
+            <w:r>
+              <w:rPr>
+                <w:rFonts w:ascii="Times New Roman" w:hAnsi="Times New Roman" w:cs="Times New Roman"/>
+                <w:noProof/>
+                <w:webHidden/>
+              </w:rPr>
+              <w:fldChar w:fldCharType="separate"/>
+            </w:r>
+            <w:r>
+              <w:rPr>
+                <w:rFonts w:ascii="Times New Roman" w:hAnsi="Times New Roman" w:cs="Times New Roman"/>
+                <w:noProof/>
+                <w:webHidden/>
+              </w:rPr>
+              <w:t>29</w:t>
+            </w:r>
+            <w:r>
+              <w:rPr>
+                <w:rFonts w:ascii="Times New Roman" w:hAnsi="Times New Roman" w:cs="Times New Roman"/>
+                <w:noProof/>
                 <w:webHidden/>
               </w:rPr>
               <w:fldChar w:fldCharType="end"/>
@@ -4477,13 +4593,13 @@
         <w:pStyle w:val="Heading1"/>
         <w:numPr>
           <w:ilvl w:val="0"/>
-          <w:numId w:val="43"/>
+          <w:numId w:val="10"/>
         </w:numPr>
         <w:rPr>
           <w:rFonts w:cs="Times New Roman"/>
         </w:rPr>
       </w:pPr>
-      <w:bookmarkStart w:id="2" w:name="_Toc234323940"/>
+      <w:bookmarkStart w:id="2" w:name="_Toc234926735"/>
       <w:bookmarkEnd w:id="0"/>
       <w:r>
         <w:rPr>
@@ -4527,7 +4643,7 @@
       <w:pPr>
         <w:numPr>
           <w:ilvl w:val="0"/>
-          <w:numId w:val="2"/>
+          <w:numId w:val="1"/>
         </w:numPr>
         <w:rPr>
           <w:rFonts w:ascii="Times New Roman" w:hAnsi="Times New Roman" w:cs="Times New Roman"/>
@@ -4544,7 +4660,7 @@
       <w:pPr>
         <w:numPr>
           <w:ilvl w:val="0"/>
-          <w:numId w:val="2"/>
+          <w:numId w:val="1"/>
         </w:numPr>
         <w:rPr>
           <w:rFonts w:ascii="Times New Roman" w:hAnsi="Times New Roman" w:cs="Times New Roman"/>
@@ -4561,7 +4677,7 @@
       <w:pPr>
         <w:numPr>
           <w:ilvl w:val="0"/>
-          <w:numId w:val="2"/>
+          <w:numId w:val="1"/>
         </w:numPr>
         <w:rPr>
           <w:rFonts w:ascii="Times New Roman" w:hAnsi="Times New Roman" w:cs="Times New Roman"/>
@@ -4578,7 +4694,7 @@
       <w:pPr>
         <w:numPr>
           <w:ilvl w:val="0"/>
-          <w:numId w:val="2"/>
+          <w:numId w:val="1"/>
         </w:numPr>
         <w:rPr>
           <w:rFonts w:ascii="Times New Roman" w:hAnsi="Times New Roman" w:cs="Times New Roman"/>
@@ -4595,7 +4711,7 @@
       <w:pPr>
         <w:numPr>
           <w:ilvl w:val="0"/>
-          <w:numId w:val="2"/>
+          <w:numId w:val="1"/>
         </w:numPr>
         <w:rPr>
           <w:rFonts w:ascii="Times New Roman" w:hAnsi="Times New Roman" w:cs="Times New Roman"/>
@@ -4612,7 +4728,7 @@
       <w:pPr>
         <w:numPr>
           <w:ilvl w:val="0"/>
-          <w:numId w:val="2"/>
+          <w:numId w:val="1"/>
         </w:numPr>
         <w:rPr>
           <w:rFonts w:ascii="Times New Roman" w:hAnsi="Times New Roman" w:cs="Times New Roman"/>
@@ -4629,7 +4745,7 @@
       <w:pPr>
         <w:numPr>
           <w:ilvl w:val="0"/>
-          <w:numId w:val="2"/>
+          <w:numId w:val="1"/>
         </w:numPr>
         <w:rPr>
           <w:rFonts w:ascii="Times New Roman" w:hAnsi="Times New Roman" w:cs="Times New Roman"/>
@@ -4646,7 +4762,7 @@
       <w:pPr>
         <w:numPr>
           <w:ilvl w:val="0"/>
-          <w:numId w:val="2"/>
+          <w:numId w:val="1"/>
         </w:numPr>
         <w:rPr>
           <w:rFonts w:ascii="Times New Roman" w:hAnsi="Times New Roman" w:cs="Times New Roman"/>
@@ -4663,7 +4779,7 @@
       <w:pPr>
         <w:numPr>
           <w:ilvl w:val="0"/>
-          <w:numId w:val="2"/>
+          <w:numId w:val="1"/>
         </w:numPr>
         <w:rPr>
           <w:rFonts w:ascii="Times New Roman" w:hAnsi="Times New Roman" w:cs="Times New Roman"/>
@@ -4680,7 +4796,7 @@
       <w:pPr>
         <w:numPr>
           <w:ilvl w:val="0"/>
-          <w:numId w:val="2"/>
+          <w:numId w:val="1"/>
         </w:numPr>
         <w:rPr>
           <w:rFonts w:ascii="Times New Roman" w:hAnsi="Times New Roman" w:cs="Times New Roman"/>
@@ -4697,7 +4813,7 @@
       <w:pPr>
         <w:numPr>
           <w:ilvl w:val="0"/>
-          <w:numId w:val="2"/>
+          <w:numId w:val="1"/>
         </w:numPr>
         <w:rPr>
           <w:rFonts w:ascii="Times New Roman" w:hAnsi="Times New Roman" w:cs="Times New Roman"/>
@@ -4714,7 +4830,7 @@
       <w:pPr>
         <w:numPr>
           <w:ilvl w:val="0"/>
-          <w:numId w:val="2"/>
+          <w:numId w:val="1"/>
         </w:numPr>
         <w:rPr>
           <w:rFonts w:ascii="Times New Roman" w:hAnsi="Times New Roman" w:cs="Times New Roman"/>
@@ -4731,7 +4847,7 @@
       <w:pPr>
         <w:numPr>
           <w:ilvl w:val="0"/>
-          <w:numId w:val="2"/>
+          <w:numId w:val="1"/>
         </w:numPr>
         <w:rPr>
           <w:rFonts w:ascii="Times New Roman" w:hAnsi="Times New Roman" w:cs="Times New Roman"/>
@@ -4749,13 +4865,13 @@
         <w:pStyle w:val="Heading2"/>
         <w:numPr>
           <w:ilvl w:val="1"/>
-          <w:numId w:val="44"/>
+          <w:numId w:val="11"/>
         </w:numPr>
         <w:rPr>
           <w:rFonts w:cs="Times New Roman"/>
         </w:rPr>
       </w:pPr>
-      <w:bookmarkStart w:id="3" w:name="_Toc234323941"/>
+      <w:bookmarkStart w:id="3" w:name="_Toc234926736"/>
       <w:r>
         <w:rPr>
           <w:rFonts w:cs="Times New Roman"/>
@@ -4786,13 +4902,13 @@
         <w:pStyle w:val="Heading2"/>
         <w:numPr>
           <w:ilvl w:val="1"/>
-          <w:numId w:val="44"/>
+          <w:numId w:val="11"/>
         </w:numPr>
         <w:rPr>
           <w:rFonts w:cs="Times New Roman"/>
         </w:rPr>
       </w:pPr>
-      <w:bookmarkStart w:id="5" w:name="_Toc234323942"/>
+      <w:bookmarkStart w:id="5" w:name="_Toc234926737"/>
       <w:bookmarkEnd w:id="4"/>
       <w:r>
         <w:rPr>
@@ -4854,13 +4970,13 @@
         <w:pStyle w:val="Heading1"/>
         <w:numPr>
           <w:ilvl w:val="0"/>
-          <w:numId w:val="36"/>
+          <w:numId w:val="9"/>
         </w:numPr>
         <w:rPr>
           <w:rFonts w:cs="Times New Roman"/>
         </w:rPr>
       </w:pPr>
-      <w:bookmarkStart w:id="8" w:name="_Toc234323943"/>
+      <w:bookmarkStart w:id="8" w:name="_Toc234926738"/>
       <w:bookmarkEnd w:id="6"/>
       <w:bookmarkEnd w:id="7"/>
       <w:r>
@@ -4876,13 +4992,13 @@
         <w:pStyle w:val="Heading2"/>
         <w:numPr>
           <w:ilvl w:val="1"/>
-          <w:numId w:val="47"/>
+          <w:numId w:val="13"/>
         </w:numPr>
         <w:rPr>
           <w:rFonts w:cs="Times New Roman"/>
         </w:rPr>
       </w:pPr>
-      <w:bookmarkStart w:id="9" w:name="_Toc234323944"/>
+      <w:bookmarkStart w:id="9" w:name="_Toc234926739"/>
       <w:r>
         <w:rPr>
           <w:rFonts w:cs="Times New Roman"/>
@@ -4929,6 +5045,129 @@
           <w:rFonts w:ascii="Times New Roman" w:hAnsi="Times New Roman" w:cs="Times New Roman"/>
         </w:rPr>
         <w:t>Planned Flutter structure:</w:t>
+      </w:r>
+    </w:p>
+    <w:p>
+      <w:pPr>
+        <w:numPr>
+          <w:ilvl w:val="0"/>
+          <w:numId w:val="2"/>
+        </w:numPr>
+        <w:ind w:left="1080"/>
+        <w:rPr>
+          <w:rFonts w:ascii="Times New Roman" w:hAnsi="Times New Roman" w:cs="Times New Roman"/>
+        </w:rPr>
+      </w:pPr>
+      <w:r>
+        <w:rPr>
+          <w:rFonts w:ascii="Times New Roman" w:hAnsi="Times New Roman" w:cs="Times New Roman"/>
+        </w:rPr>
+        <w:t>‘app‘: application entry widget and screen flow.</w:t>
+      </w:r>
+    </w:p>
+    <w:p>
+      <w:pPr>
+        <w:numPr>
+          <w:ilvl w:val="0"/>
+          <w:numId w:val="2"/>
+        </w:numPr>
+        <w:ind w:left="1080"/>
+        <w:rPr>
+          <w:rFonts w:ascii="Times New Roman" w:hAnsi="Times New Roman" w:cs="Times New Roman"/>
+        </w:rPr>
+      </w:pPr>
+      <w:r>
+        <w:rPr>
+          <w:rFonts w:ascii="Times New Roman" w:hAnsi="Times New Roman" w:cs="Times New Roman"/>
+        </w:rPr>
+        <w:t>‘screens‘: mobile UI screens such as splash, login, signup, household search, worker list, worker detail, booking request, service agreement, payment receipt upload, dispute form, and worker dashboard.</w:t>
+      </w:r>
+    </w:p>
+    <w:p>
+      <w:pPr>
+        <w:numPr>
+          <w:ilvl w:val="0"/>
+          <w:numId w:val="2"/>
+        </w:numPr>
+        <w:ind w:left="1080"/>
+        <w:rPr>
+          <w:rFonts w:ascii="Times New Roman" w:hAnsi="Times New Roman" w:cs="Times New Roman"/>
+        </w:rPr>
+      </w:pPr>
+      <w:r>
+        <w:rPr>
+          <w:rFonts w:ascii="Times New Roman" w:hAnsi="Times New Roman" w:cs="Times New Roman"/>
+        </w:rPr>
+        <w:t>‘widgets‘: reusable UI components such as cards, buttons, avatars, chips, and scaffold layout.</w:t>
+      </w:r>
+    </w:p>
+    <w:p>
+      <w:pPr>
+        <w:numPr>
+          <w:ilvl w:val="0"/>
+          <w:numId w:val="2"/>
+        </w:numPr>
+        <w:ind w:left="1080"/>
+        <w:rPr>
+          <w:rFonts w:ascii="Times New Roman" w:hAnsi="Times New Roman" w:cs="Times New Roman"/>
+        </w:rPr>
+      </w:pPr>
+      <w:r>
+        <w:rPr>
+          <w:rFonts w:ascii="Times New Roman" w:hAnsi="Times New Roman" w:cs="Times New Roman"/>
+        </w:rPr>
+        <w:t>‘theme‘: shared colors, typography, input styling, and app theme.</w:t>
+      </w:r>
+    </w:p>
+    <w:p>
+      <w:pPr>
+        <w:numPr>
+          <w:ilvl w:val="0"/>
+          <w:numId w:val="2"/>
+        </w:numPr>
+        <w:ind w:left="1080"/>
+        <w:rPr>
+          <w:rFonts w:ascii="Times New Roman" w:hAnsi="Times New Roman" w:cs="Times New Roman"/>
+        </w:rPr>
+      </w:pPr>
+      <w:r>
+        <w:rPr>
+          <w:rFonts w:ascii="Times New Roman" w:hAnsi="Times New Roman" w:cs="Times New Roman"/>
+        </w:rPr>
+        <w:t>‘models‘: data objects such as worker profile.</w:t>
+      </w:r>
+    </w:p>
+    <w:p>
+      <w:pPr>
+        <w:numPr>
+          <w:ilvl w:val="0"/>
+          <w:numId w:val="2"/>
+        </w:numPr>
+        <w:ind w:left="1080"/>
+        <w:rPr>
+          <w:rFonts w:ascii="Times New Roman" w:hAnsi="Times New Roman" w:cs="Times New Roman"/>
+        </w:rPr>
+      </w:pPr>
+      <w:r>
+        <w:rPr>
+          <w:rFonts w:ascii="Times New Roman" w:hAnsi="Times New Roman" w:cs="Times New Roman"/>
+        </w:rPr>
+        <w:t>‘data‘: temporary sample data used before backend integration.</w:t>
+      </w:r>
+    </w:p>
+    <w:p>
+      <w:pPr>
+        <w:pStyle w:val="FirstParagraph"/>
+        <w:ind w:left="360"/>
+        <w:rPr>
+          <w:rFonts w:ascii="Times New Roman" w:hAnsi="Times New Roman" w:cs="Times New Roman"/>
+        </w:rPr>
+      </w:pPr>
+      <w:r>
+        <w:rPr>
+          <w:rFonts w:ascii="Times New Roman" w:hAnsi="Times New Roman" w:cs="Times New Roman"/>
+        </w:rPr>
+        <w:t>Planned backend/service structure:</w:t>
       </w:r>
     </w:p>
     <w:p>
@@ -4946,7 +5185,7 @@
         <w:rPr>
           <w:rFonts w:ascii="Times New Roman" w:hAnsi="Times New Roman" w:cs="Times New Roman"/>
         </w:rPr>
-        <w:t>‘app‘: application entry widget and screen flow.</w:t>
+        <w:t>Authentication service.</w:t>
       </w:r>
     </w:p>
     <w:p>
@@ -4964,7 +5203,7 @@
         <w:rPr>
           <w:rFonts w:ascii="Times New Roman" w:hAnsi="Times New Roman" w:cs="Times New Roman"/>
         </w:rPr>
-        <w:t>‘screens‘: mobile UI screens such as splash, login, signup, household search, worker list, worker detail, booking request, service agreement, payment receipt upload, dispute form, and worker dashboard.</w:t>
+        <w:t>User/profile service.</w:t>
       </w:r>
     </w:p>
     <w:p>
@@ -4982,7 +5221,7 @@
         <w:rPr>
           <w:rFonts w:ascii="Times New Roman" w:hAnsi="Times New Roman" w:cs="Times New Roman"/>
         </w:rPr>
-        <w:t>‘widgets‘: reusable UI components such as cards, buttons, avatars, chips, and scaffold layout.</w:t>
+        <w:t>Worker search service.</w:t>
       </w:r>
     </w:p>
     <w:p>
@@ -5000,7 +5239,7 @@
         <w:rPr>
           <w:rFonts w:ascii="Times New Roman" w:hAnsi="Times New Roman" w:cs="Times New Roman"/>
         </w:rPr>
-        <w:t>‘theme‘: shared colors, typography, input styling, and app theme.</w:t>
+        <w:t>Booking service.</w:t>
       </w:r>
     </w:p>
     <w:p>
@@ -5018,7 +5257,7 @@
         <w:rPr>
           <w:rFonts w:ascii="Times New Roman" w:hAnsi="Times New Roman" w:cs="Times New Roman"/>
         </w:rPr>
-        <w:t>‘models‘: data objects such as worker profile.</w:t>
+        <w:t>Service agreement service.</w:t>
       </w:r>
     </w:p>
     <w:p>
@@ -5036,22 +5275,149 @@
         <w:rPr>
           <w:rFonts w:ascii="Times New Roman" w:hAnsi="Times New Roman" w:cs="Times New Roman"/>
         </w:rPr>
-        <w:t>‘data‘: temporary sample data used before backend integration.</w:t>
+        <w:t>Payment tracking service.</w:t>
       </w:r>
     </w:p>
     <w:p>
       <w:pPr>
+        <w:numPr>
+          <w:ilvl w:val="0"/>
+          <w:numId w:val="3"/>
+        </w:numPr>
+        <w:ind w:left="1080"/>
+        <w:rPr>
+          <w:rFonts w:ascii="Times New Roman" w:hAnsi="Times New Roman" w:cs="Times New Roman"/>
+        </w:rPr>
+      </w:pPr>
+      <w:r>
+        <w:rPr>
+          <w:rFonts w:ascii="Times New Roman" w:hAnsi="Times New Roman" w:cs="Times New Roman"/>
+        </w:rPr>
+        <w:t>Dispute resolution service.</w:t>
+      </w:r>
+    </w:p>
+    <w:p>
+      <w:pPr>
+        <w:numPr>
+          <w:ilvl w:val="0"/>
+          <w:numId w:val="3"/>
+        </w:numPr>
+        <w:ind w:left="1080"/>
+        <w:rPr>
+          <w:rFonts w:ascii="Times New Roman" w:hAnsi="Times New Roman" w:cs="Times New Roman"/>
+        </w:rPr>
+      </w:pPr>
+      <w:r>
+        <w:rPr>
+          <w:rFonts w:ascii="Times New Roman" w:hAnsi="Times New Roman" w:cs="Times New Roman"/>
+        </w:rPr>
+        <w:t>Review service.</w:t>
+      </w:r>
+    </w:p>
+    <w:p>
+      <w:pPr>
+        <w:numPr>
+          <w:ilvl w:val="0"/>
+          <w:numId w:val="3"/>
+        </w:numPr>
+        <w:ind w:left="1080"/>
+        <w:rPr>
+          <w:rFonts w:ascii="Times New Roman" w:hAnsi="Times New Roman" w:cs="Times New Roman"/>
+        </w:rPr>
+      </w:pPr>
+      <w:r>
+        <w:rPr>
+          <w:rFonts w:ascii="Times New Roman" w:hAnsi="Times New Roman" w:cs="Times New Roman"/>
+        </w:rPr>
+        <w:t>Notification service.</w:t>
+      </w:r>
+    </w:p>
+    <w:p>
+      <w:pPr>
+        <w:numPr>
+          <w:ilvl w:val="0"/>
+          <w:numId w:val="3"/>
+        </w:numPr>
+        <w:ind w:left="1080"/>
+        <w:rPr>
+          <w:rFonts w:ascii="Times New Roman" w:hAnsi="Times New Roman" w:cs="Times New Roman"/>
+        </w:rPr>
+      </w:pPr>
+      <w:r>
+        <w:rPr>
+          <w:rFonts w:ascii="Times New Roman" w:hAnsi="Times New Roman" w:cs="Times New Roman"/>
+        </w:rPr>
+        <w:t>Admin dashboard service.</w:t>
+      </w:r>
+    </w:p>
+    <w:p>
+      <w:pPr>
         <w:pStyle w:val="FirstParagraph"/>
         <w:ind w:left="360"/>
-        <w:rPr>
-          <w:rFonts w:ascii="Times New Roman" w:hAnsi="Times New Roman" w:cs="Times New Roman"/>
-        </w:rPr>
-      </w:pPr>
-      <w:r>
-        <w:rPr>
-          <w:rFonts w:ascii="Times New Roman" w:hAnsi="Times New Roman" w:cs="Times New Roman"/>
-        </w:rPr>
-        <w:t>Planned backend/service structure:</w:t>
+        <w:jc w:val="both"/>
+        <w:rPr>
+          <w:rFonts w:ascii="Times New Roman" w:hAnsi="Times New Roman" w:cs="Times New Roman"/>
+        </w:rPr>
+      </w:pPr>
+      <w:r>
+        <w:rPr>
+          <w:rFonts w:ascii="Times New Roman" w:hAnsi="Times New Roman" w:cs="Times New Roman"/>
+        </w:rPr>
+        <w:lastRenderedPageBreak/>
+        <w:t>This structure keeps each responsibility separate and makes the project easier to extend from mockup UI to a working Supabase-backed system.</w:t>
+      </w:r>
+    </w:p>
+    <w:p>
+      <w:pPr>
+        <w:pStyle w:val="Heading2"/>
+        <w:numPr>
+          <w:ilvl w:val="1"/>
+          <w:numId w:val="13"/>
+        </w:numPr>
+        <w:rPr>
+          <w:rFonts w:cs="Times New Roman"/>
+        </w:rPr>
+      </w:pPr>
+      <w:bookmarkStart w:id="11" w:name="_Toc234926740"/>
+      <w:bookmarkEnd w:id="10"/>
+      <w:r>
+        <w:rPr>
+          <w:rFonts w:cs="Times New Roman"/>
+        </w:rPr>
+        <w:t>Software Process Model</w:t>
+      </w:r>
+      <w:bookmarkStart w:id="12" w:name="X2309b6e3c5a4093bedf8e9c3dae2057b6fb6671"/>
+      <w:bookmarkStart w:id="13" w:name="software-process-model"/>
+      <w:bookmarkEnd w:id="11"/>
+    </w:p>
+    <w:p>
+      <w:pPr>
+        <w:pStyle w:val="FirstParagraph"/>
+        <w:ind w:left="360"/>
+        <w:rPr>
+          <w:rFonts w:ascii="Times New Roman" w:hAnsi="Times New Roman" w:cs="Times New Roman"/>
+        </w:rPr>
+      </w:pPr>
+      <w:r>
+        <w:rPr>
+          <w:rFonts w:ascii="Times New Roman" w:hAnsi="Times New Roman" w:cs="Times New Roman"/>
+        </w:rPr>
+        <w:t>The project follows Agile Software Development Methodology.</w:t>
+      </w:r>
+    </w:p>
+    <w:p>
+      <w:pPr>
+        <w:pStyle w:val="BodyText"/>
+        <w:ind w:left="360"/>
+        <w:rPr>
+          <w:rFonts w:ascii="Times New Roman" w:hAnsi="Times New Roman" w:cs="Times New Roman"/>
+        </w:rPr>
+      </w:pPr>
+      <w:r>
+        <w:rPr>
+          <w:rFonts w:ascii="Times New Roman" w:hAnsi="Times New Roman" w:cs="Times New Roman"/>
+        </w:rPr>
+        <w:t>Justification:</w:t>
       </w:r>
     </w:p>
     <w:p>
@@ -5069,7 +5435,7 @@
         <w:rPr>
           <w:rFonts w:ascii="Times New Roman" w:hAnsi="Times New Roman" w:cs="Times New Roman"/>
         </w:rPr>
-        <w:t>Authentication service.</w:t>
+        <w:t>The project can be built in iterations: UI mockups, authentication, profiles, search, bookings, service agreements, manual payment tracking, disputes, reviews, notifications, and admin dashboard.</w:t>
       </w:r>
     </w:p>
     <w:p>
@@ -5087,7 +5453,7 @@
         <w:rPr>
           <w:rFonts w:ascii="Times New Roman" w:hAnsi="Times New Roman" w:cs="Times New Roman"/>
         </w:rPr>
-        <w:t>User/profile service.</w:t>
+        <w:t>Supervisor and user feedback can be incorporated after each phase.</w:t>
       </w:r>
     </w:p>
     <w:p>
@@ -5105,203 +5471,51 @@
         <w:rPr>
           <w:rFonts w:ascii="Times New Roman" w:hAnsi="Times New Roman" w:cs="Times New Roman"/>
         </w:rPr>
-        <w:t>Worker search service.</w:t>
+        <w:t>Each module can be tested independently before full integration.</w:t>
       </w:r>
     </w:p>
     <w:p>
       <w:pPr>
+        <w:pStyle w:val="Heading1"/>
         <w:numPr>
           <w:ilvl w:val="0"/>
-          <w:numId w:val="4"/>
+          <w:numId w:val="12"/>
         </w:numPr>
-        <w:ind w:left="1080"/>
-        <w:rPr>
-          <w:rFonts w:ascii="Times New Roman" w:hAnsi="Times New Roman" w:cs="Times New Roman"/>
-        </w:rPr>
-      </w:pPr>
-      <w:r>
-        <w:rPr>
-          <w:rFonts w:ascii="Times New Roman" w:hAnsi="Times New Roman" w:cs="Times New Roman"/>
-        </w:rPr>
-        <w:t>Booking service.</w:t>
-      </w:r>
+        <w:rPr>
+          <w:rFonts w:cs="Times New Roman"/>
+        </w:rPr>
+      </w:pPr>
+      <w:bookmarkStart w:id="14" w:name="_Toc234926741"/>
+      <w:bookmarkEnd w:id="12"/>
+      <w:bookmarkEnd w:id="13"/>
+      <w:r>
+        <w:rPr>
+          <w:rFonts w:cs="Times New Roman"/>
+        </w:rPr>
+        <w:t>System Overview</w:t>
+      </w:r>
+      <w:bookmarkEnd w:id="14"/>
     </w:p>
     <w:p>
       <w:pPr>
-        <w:numPr>
-          <w:ilvl w:val="0"/>
-          <w:numId w:val="4"/>
-        </w:numPr>
-        <w:ind w:left="1080"/>
-        <w:rPr>
-          <w:rFonts w:ascii="Times New Roman" w:hAnsi="Times New Roman" w:cs="Times New Roman"/>
-        </w:rPr>
-      </w:pPr>
-      <w:r>
-        <w:rPr>
-          <w:rFonts w:ascii="Times New Roman" w:hAnsi="Times New Roman" w:cs="Times New Roman"/>
-        </w:rPr>
-        <w:t>Service agreement service.</w:t>
-      </w:r>
-    </w:p>
-    <w:p>
-      <w:pPr>
-        <w:numPr>
-          <w:ilvl w:val="0"/>
-          <w:numId w:val="4"/>
-        </w:numPr>
-        <w:ind w:left="1080"/>
-        <w:rPr>
-          <w:rFonts w:ascii="Times New Roman" w:hAnsi="Times New Roman" w:cs="Times New Roman"/>
-        </w:rPr>
-      </w:pPr>
-      <w:r>
-        <w:rPr>
-          <w:rFonts w:ascii="Times New Roman" w:hAnsi="Times New Roman" w:cs="Times New Roman"/>
-        </w:rPr>
-        <w:t>Payment tracking service.</w:t>
-      </w:r>
-    </w:p>
-    <w:p>
-      <w:pPr>
-        <w:numPr>
-          <w:ilvl w:val="0"/>
-          <w:numId w:val="4"/>
-        </w:numPr>
-        <w:ind w:left="1080"/>
-        <w:rPr>
-          <w:rFonts w:ascii="Times New Roman" w:hAnsi="Times New Roman" w:cs="Times New Roman"/>
-        </w:rPr>
-      </w:pPr>
-      <w:r>
-        <w:rPr>
-          <w:rFonts w:ascii="Times New Roman" w:hAnsi="Times New Roman" w:cs="Times New Roman"/>
-        </w:rPr>
-        <w:t>Dispute resolution service.</w:t>
-      </w:r>
-    </w:p>
-    <w:p>
-      <w:pPr>
-        <w:numPr>
-          <w:ilvl w:val="0"/>
-          <w:numId w:val="4"/>
-        </w:numPr>
-        <w:ind w:left="1080"/>
-        <w:rPr>
-          <w:rFonts w:ascii="Times New Roman" w:hAnsi="Times New Roman" w:cs="Times New Roman"/>
-        </w:rPr>
-      </w:pPr>
-      <w:r>
-        <w:rPr>
-          <w:rFonts w:ascii="Times New Roman" w:hAnsi="Times New Roman" w:cs="Times New Roman"/>
-        </w:rPr>
-        <w:t>Review service.</w:t>
-      </w:r>
-    </w:p>
-    <w:p>
-      <w:pPr>
-        <w:numPr>
-          <w:ilvl w:val="0"/>
-          <w:numId w:val="4"/>
-        </w:numPr>
-        <w:ind w:left="1080"/>
-        <w:rPr>
-          <w:rFonts w:ascii="Times New Roman" w:hAnsi="Times New Roman" w:cs="Times New Roman"/>
-        </w:rPr>
-      </w:pPr>
-      <w:r>
-        <w:rPr>
-          <w:rFonts w:ascii="Times New Roman" w:hAnsi="Times New Roman" w:cs="Times New Roman"/>
-        </w:rPr>
-        <w:t>Notification service.</w:t>
-      </w:r>
-    </w:p>
-    <w:p>
-      <w:pPr>
-        <w:numPr>
-          <w:ilvl w:val="0"/>
-          <w:numId w:val="4"/>
-        </w:numPr>
-        <w:ind w:left="1080"/>
-        <w:rPr>
-          <w:rFonts w:ascii="Times New Roman" w:hAnsi="Times New Roman" w:cs="Times New Roman"/>
-        </w:rPr>
-      </w:pPr>
-      <w:r>
-        <w:rPr>
-          <w:rFonts w:ascii="Times New Roman" w:hAnsi="Times New Roman" w:cs="Times New Roman"/>
-        </w:rPr>
-        <w:t>Admin dashboard service.</w:t>
-      </w:r>
-    </w:p>
-    <w:p>
-      <w:pPr>
         <w:pStyle w:val="FirstParagraph"/>
-        <w:ind w:left="360"/>
-        <w:jc w:val="both"/>
-        <w:rPr>
-          <w:rFonts w:ascii="Times New Roman" w:hAnsi="Times New Roman" w:cs="Times New Roman"/>
-        </w:rPr>
-      </w:pPr>
-      <w:r>
-        <w:rPr>
-          <w:rFonts w:ascii="Times New Roman" w:hAnsi="Times New Roman" w:cs="Times New Roman"/>
-        </w:rPr>
-        <w:lastRenderedPageBreak/>
-        <w:t>This structure keeps each responsibility separate and makes the project easier to extend from mockup UI to a working Supabase-backed system.</w:t>
-      </w:r>
-    </w:p>
-    <w:p>
-      <w:pPr>
-        <w:pStyle w:val="Heading2"/>
-        <w:numPr>
-          <w:ilvl w:val="1"/>
-          <w:numId w:val="47"/>
-        </w:numPr>
-        <w:rPr>
-          <w:rFonts w:cs="Times New Roman"/>
-        </w:rPr>
-      </w:pPr>
-      <w:bookmarkStart w:id="11" w:name="_Toc234323945"/>
-      <w:bookmarkEnd w:id="10"/>
-      <w:r>
-        <w:rPr>
-          <w:rFonts w:cs="Times New Roman"/>
-        </w:rPr>
-        <w:t>Software Process Model</w:t>
-      </w:r>
-      <w:bookmarkStart w:id="12" w:name="X2309b6e3c5a4093bedf8e9c3dae2057b6fb6671"/>
-      <w:bookmarkStart w:id="13" w:name="software-process-model"/>
-      <w:bookmarkEnd w:id="11"/>
-    </w:p>
-    <w:p>
-      <w:pPr>
-        <w:pStyle w:val="FirstParagraph"/>
-        <w:ind w:left="360"/>
-        <w:rPr>
-          <w:rFonts w:ascii="Times New Roman" w:hAnsi="Times New Roman" w:cs="Times New Roman"/>
-        </w:rPr>
-      </w:pPr>
-      <w:r>
-        <w:rPr>
-          <w:rFonts w:ascii="Times New Roman" w:hAnsi="Times New Roman" w:cs="Times New Roman"/>
-        </w:rPr>
-        <w:t>The project follows Agile Software Development Methodology.</w:t>
-      </w:r>
-    </w:p>
-    <w:p>
-      <w:pPr>
-        <w:pStyle w:val="BodyText"/>
-        <w:ind w:left="360"/>
-        <w:rPr>
-          <w:rFonts w:ascii="Times New Roman" w:hAnsi="Times New Roman" w:cs="Times New Roman"/>
-        </w:rPr>
-      </w:pPr>
-      <w:r>
-        <w:rPr>
-          <w:rFonts w:ascii="Times New Roman" w:hAnsi="Times New Roman" w:cs="Times New Roman"/>
-        </w:rPr>
-        <w:t>Justification:</w:t>
+        <w:rPr>
+          <w:rFonts w:ascii="Times New Roman" w:hAnsi="Times New Roman" w:cs="Times New Roman"/>
+        </w:rPr>
+      </w:pPr>
+      <w:proofErr w:type="spellStart"/>
+      <w:r>
+        <w:rPr>
+          <w:rFonts w:ascii="Times New Roman" w:hAnsi="Times New Roman" w:cs="Times New Roman"/>
+        </w:rPr>
+        <w:t>HomeEase</w:t>
+      </w:r>
+      <w:proofErr w:type="spellEnd"/>
+      <w:r>
+        <w:rPr>
+          <w:rFonts w:ascii="Times New Roman" w:hAnsi="Times New Roman" w:cs="Times New Roman"/>
+        </w:rPr>
+        <w:t xml:space="preserve"> is a client-cloud system with two frontends:</w:t>
       </w:r>
     </w:p>
     <w:p>
@@ -5310,16 +5524,15 @@
           <w:ilvl w:val="0"/>
           <w:numId w:val="5"/>
         </w:numPr>
-        <w:ind w:left="1080"/>
-        <w:rPr>
-          <w:rFonts w:ascii="Times New Roman" w:hAnsi="Times New Roman" w:cs="Times New Roman"/>
-        </w:rPr>
-      </w:pPr>
-      <w:r>
-        <w:rPr>
-          <w:rFonts w:ascii="Times New Roman" w:hAnsi="Times New Roman" w:cs="Times New Roman"/>
-        </w:rPr>
-        <w:t>The project can be built in iterations: UI mockups, authentication, profiles, search, bookings, service agreements, manual payment tracking, disputes, reviews, notifications, and admin dashboard.</w:t>
+        <w:rPr>
+          <w:rFonts w:ascii="Times New Roman" w:hAnsi="Times New Roman" w:cs="Times New Roman"/>
+        </w:rPr>
+      </w:pPr>
+      <w:r>
+        <w:rPr>
+          <w:rFonts w:ascii="Times New Roman" w:hAnsi="Times New Roman" w:cs="Times New Roman"/>
+        </w:rPr>
+        <w:t>Flutter mobile app for household and worker users.</w:t>
       </w:r>
     </w:p>
     <w:p>
@@ -5328,78 +5541,70 @@
           <w:ilvl w:val="0"/>
           <w:numId w:val="5"/>
         </w:numPr>
-        <w:ind w:left="1080"/>
-        <w:rPr>
-          <w:rFonts w:ascii="Times New Roman" w:hAnsi="Times New Roman" w:cs="Times New Roman"/>
-        </w:rPr>
-      </w:pPr>
-      <w:r>
-        <w:rPr>
-          <w:rFonts w:ascii="Times New Roman" w:hAnsi="Times New Roman" w:cs="Times New Roman"/>
-        </w:rPr>
-        <w:t>Supervisor and user feedback can be incorporated after each phase.</w:t>
+        <w:rPr>
+          <w:rFonts w:ascii="Times New Roman" w:hAnsi="Times New Roman" w:cs="Times New Roman"/>
+        </w:rPr>
+      </w:pPr>
+      <w:r>
+        <w:rPr>
+          <w:rFonts w:ascii="Times New Roman" w:hAnsi="Times New Roman" w:cs="Times New Roman"/>
+        </w:rPr>
+        <w:t>React/Vite web dashboard for admin users.</w:t>
       </w:r>
     </w:p>
     <w:p>
       <w:pPr>
-        <w:numPr>
-          <w:ilvl w:val="0"/>
-          <w:numId w:val="5"/>
-        </w:numPr>
-        <w:ind w:left="1080"/>
-        <w:rPr>
-          <w:rFonts w:ascii="Times New Roman" w:hAnsi="Times New Roman" w:cs="Times New Roman"/>
-        </w:rPr>
-      </w:pPr>
-      <w:r>
-        <w:rPr>
-          <w:rFonts w:ascii="Times New Roman" w:hAnsi="Times New Roman" w:cs="Times New Roman"/>
-        </w:rPr>
-        <w:t>Each module can be tested independently before full integration.</w:t>
+        <w:pStyle w:val="FirstParagraph"/>
+        <w:jc w:val="both"/>
+        <w:rPr>
+          <w:rFonts w:ascii="Times New Roman" w:hAnsi="Times New Roman" w:cs="Times New Roman"/>
+        </w:rPr>
+      </w:pPr>
+      <w:r>
+        <w:rPr>
+          <w:rFonts w:ascii="Times New Roman" w:hAnsi="Times New Roman" w:cs="Times New Roman"/>
+        </w:rPr>
+        <w:t>Supabase/PostgreSQL will act as the shared backend for authentication, data storage, and role-based access. Supabase Storage or an equivalent storage bucket will store payment receipt images and optional dispute evidence. The first version will use city/area and service-category filtering for local worker matching. Live GPS, direct online payment gateway processing, payroll, full chat, and advanced analytics are outside the scope.</w:t>
       </w:r>
     </w:p>
     <w:p>
       <w:pPr>
-        <w:pStyle w:val="Heading1"/>
+        <w:pStyle w:val="Heading2"/>
         <w:numPr>
-          <w:ilvl w:val="0"/>
-          <w:numId w:val="46"/>
+          <w:ilvl w:val="1"/>
+          <w:numId w:val="12"/>
         </w:numPr>
         <w:rPr>
           <w:rFonts w:cs="Times New Roman"/>
         </w:rPr>
       </w:pPr>
-      <w:bookmarkStart w:id="14" w:name="_Toc234323946"/>
-      <w:bookmarkEnd w:id="12"/>
-      <w:bookmarkEnd w:id="13"/>
+      <w:bookmarkStart w:id="15" w:name="_Toc234926742"/>
       <w:r>
         <w:rPr>
           <w:rFonts w:cs="Times New Roman"/>
         </w:rPr>
-        <w:t>System Overview</w:t>
-      </w:r>
-      <w:bookmarkEnd w:id="14"/>
+        <w:t>High-Level Functionality</w:t>
+      </w:r>
+      <w:bookmarkStart w:id="16" w:name="high-level-functionality"/>
+      <w:bookmarkEnd w:id="15"/>
     </w:p>
     <w:p>
       <w:pPr>
         <w:pStyle w:val="FirstParagraph"/>
-        <w:rPr>
-          <w:rFonts w:ascii="Times New Roman" w:hAnsi="Times New Roman" w:cs="Times New Roman"/>
-        </w:rPr>
-      </w:pPr>
-      <w:proofErr w:type="spellStart"/>
-      <w:r>
-        <w:rPr>
-          <w:rFonts w:ascii="Times New Roman" w:hAnsi="Times New Roman" w:cs="Times New Roman"/>
-        </w:rPr>
-        <w:t>HomeEase</w:t>
-      </w:r>
-      <w:proofErr w:type="spellEnd"/>
-      <w:r>
-        <w:rPr>
-          <w:rFonts w:ascii="Times New Roman" w:hAnsi="Times New Roman" w:cs="Times New Roman"/>
-        </w:rPr>
-        <w:t xml:space="preserve"> is a client-cloud system with two frontends:</w:t>
+        <w:ind w:left="360"/>
+        <w:rPr>
+          <w:rFonts w:ascii="Times New Roman" w:hAnsi="Times New Roman" w:cs="Times New Roman"/>
+          <w:b/>
+          <w:bCs/>
+        </w:rPr>
+      </w:pPr>
+      <w:r>
+        <w:rPr>
+          <w:rFonts w:ascii="Times New Roman" w:hAnsi="Times New Roman" w:cs="Times New Roman"/>
+          <w:b/>
+          <w:bCs/>
+        </w:rPr>
+        <w:t>Household users can:</w:t>
       </w:r>
     </w:p>
     <w:p>
@@ -5408,15 +5613,16 @@
           <w:ilvl w:val="0"/>
           <w:numId w:val="6"/>
         </w:numPr>
-        <w:rPr>
-          <w:rFonts w:ascii="Times New Roman" w:hAnsi="Times New Roman" w:cs="Times New Roman"/>
-        </w:rPr>
-      </w:pPr>
-      <w:r>
-        <w:rPr>
-          <w:rFonts w:ascii="Times New Roman" w:hAnsi="Times New Roman" w:cs="Times New Roman"/>
-        </w:rPr>
-        <w:t>Flutter mobile app for household and worker users.</w:t>
+        <w:ind w:left="1080"/>
+        <w:rPr>
+          <w:rFonts w:ascii="Times New Roman" w:hAnsi="Times New Roman" w:cs="Times New Roman"/>
+        </w:rPr>
+      </w:pPr>
+      <w:r>
+        <w:rPr>
+          <w:rFonts w:ascii="Times New Roman" w:hAnsi="Times New Roman" w:cs="Times New Roman"/>
+        </w:rPr>
+        <w:t>Register and log in.</w:t>
       </w:r>
     </w:p>
     <w:p>
@@ -5425,55 +5631,183 @@
           <w:ilvl w:val="0"/>
           <w:numId w:val="6"/>
         </w:numPr>
-        <w:rPr>
-          <w:rFonts w:ascii="Times New Roman" w:hAnsi="Times New Roman" w:cs="Times New Roman"/>
-        </w:rPr>
-      </w:pPr>
-      <w:r>
-        <w:rPr>
-          <w:rFonts w:ascii="Times New Roman" w:hAnsi="Times New Roman" w:cs="Times New Roman"/>
-        </w:rPr>
-        <w:t>React/Vite web dashboard for admin users.</w:t>
+        <w:ind w:left="1080"/>
+        <w:rPr>
+          <w:rFonts w:ascii="Times New Roman" w:hAnsi="Times New Roman" w:cs="Times New Roman"/>
+        </w:rPr>
+      </w:pPr>
+      <w:r>
+        <w:rPr>
+          <w:rFonts w:ascii="Times New Roman" w:hAnsi="Times New Roman" w:cs="Times New Roman"/>
+        </w:rPr>
+        <w:t>Select household role on the login screen.</w:t>
       </w:r>
     </w:p>
     <w:p>
       <w:pPr>
-        <w:pStyle w:val="FirstParagraph"/>
-        <w:jc w:val="both"/>
-        <w:rPr>
-          <w:rFonts w:ascii="Times New Roman" w:hAnsi="Times New Roman" w:cs="Times New Roman"/>
-        </w:rPr>
-      </w:pPr>
-      <w:r>
-        <w:rPr>
-          <w:rFonts w:ascii="Times New Roman" w:hAnsi="Times New Roman" w:cs="Times New Roman"/>
-        </w:rPr>
-        <w:t>Supabase/PostgreSQL will act as the shared backend for authentication, data storage, and role-based access. Supabase Storage or an equivalent storage bucket will store payment receipt images and optional dispute evidence. The first version will use city/area and service-category filtering for local worker matching. Live GPS, direct online payment gateway processing, payroll, full chat, and advanced analytics are outside the scope.</w:t>
+        <w:numPr>
+          <w:ilvl w:val="0"/>
+          <w:numId w:val="6"/>
+        </w:numPr>
+        <w:ind w:left="1080"/>
+        <w:rPr>
+          <w:rFonts w:ascii="Times New Roman" w:hAnsi="Times New Roman" w:cs="Times New Roman"/>
+        </w:rPr>
+      </w:pPr>
+      <w:r>
+        <w:rPr>
+          <w:rFonts w:ascii="Times New Roman" w:hAnsi="Times New Roman" w:cs="Times New Roman"/>
+        </w:rPr>
+        <w:t>Search workers by service category and city/area.</w:t>
       </w:r>
     </w:p>
     <w:p>
       <w:pPr>
-        <w:pStyle w:val="Heading2"/>
         <w:numPr>
-          <w:ilvl w:val="1"/>
-          <w:numId w:val="46"/>
+          <w:ilvl w:val="0"/>
+          <w:numId w:val="6"/>
         </w:numPr>
-        <w:rPr>
-          <w:rFonts w:cs="Times New Roman"/>
-        </w:rPr>
-      </w:pPr>
-      <w:bookmarkStart w:id="15" w:name="_Toc234323947"/>
-      <w:r>
-        <w:rPr>
-          <w:rFonts w:cs="Times New Roman"/>
-        </w:rPr>
-        <w:t>High-Level Functionality</w:t>
-      </w:r>
-      <w:bookmarkStart w:id="16" w:name="high-level-functionality"/>
-      <w:bookmarkEnd w:id="15"/>
+        <w:ind w:left="1080"/>
+        <w:rPr>
+          <w:rFonts w:ascii="Times New Roman" w:hAnsi="Times New Roman" w:cs="Times New Roman"/>
+        </w:rPr>
+      </w:pPr>
+      <w:r>
+        <w:rPr>
+          <w:rFonts w:ascii="Times New Roman" w:hAnsi="Times New Roman" w:cs="Times New Roman"/>
+        </w:rPr>
+        <w:t>View worker list and worker detail screens.</w:t>
+      </w:r>
     </w:p>
     <w:p>
       <w:pPr>
+        <w:numPr>
+          <w:ilvl w:val="0"/>
+          <w:numId w:val="6"/>
+        </w:numPr>
+        <w:ind w:left="1080"/>
+        <w:rPr>
+          <w:rFonts w:ascii="Times New Roman" w:hAnsi="Times New Roman" w:cs="Times New Roman"/>
+        </w:rPr>
+      </w:pPr>
+      <w:r>
+        <w:rPr>
+          <w:rFonts w:ascii="Times New Roman" w:hAnsi="Times New Roman" w:cs="Times New Roman"/>
+        </w:rPr>
+        <w:t>Send booking requests.</w:t>
+      </w:r>
+    </w:p>
+    <w:p>
+      <w:pPr>
+        <w:numPr>
+          <w:ilvl w:val="0"/>
+          <w:numId w:val="6"/>
+        </w:numPr>
+        <w:ind w:left="1080"/>
+        <w:rPr>
+          <w:rFonts w:ascii="Times New Roman" w:hAnsi="Times New Roman" w:cs="Times New Roman"/>
+        </w:rPr>
+      </w:pPr>
+      <w:r>
+        <w:rPr>
+          <w:rFonts w:ascii="Times New Roman" w:hAnsi="Times New Roman" w:cs="Times New Roman"/>
+        </w:rPr>
+        <w:t>Track booking status.</w:t>
+      </w:r>
+    </w:p>
+    <w:p>
+      <w:pPr>
+        <w:numPr>
+          <w:ilvl w:val="0"/>
+          <w:numId w:val="6"/>
+        </w:numPr>
+        <w:ind w:left="1080"/>
+        <w:rPr>
+          <w:rFonts w:ascii="Times New Roman" w:hAnsi="Times New Roman" w:cs="Times New Roman"/>
+        </w:rPr>
+      </w:pPr>
+      <w:r>
+        <w:rPr>
+          <w:rFonts w:ascii="Times New Roman" w:hAnsi="Times New Roman" w:cs="Times New Roman"/>
+        </w:rPr>
+        <w:t>View the generated service agreement after worker acceptance.</w:t>
+      </w:r>
+    </w:p>
+    <w:p>
+      <w:pPr>
+        <w:numPr>
+          <w:ilvl w:val="0"/>
+          <w:numId w:val="6"/>
+        </w:numPr>
+        <w:ind w:left="1080"/>
+        <w:rPr>
+          <w:rFonts w:ascii="Times New Roman" w:hAnsi="Times New Roman" w:cs="Times New Roman"/>
+        </w:rPr>
+      </w:pPr>
+      <w:r>
+        <w:rPr>
+          <w:rFonts w:ascii="Times New Roman" w:hAnsi="Times New Roman" w:cs="Times New Roman"/>
+        </w:rPr>
+        <w:t>Upload EasyPaisa/JazzCash payment receipt after manual payment.</w:t>
+      </w:r>
+    </w:p>
+    <w:p>
+      <w:pPr>
+        <w:numPr>
+          <w:ilvl w:val="0"/>
+          <w:numId w:val="6"/>
+        </w:numPr>
+        <w:ind w:left="1080"/>
+        <w:rPr>
+          <w:rFonts w:ascii="Times New Roman" w:hAnsi="Times New Roman" w:cs="Times New Roman"/>
+        </w:rPr>
+      </w:pPr>
+      <w:r>
+        <w:rPr>
+          <w:rFonts w:ascii="Times New Roman" w:hAnsi="Times New Roman" w:cs="Times New Roman"/>
+        </w:rPr>
+        <w:lastRenderedPageBreak/>
+        <w:t>Raise disputes for booking, payment, service, or behavior issues.</w:t>
+      </w:r>
+    </w:p>
+    <w:p>
+      <w:pPr>
+        <w:numPr>
+          <w:ilvl w:val="0"/>
+          <w:numId w:val="6"/>
+        </w:numPr>
+        <w:ind w:left="1080"/>
+        <w:rPr>
+          <w:rFonts w:ascii="Times New Roman" w:hAnsi="Times New Roman" w:cs="Times New Roman"/>
+        </w:rPr>
+      </w:pPr>
+      <w:r>
+        <w:rPr>
+          <w:rFonts w:ascii="Times New Roman" w:hAnsi="Times New Roman" w:cs="Times New Roman"/>
+        </w:rPr>
+        <w:t>Submit ratings and reviews after service completion.</w:t>
+      </w:r>
+    </w:p>
+    <w:p>
+      <w:pPr>
+        <w:numPr>
+          <w:ilvl w:val="0"/>
+          <w:numId w:val="6"/>
+        </w:numPr>
+        <w:ind w:left="1080"/>
+        <w:rPr>
+          <w:rFonts w:ascii="Times New Roman" w:hAnsi="Times New Roman" w:cs="Times New Roman"/>
+        </w:rPr>
+      </w:pPr>
+      <w:r>
+        <w:rPr>
+          <w:rFonts w:ascii="Times New Roman" w:hAnsi="Times New Roman" w:cs="Times New Roman"/>
+        </w:rPr>
+        <w:t>View notifications.</w:t>
+      </w:r>
+    </w:p>
+    <w:p>
+      <w:pPr>
         <w:pStyle w:val="FirstParagraph"/>
         <w:ind w:left="360"/>
         <w:rPr>
@@ -5488,7 +5822,7 @@
           <w:b/>
           <w:bCs/>
         </w:rPr>
-        <w:t>Household users can:</w:t>
+        <w:t>Worker users can:</w:t>
       </w:r>
     </w:p>
     <w:p>
@@ -5524,7 +5858,7 @@
         <w:rPr>
           <w:rFonts w:ascii="Times New Roman" w:hAnsi="Times New Roman" w:cs="Times New Roman"/>
         </w:rPr>
-        <w:t>Select household role on the login screen.</w:t>
+        <w:t>Select worker role on the login screen.</w:t>
       </w:r>
     </w:p>
     <w:p>
@@ -5542,7 +5876,7 @@
         <w:rPr>
           <w:rFonts w:ascii="Times New Roman" w:hAnsi="Times New Roman" w:cs="Times New Roman"/>
         </w:rPr>
-        <w:t>Search workers by service category and city/area.</w:t>
+        <w:t>Create and manage worker profile.</w:t>
       </w:r>
     </w:p>
     <w:p>
@@ -5560,7 +5894,7 @@
         <w:rPr>
           <w:rFonts w:ascii="Times New Roman" w:hAnsi="Times New Roman" w:cs="Times New Roman"/>
         </w:rPr>
-        <w:t>View worker list and worker detail screens.</w:t>
+        <w:t>Add services, expected charges, experience, area, and availability.</w:t>
       </w:r>
     </w:p>
     <w:p>
@@ -5578,7 +5912,7 @@
         <w:rPr>
           <w:rFonts w:ascii="Times New Roman" w:hAnsi="Times New Roman" w:cs="Times New Roman"/>
         </w:rPr>
-        <w:t>Send booking requests.</w:t>
+        <w:t>Submit profile for verification.</w:t>
       </w:r>
     </w:p>
     <w:p>
@@ -5596,7 +5930,7 @@
         <w:rPr>
           <w:rFonts w:ascii="Times New Roman" w:hAnsi="Times New Roman" w:cs="Times New Roman"/>
         </w:rPr>
-        <w:t>Track booking status.</w:t>
+        <w:t>View incoming booking requests.</w:t>
       </w:r>
     </w:p>
     <w:p>
@@ -5614,7 +5948,7 @@
         <w:rPr>
           <w:rFonts w:ascii="Times New Roman" w:hAnsi="Times New Roman" w:cs="Times New Roman"/>
         </w:rPr>
-        <w:t>View the generated service agreement after worker acceptance.</w:t>
+        <w:t>Accept or reject booking requests.</w:t>
       </w:r>
     </w:p>
     <w:p>
@@ -5632,7 +5966,7 @@
         <w:rPr>
           <w:rFonts w:ascii="Times New Roman" w:hAnsi="Times New Roman" w:cs="Times New Roman"/>
         </w:rPr>
-        <w:t>Upload EasyPaisa/JazzCash payment receipt after manual payment.</w:t>
+        <w:t>View generated service agreements.</w:t>
       </w:r>
     </w:p>
     <w:p>
@@ -5650,8 +5984,7 @@
         <w:rPr>
           <w:rFonts w:ascii="Times New Roman" w:hAnsi="Times New Roman" w:cs="Times New Roman"/>
         </w:rPr>
-        <w:lastRenderedPageBreak/>
-        <w:t>Raise disputes for booking, payment, service, or behavior issues.</w:t>
+        <w:t>Review uploaded payment receipts and confirm payment received.</w:t>
       </w:r>
     </w:p>
     <w:p>
@@ -5669,7 +6002,7 @@
         <w:rPr>
           <w:rFonts w:ascii="Times New Roman" w:hAnsi="Times New Roman" w:cs="Times New Roman"/>
         </w:rPr>
-        <w:t>Submit ratings and reviews after service completion.</w:t>
+        <w:t>Raise disputes for payment or service issues.</w:t>
       </w:r>
     </w:p>
     <w:p>
@@ -5687,7 +6020,7 @@
         <w:rPr>
           <w:rFonts w:ascii="Times New Roman" w:hAnsi="Times New Roman" w:cs="Times New Roman"/>
         </w:rPr>
-        <w:t>View notifications.</w:t>
+        <w:t>View ratings and notifications.</w:t>
       </w:r>
     </w:p>
     <w:p>
@@ -5706,7 +6039,7 @@
           <w:b/>
           <w:bCs/>
         </w:rPr>
-        <w:t>Worker users can:</w:t>
+        <w:t>Admin users can:</w:t>
       </w:r>
     </w:p>
     <w:p>
@@ -5724,7 +6057,7 @@
         <w:rPr>
           <w:rFonts w:ascii="Times New Roman" w:hAnsi="Times New Roman" w:cs="Times New Roman"/>
         </w:rPr>
-        <w:t>Register and log in.</w:t>
+        <w:t>Log in through the admin web dashboard.</w:t>
       </w:r>
     </w:p>
     <w:p>
@@ -5742,7 +6075,7 @@
         <w:rPr>
           <w:rFonts w:ascii="Times New Roman" w:hAnsi="Times New Roman" w:cs="Times New Roman"/>
         </w:rPr>
-        <w:t>Select worker role on the login screen.</w:t>
+        <w:t>View worker verification requests.</w:t>
       </w:r>
     </w:p>
     <w:p>
@@ -5760,7 +6093,7 @@
         <w:rPr>
           <w:rFonts w:ascii="Times New Roman" w:hAnsi="Times New Roman" w:cs="Times New Roman"/>
         </w:rPr>
-        <w:t>Create and manage worker profile.</w:t>
+        <w:t>Approve or reject worker profiles.</w:t>
       </w:r>
     </w:p>
     <w:p>
@@ -5778,7 +6111,7 @@
         <w:rPr>
           <w:rFonts w:ascii="Times New Roman" w:hAnsi="Times New Roman" w:cs="Times New Roman"/>
         </w:rPr>
-        <w:t>Add services, expected charges, experience, area, and availability.</w:t>
+        <w:t>View users and booking records.</w:t>
       </w:r>
     </w:p>
     <w:p>
@@ -5796,7 +6129,7 @@
         <w:rPr>
           <w:rFonts w:ascii="Times New Roman" w:hAnsi="Times New Roman" w:cs="Times New Roman"/>
         </w:rPr>
-        <w:t>Submit profile for verification.</w:t>
+        <w:t>View service agreement and payment tracking records.</w:t>
       </w:r>
     </w:p>
     <w:p>
@@ -5814,7 +6147,7 @@
         <w:rPr>
           <w:rFonts w:ascii="Times New Roman" w:hAnsi="Times New Roman" w:cs="Times New Roman"/>
         </w:rPr>
-        <w:t>View incoming booking requests.</w:t>
+        <w:t>Handle reported disputes/issues.</w:t>
       </w:r>
     </w:p>
     <w:p>
@@ -5832,223 +6165,6 @@
         <w:rPr>
           <w:rFonts w:ascii="Times New Roman" w:hAnsi="Times New Roman" w:cs="Times New Roman"/>
         </w:rPr>
-        <w:t>Accept or reject booking requests.</w:t>
-      </w:r>
-    </w:p>
-    <w:p>
-      <w:pPr>
-        <w:numPr>
-          <w:ilvl w:val="0"/>
-          <w:numId w:val="8"/>
-        </w:numPr>
-        <w:ind w:left="1080"/>
-        <w:rPr>
-          <w:rFonts w:ascii="Times New Roman" w:hAnsi="Times New Roman" w:cs="Times New Roman"/>
-        </w:rPr>
-      </w:pPr>
-      <w:r>
-        <w:rPr>
-          <w:rFonts w:ascii="Times New Roman" w:hAnsi="Times New Roman" w:cs="Times New Roman"/>
-        </w:rPr>
-        <w:t>View generated service agreements.</w:t>
-      </w:r>
-    </w:p>
-    <w:p>
-      <w:pPr>
-        <w:numPr>
-          <w:ilvl w:val="0"/>
-          <w:numId w:val="8"/>
-        </w:numPr>
-        <w:ind w:left="1080"/>
-        <w:rPr>
-          <w:rFonts w:ascii="Times New Roman" w:hAnsi="Times New Roman" w:cs="Times New Roman"/>
-        </w:rPr>
-      </w:pPr>
-      <w:r>
-        <w:rPr>
-          <w:rFonts w:ascii="Times New Roman" w:hAnsi="Times New Roman" w:cs="Times New Roman"/>
-        </w:rPr>
-        <w:t>Review uploaded payment receipts and confirm payment received.</w:t>
-      </w:r>
-    </w:p>
-    <w:p>
-      <w:pPr>
-        <w:numPr>
-          <w:ilvl w:val="0"/>
-          <w:numId w:val="8"/>
-        </w:numPr>
-        <w:ind w:left="1080"/>
-        <w:rPr>
-          <w:rFonts w:ascii="Times New Roman" w:hAnsi="Times New Roman" w:cs="Times New Roman"/>
-        </w:rPr>
-      </w:pPr>
-      <w:r>
-        <w:rPr>
-          <w:rFonts w:ascii="Times New Roman" w:hAnsi="Times New Roman" w:cs="Times New Roman"/>
-        </w:rPr>
-        <w:t>Raise disputes for payment or service issues.</w:t>
-      </w:r>
-    </w:p>
-    <w:p>
-      <w:pPr>
-        <w:numPr>
-          <w:ilvl w:val="0"/>
-          <w:numId w:val="8"/>
-        </w:numPr>
-        <w:ind w:left="1080"/>
-        <w:rPr>
-          <w:rFonts w:ascii="Times New Roman" w:hAnsi="Times New Roman" w:cs="Times New Roman"/>
-        </w:rPr>
-      </w:pPr>
-      <w:r>
-        <w:rPr>
-          <w:rFonts w:ascii="Times New Roman" w:hAnsi="Times New Roman" w:cs="Times New Roman"/>
-        </w:rPr>
-        <w:t>View ratings and notifications.</w:t>
-      </w:r>
-    </w:p>
-    <w:p>
-      <w:pPr>
-        <w:pStyle w:val="FirstParagraph"/>
-        <w:ind w:left="360"/>
-        <w:rPr>
-          <w:rFonts w:ascii="Times New Roman" w:hAnsi="Times New Roman" w:cs="Times New Roman"/>
-          <w:b/>
-          <w:bCs/>
-        </w:rPr>
-      </w:pPr>
-      <w:r>
-        <w:rPr>
-          <w:rFonts w:ascii="Times New Roman" w:hAnsi="Times New Roman" w:cs="Times New Roman"/>
-          <w:b/>
-          <w:bCs/>
-        </w:rPr>
-        <w:t>Admin users can:</w:t>
-      </w:r>
-    </w:p>
-    <w:p>
-      <w:pPr>
-        <w:numPr>
-          <w:ilvl w:val="0"/>
-          <w:numId w:val="9"/>
-        </w:numPr>
-        <w:ind w:left="1080"/>
-        <w:rPr>
-          <w:rFonts w:ascii="Times New Roman" w:hAnsi="Times New Roman" w:cs="Times New Roman"/>
-        </w:rPr>
-      </w:pPr>
-      <w:r>
-        <w:rPr>
-          <w:rFonts w:ascii="Times New Roman" w:hAnsi="Times New Roman" w:cs="Times New Roman"/>
-        </w:rPr>
-        <w:t>Log in through the admin web dashboard.</w:t>
-      </w:r>
-    </w:p>
-    <w:p>
-      <w:pPr>
-        <w:numPr>
-          <w:ilvl w:val="0"/>
-          <w:numId w:val="9"/>
-        </w:numPr>
-        <w:ind w:left="1080"/>
-        <w:rPr>
-          <w:rFonts w:ascii="Times New Roman" w:hAnsi="Times New Roman" w:cs="Times New Roman"/>
-        </w:rPr>
-      </w:pPr>
-      <w:r>
-        <w:rPr>
-          <w:rFonts w:ascii="Times New Roman" w:hAnsi="Times New Roman" w:cs="Times New Roman"/>
-        </w:rPr>
-        <w:t>View worker verification requests.</w:t>
-      </w:r>
-    </w:p>
-    <w:p>
-      <w:pPr>
-        <w:numPr>
-          <w:ilvl w:val="0"/>
-          <w:numId w:val="9"/>
-        </w:numPr>
-        <w:ind w:left="1080"/>
-        <w:rPr>
-          <w:rFonts w:ascii="Times New Roman" w:hAnsi="Times New Roman" w:cs="Times New Roman"/>
-        </w:rPr>
-      </w:pPr>
-      <w:r>
-        <w:rPr>
-          <w:rFonts w:ascii="Times New Roman" w:hAnsi="Times New Roman" w:cs="Times New Roman"/>
-        </w:rPr>
-        <w:t>Approve or reject worker profiles.</w:t>
-      </w:r>
-    </w:p>
-    <w:p>
-      <w:pPr>
-        <w:numPr>
-          <w:ilvl w:val="0"/>
-          <w:numId w:val="9"/>
-        </w:numPr>
-        <w:ind w:left="1080"/>
-        <w:rPr>
-          <w:rFonts w:ascii="Times New Roman" w:hAnsi="Times New Roman" w:cs="Times New Roman"/>
-        </w:rPr>
-      </w:pPr>
-      <w:r>
-        <w:rPr>
-          <w:rFonts w:ascii="Times New Roman" w:hAnsi="Times New Roman" w:cs="Times New Roman"/>
-        </w:rPr>
-        <w:t>View users and booking records.</w:t>
-      </w:r>
-    </w:p>
-    <w:p>
-      <w:pPr>
-        <w:numPr>
-          <w:ilvl w:val="0"/>
-          <w:numId w:val="9"/>
-        </w:numPr>
-        <w:ind w:left="1080"/>
-        <w:rPr>
-          <w:rFonts w:ascii="Times New Roman" w:hAnsi="Times New Roman" w:cs="Times New Roman"/>
-        </w:rPr>
-      </w:pPr>
-      <w:r>
-        <w:rPr>
-          <w:rFonts w:ascii="Times New Roman" w:hAnsi="Times New Roman" w:cs="Times New Roman"/>
-        </w:rPr>
-        <w:t>View service agreement and payment tracking records.</w:t>
-      </w:r>
-    </w:p>
-    <w:p>
-      <w:pPr>
-        <w:numPr>
-          <w:ilvl w:val="0"/>
-          <w:numId w:val="9"/>
-        </w:numPr>
-        <w:ind w:left="1080"/>
-        <w:rPr>
-          <w:rFonts w:ascii="Times New Roman" w:hAnsi="Times New Roman" w:cs="Times New Roman"/>
-        </w:rPr>
-      </w:pPr>
-      <w:r>
-        <w:rPr>
-          <w:rFonts w:ascii="Times New Roman" w:hAnsi="Times New Roman" w:cs="Times New Roman"/>
-        </w:rPr>
-        <w:t>Handle reported disputes/issues.</w:t>
-      </w:r>
-    </w:p>
-    <w:p>
-      <w:pPr>
-        <w:numPr>
-          <w:ilvl w:val="0"/>
-          <w:numId w:val="9"/>
-        </w:numPr>
-        <w:ind w:left="1080"/>
-        <w:rPr>
-          <w:rFonts w:ascii="Times New Roman" w:hAnsi="Times New Roman" w:cs="Times New Roman"/>
-        </w:rPr>
-      </w:pPr>
-      <w:r>
-        <w:rPr>
-          <w:rFonts w:ascii="Times New Roman" w:hAnsi="Times New Roman" w:cs="Times New Roman"/>
-        </w:rPr>
         <w:t>View basic dashboard counts.</w:t>
       </w:r>
     </w:p>
@@ -6071,13 +6187,13 @@
         <w:pStyle w:val="Heading2"/>
         <w:numPr>
           <w:ilvl w:val="1"/>
-          <w:numId w:val="46"/>
+          <w:numId w:val="12"/>
         </w:numPr>
         <w:rPr>
           <w:rFonts w:cs="Times New Roman"/>
         </w:rPr>
       </w:pPr>
-      <w:bookmarkStart w:id="17" w:name="_Toc234323948"/>
+      <w:bookmarkStart w:id="17" w:name="_Toc234926743"/>
       <w:bookmarkEnd w:id="16"/>
       <w:r>
         <w:rPr>
@@ -6116,7 +6232,7 @@
         <w:pStyle w:val="Heading3"/>
         <w:numPr>
           <w:ilvl w:val="2"/>
-          <w:numId w:val="46"/>
+          <w:numId w:val="12"/>
         </w:numPr>
         <w:rPr>
           <w:rFonts w:cs="Times New Roman"/>
@@ -6133,7 +6249,7 @@
       <w:pPr>
         <w:numPr>
           <w:ilvl w:val="1"/>
-          <w:numId w:val="48"/>
+          <w:numId w:val="14"/>
         </w:numPr>
         <w:rPr>
           <w:rFonts w:ascii="Times New Roman" w:hAnsi="Times New Roman" w:cs="Times New Roman"/>
@@ -6150,7 +6266,7 @@
       <w:pPr>
         <w:numPr>
           <w:ilvl w:val="1"/>
-          <w:numId w:val="48"/>
+          <w:numId w:val="14"/>
         </w:numPr>
         <w:rPr>
           <w:rFonts w:ascii="Times New Roman" w:hAnsi="Times New Roman" w:cs="Times New Roman"/>
@@ -6168,7 +6284,7 @@
         <w:pStyle w:val="Heading3"/>
         <w:numPr>
           <w:ilvl w:val="2"/>
-          <w:numId w:val="46"/>
+          <w:numId w:val="12"/>
         </w:numPr>
         <w:rPr>
           <w:rFonts w:cs="Times New Roman"/>
@@ -6186,7 +6302,7 @@
         <w:pStyle w:val="ListParagraph"/>
         <w:numPr>
           <w:ilvl w:val="1"/>
-          <w:numId w:val="49"/>
+          <w:numId w:val="15"/>
         </w:numPr>
         <w:rPr>
           <w:rFonts w:ascii="Times New Roman" w:hAnsi="Times New Roman" w:cs="Times New Roman"/>
@@ -6204,7 +6320,7 @@
         <w:pStyle w:val="Heading3"/>
         <w:numPr>
           <w:ilvl w:val="2"/>
-          <w:numId w:val="46"/>
+          <w:numId w:val="12"/>
         </w:numPr>
         <w:rPr>
           <w:rFonts w:cs="Times New Roman"/>
@@ -6222,7 +6338,7 @@
         <w:pStyle w:val="ListParagraph"/>
         <w:numPr>
           <w:ilvl w:val="1"/>
-          <w:numId w:val="49"/>
+          <w:numId w:val="15"/>
         </w:numPr>
         <w:rPr>
           <w:rFonts w:ascii="Times New Roman" w:hAnsi="Times New Roman" w:cs="Times New Roman"/>
@@ -6240,7 +6356,7 @@
         <w:pStyle w:val="Heading3"/>
         <w:numPr>
           <w:ilvl w:val="2"/>
-          <w:numId w:val="46"/>
+          <w:numId w:val="12"/>
         </w:numPr>
         <w:rPr>
           <w:rFonts w:cs="Times New Roman"/>
@@ -6258,7 +6374,7 @@
         <w:pStyle w:val="ListParagraph"/>
         <w:numPr>
           <w:ilvl w:val="1"/>
-          <w:numId w:val="49"/>
+          <w:numId w:val="15"/>
         </w:numPr>
         <w:rPr>
           <w:rFonts w:ascii="Times New Roman" w:hAnsi="Times New Roman" w:cs="Times New Roman"/>
@@ -6276,7 +6392,7 @@
         <w:pStyle w:val="Heading3"/>
         <w:numPr>
           <w:ilvl w:val="2"/>
-          <w:numId w:val="46"/>
+          <w:numId w:val="12"/>
         </w:numPr>
         <w:rPr>
           <w:rFonts w:cs="Times New Roman"/>
@@ -6295,7 +6411,7 @@
         <w:pStyle w:val="ListParagraph"/>
         <w:numPr>
           <w:ilvl w:val="1"/>
-          <w:numId w:val="49"/>
+          <w:numId w:val="15"/>
         </w:numPr>
         <w:rPr>
           <w:rFonts w:ascii="Times New Roman" w:hAnsi="Times New Roman" w:cs="Times New Roman"/>
@@ -6313,7 +6429,7 @@
         <w:pStyle w:val="ListParagraph"/>
         <w:numPr>
           <w:ilvl w:val="1"/>
-          <w:numId w:val="49"/>
+          <w:numId w:val="15"/>
         </w:numPr>
         <w:rPr>
           <w:rFonts w:ascii="Times New Roman" w:hAnsi="Times New Roman" w:cs="Times New Roman"/>
@@ -6331,7 +6447,7 @@
         <w:pStyle w:val="ListParagraph"/>
         <w:numPr>
           <w:ilvl w:val="1"/>
-          <w:numId w:val="49"/>
+          <w:numId w:val="15"/>
         </w:numPr>
         <w:rPr>
           <w:rFonts w:ascii="Times New Roman" w:hAnsi="Times New Roman" w:cs="Times New Roman"/>
@@ -6349,7 +6465,7 @@
         <w:pStyle w:val="ListParagraph"/>
         <w:numPr>
           <w:ilvl w:val="1"/>
-          <w:numId w:val="49"/>
+          <w:numId w:val="15"/>
         </w:numPr>
         <w:rPr>
           <w:rFonts w:ascii="Times New Roman" w:hAnsi="Times New Roman" w:cs="Times New Roman"/>
@@ -6367,13 +6483,13 @@
         <w:pStyle w:val="Heading2"/>
         <w:numPr>
           <w:ilvl w:val="1"/>
-          <w:numId w:val="46"/>
+          <w:numId w:val="12"/>
         </w:numPr>
         <w:rPr>
           <w:rFonts w:cs="Times New Roman"/>
         </w:rPr>
       </w:pPr>
-      <w:bookmarkStart w:id="19" w:name="_Toc234323949"/>
+      <w:bookmarkStart w:id="19" w:name="_Toc234926744"/>
       <w:bookmarkEnd w:id="18"/>
       <w:r>
         <w:rPr>
@@ -6593,13 +6709,13 @@
         <w:pStyle w:val="Heading2"/>
         <w:numPr>
           <w:ilvl w:val="1"/>
-          <w:numId w:val="46"/>
+          <w:numId w:val="12"/>
         </w:numPr>
         <w:rPr>
           <w:rFonts w:cs="Times New Roman"/>
         </w:rPr>
       </w:pPr>
-      <w:bookmarkStart w:id="22" w:name="_Toc234323950"/>
+      <w:bookmarkStart w:id="22" w:name="_Toc234926745"/>
       <w:bookmarkEnd w:id="20"/>
       <w:r>
         <w:rPr>
@@ -6608,7 +6724,7 @@
         </w:rPr>
         <w:lastRenderedPageBreak/>
         <w:drawing>
-          <wp:anchor distT="0" distB="0" distL="114300" distR="114300" simplePos="0" relativeHeight="251593216" behindDoc="0" locked="0" layoutInCell="1" allowOverlap="1" wp14:anchorId="3CD5CBD8" wp14:editId="09526496">
+          <wp:anchor distT="0" distB="0" distL="114300" distR="114300" simplePos="0" relativeHeight="251620352" behindDoc="0" locked="0" layoutInCell="1" allowOverlap="1" wp14:anchorId="3CD5CBD8" wp14:editId="09526496">
             <wp:simplePos x="0" y="0"/>
             <wp:positionH relativeFrom="column">
               <wp:posOffset>1296365</wp:posOffset>
@@ -6821,13 +6937,13 @@
         <w:pStyle w:val="Heading1"/>
         <w:numPr>
           <w:ilvl w:val="0"/>
-          <w:numId w:val="36"/>
+          <w:numId w:val="9"/>
         </w:numPr>
         <w:rPr>
           <w:rFonts w:cs="Times New Roman"/>
         </w:rPr>
       </w:pPr>
-      <w:bookmarkStart w:id="26" w:name="_Toc234323951"/>
+      <w:bookmarkStart w:id="26" w:name="_Toc234926746"/>
       <w:bookmarkEnd w:id="23"/>
       <w:bookmarkEnd w:id="24"/>
       <w:r>
@@ -6844,13 +6960,13 @@
         <w:pStyle w:val="Heading2"/>
         <w:numPr>
           <w:ilvl w:val="1"/>
-          <w:numId w:val="36"/>
+          <w:numId w:val="9"/>
         </w:numPr>
         <w:rPr>
           <w:rFonts w:cs="Times New Roman"/>
         </w:rPr>
       </w:pPr>
-      <w:bookmarkStart w:id="27" w:name="_Toc234323952"/>
+      <w:bookmarkStart w:id="27" w:name="_Toc234926747"/>
       <w:r>
         <w:rPr>
           <w:rFonts w:cs="Times New Roman"/>
@@ -7106,13 +7222,13 @@
         <w:pStyle w:val="Heading2"/>
         <w:numPr>
           <w:ilvl w:val="1"/>
-          <w:numId w:val="36"/>
+          <w:numId w:val="9"/>
         </w:numPr>
         <w:rPr>
           <w:rFonts w:cs="Times New Roman"/>
         </w:rPr>
       </w:pPr>
-      <w:bookmarkStart w:id="32" w:name="_Toc234323953"/>
+      <w:bookmarkStart w:id="32" w:name="_Toc234926748"/>
       <w:r>
         <w:rPr>
           <w:rFonts w:cs="Times New Roman"/>
@@ -7120,7 +7236,6 @@
         <w:lastRenderedPageBreak/>
         <w:t xml:space="preserve">Sequence Diagram </w:t>
       </w:r>
-      <w:bookmarkEnd w:id="32"/>
       <w:r>
         <w:rPr>
           <w:rFonts w:cs="Times New Roman"/>
@@ -7263,7 +7378,7 @@
           <w:noProof/>
         </w:rPr>
         <w:drawing>
-          <wp:anchor distT="0" distB="0" distL="114300" distR="114300" simplePos="0" relativeHeight="251637248" behindDoc="0" locked="0" layoutInCell="1" allowOverlap="1" wp14:anchorId="172874A8" wp14:editId="13A96ACE">
+          <wp:anchor distT="0" distB="0" distL="114300" distR="114300" simplePos="0" relativeHeight="251639808" behindDoc="0" locked="0" layoutInCell="1" allowOverlap="1" wp14:anchorId="172874A8" wp14:editId="13A96ACE">
             <wp:simplePos x="0" y="0"/>
             <wp:positionH relativeFrom="column">
               <wp:posOffset>121534</wp:posOffset>
@@ -7312,20 +7427,21 @@
           </wp:anchor>
         </w:drawing>
       </w:r>
+      <w:bookmarkEnd w:id="32"/>
     </w:p>
     <w:p>
       <w:pPr>
         <w:pStyle w:val="Heading2"/>
         <w:numPr>
           <w:ilvl w:val="1"/>
-          <w:numId w:val="36"/>
+          <w:numId w:val="9"/>
         </w:numPr>
         <w:rPr>
           <w:rFonts w:cs="Times New Roman"/>
         </w:rPr>
       </w:pPr>
-      <w:bookmarkStart w:id="34" w:name="_Toc234323954"/>
-      <w:bookmarkStart w:id="35" w:name="state-transition-model"/>
+      <w:bookmarkStart w:id="34" w:name="state-transition-model"/>
+      <w:bookmarkStart w:id="35" w:name="_Toc234926749"/>
       <w:bookmarkEnd w:id="31"/>
       <w:r>
         <w:rPr>
@@ -7471,7 +7587,7 @@
           <w:noProof/>
         </w:rPr>
         <w:drawing>
-          <wp:anchor distT="0" distB="0" distL="114300" distR="114300" simplePos="0" relativeHeight="251729408" behindDoc="0" locked="0" layoutInCell="1" allowOverlap="1" wp14:anchorId="12A92C3E" wp14:editId="623B6905">
+          <wp:anchor distT="0" distB="0" distL="114300" distR="114300" simplePos="0" relativeHeight="251694080" behindDoc="0" locked="0" layoutInCell="1" allowOverlap="1" wp14:anchorId="12A92C3E" wp14:editId="623B6905">
             <wp:simplePos x="0" y="0"/>
             <wp:positionH relativeFrom="column">
               <wp:posOffset>601884</wp:posOffset>
@@ -7526,7 +7642,7 @@
         </w:rPr>
         <w:t>State Transition Model</w:t>
       </w:r>
-      <w:bookmarkEnd w:id="34"/>
+      <w:bookmarkEnd w:id="35"/>
     </w:p>
     <w:p>
       <w:pPr>
@@ -7541,23 +7657,23 @@
         <w:pStyle w:val="Heading1"/>
         <w:numPr>
           <w:ilvl w:val="0"/>
-          <w:numId w:val="36"/>
+          <w:numId w:val="9"/>
         </w:numPr>
         <w:rPr>
           <w:rFonts w:cs="Times New Roman"/>
         </w:rPr>
       </w:pPr>
-      <w:bookmarkStart w:id="37" w:name="_Toc234323955"/>
-      <w:bookmarkStart w:id="38" w:name="data-design"/>
+      <w:bookmarkStart w:id="37" w:name="data-design"/>
+      <w:bookmarkStart w:id="38" w:name="_Toc234926750"/>
       <w:bookmarkEnd w:id="29"/>
-      <w:bookmarkEnd w:id="35"/>
+      <w:bookmarkEnd w:id="34"/>
       <w:r>
         <w:rPr>
           <w:rFonts w:cs="Times New Roman"/>
         </w:rPr>
         <w:t>Data Design</w:t>
       </w:r>
-      <w:bookmarkEnd w:id="37"/>
+      <w:bookmarkEnd w:id="38"/>
     </w:p>
     <w:p>
       <w:pPr>
@@ -7579,21 +7695,21 @@
         <w:pStyle w:val="Heading2"/>
         <w:numPr>
           <w:ilvl w:val="1"/>
-          <w:numId w:val="36"/>
+          <w:numId w:val="9"/>
         </w:numPr>
         <w:rPr>
           <w:rFonts w:cs="Times New Roman"/>
         </w:rPr>
       </w:pPr>
-      <w:bookmarkStart w:id="39" w:name="_Toc234323956"/>
-      <w:bookmarkStart w:id="40" w:name="er-diagram"/>
+      <w:bookmarkStart w:id="39" w:name="er-diagram"/>
+      <w:bookmarkStart w:id="40" w:name="_Toc234926751"/>
       <w:r>
         <w:rPr>
           <w:rFonts w:cs="Times New Roman"/>
         </w:rPr>
         <w:t>ER Diagram</w:t>
       </w:r>
-      <w:bookmarkEnd w:id="39"/>
+      <w:bookmarkEnd w:id="40"/>
     </w:p>
     <w:p>
       <w:pPr>
@@ -7785,21 +7901,21 @@
         </w:rPr>
       </w:pPr>
       <w:bookmarkStart w:id="42" w:name="database-entities"/>
-      <w:bookmarkEnd w:id="40"/>
+      <w:bookmarkEnd w:id="39"/>
     </w:p>
     <w:p>
       <w:pPr>
         <w:pStyle w:val="Heading2"/>
         <w:numPr>
           <w:ilvl w:val="1"/>
-          <w:numId w:val="36"/>
+          <w:numId w:val="9"/>
         </w:numPr>
         <w:rPr>
           <w:rFonts w:cs="Times New Roman"/>
         </w:rPr>
       </w:pPr>
-      <w:bookmarkStart w:id="43" w:name="_Toc234323957"/>
-      <w:bookmarkStart w:id="44" w:name="entity-descriptions"/>
+      <w:bookmarkStart w:id="43" w:name="entity-descriptions"/>
+      <w:bookmarkStart w:id="44" w:name="_Toc234926752"/>
       <w:bookmarkEnd w:id="42"/>
       <w:r>
         <w:rPr>
@@ -7807,14 +7923,14 @@
         </w:rPr>
         <w:t>Entity Descriptions</w:t>
       </w:r>
-      <w:bookmarkEnd w:id="43"/>
+      <w:bookmarkEnd w:id="44"/>
     </w:p>
     <w:p>
       <w:pPr>
         <w:pStyle w:val="Heading3"/>
         <w:numPr>
           <w:ilvl w:val="2"/>
-          <w:numId w:val="36"/>
+          <w:numId w:val="9"/>
         </w:numPr>
         <w:rPr>
           <w:rFonts w:cs="Times New Roman"/>
@@ -8337,7 +8453,7 @@
         <w:pStyle w:val="Heading3"/>
         <w:numPr>
           <w:ilvl w:val="2"/>
-          <w:numId w:val="36"/>
+          <w:numId w:val="9"/>
         </w:numPr>
         <w:rPr>
           <w:rFonts w:cs="Times New Roman"/>
@@ -8802,7 +8918,7 @@
         <w:pStyle w:val="Heading3"/>
         <w:numPr>
           <w:ilvl w:val="2"/>
-          <w:numId w:val="36"/>
+          <w:numId w:val="9"/>
         </w:numPr>
         <w:rPr>
           <w:rFonts w:cs="Times New Roman"/>
@@ -9504,7 +9620,7 @@
         <w:pStyle w:val="Heading3"/>
         <w:numPr>
           <w:ilvl w:val="2"/>
-          <w:numId w:val="36"/>
+          <w:numId w:val="9"/>
         </w:numPr>
         <w:rPr>
           <w:rFonts w:cs="Times New Roman"/>
@@ -9792,7 +9908,7 @@
         <w:pStyle w:val="Heading3"/>
         <w:numPr>
           <w:ilvl w:val="2"/>
-          <w:numId w:val="36"/>
+          <w:numId w:val="9"/>
         </w:numPr>
         <w:rPr>
           <w:rFonts w:cs="Times New Roman"/>
@@ -10198,7 +10314,7 @@
         <w:pStyle w:val="Heading3"/>
         <w:numPr>
           <w:ilvl w:val="2"/>
-          <w:numId w:val="36"/>
+          <w:numId w:val="9"/>
         </w:numPr>
         <w:rPr>
           <w:rFonts w:cs="Times New Roman"/>
@@ -10663,7 +10779,7 @@
         <w:pStyle w:val="Heading3"/>
         <w:numPr>
           <w:ilvl w:val="2"/>
-          <w:numId w:val="36"/>
+          <w:numId w:val="9"/>
         </w:numPr>
         <w:rPr>
           <w:rFonts w:cs="Times New Roman"/>
@@ -11483,7 +11599,7 @@
         <w:pStyle w:val="Heading3"/>
         <w:numPr>
           <w:ilvl w:val="2"/>
-          <w:numId w:val="36"/>
+          <w:numId w:val="9"/>
         </w:numPr>
         <w:rPr>
           <w:rFonts w:cs="Times New Roman"/>
@@ -12184,7 +12300,7 @@
         <w:pStyle w:val="Heading3"/>
         <w:numPr>
           <w:ilvl w:val="2"/>
-          <w:numId w:val="36"/>
+          <w:numId w:val="9"/>
         </w:numPr>
         <w:rPr>
           <w:rFonts w:cs="Times New Roman"/>
@@ -13064,7 +13180,7 @@
         <w:pStyle w:val="Heading3"/>
         <w:numPr>
           <w:ilvl w:val="2"/>
-          <w:numId w:val="36"/>
+          <w:numId w:val="9"/>
         </w:numPr>
         <w:rPr>
           <w:rFonts w:cs="Times New Roman"/>
@@ -13589,7 +13705,7 @@
         <w:pStyle w:val="Heading3"/>
         <w:numPr>
           <w:ilvl w:val="2"/>
-          <w:numId w:val="36"/>
+          <w:numId w:val="9"/>
         </w:numPr>
         <w:rPr>
           <w:rFonts w:cs="Times New Roman"/>
@@ -14114,7 +14230,7 @@
         <w:pStyle w:val="Heading3"/>
         <w:numPr>
           <w:ilvl w:val="2"/>
-          <w:numId w:val="36"/>
+          <w:numId w:val="9"/>
         </w:numPr>
         <w:rPr>
           <w:rFonts w:cs="Times New Roman"/>
@@ -14699,7 +14815,7 @@
         <w:pStyle w:val="Heading3"/>
         <w:numPr>
           <w:ilvl w:val="2"/>
-          <w:numId w:val="36"/>
+          <w:numId w:val="9"/>
         </w:numPr>
         <w:rPr>
           <w:rFonts w:cs="Times New Roman"/>
@@ -15578,7 +15694,7 @@
         <w:pStyle w:val="Heading3"/>
         <w:numPr>
           <w:ilvl w:val="2"/>
-          <w:numId w:val="36"/>
+          <w:numId w:val="9"/>
         </w:numPr>
         <w:rPr>
           <w:rFonts w:cs="Times New Roman"/>
@@ -16044,15 +16160,15 @@
         <w:pStyle w:val="Heading2"/>
         <w:numPr>
           <w:ilvl w:val="1"/>
-          <w:numId w:val="36"/>
+          <w:numId w:val="9"/>
         </w:numPr>
         <w:rPr>
           <w:rFonts w:cs="Times New Roman"/>
         </w:rPr>
       </w:pPr>
-      <w:bookmarkStart w:id="59" w:name="_Toc234323958"/>
-      <w:bookmarkStart w:id="60" w:name="data-dictionary"/>
-      <w:bookmarkEnd w:id="44"/>
+      <w:bookmarkStart w:id="59" w:name="data-dictionary"/>
+      <w:bookmarkStart w:id="60" w:name="_Toc234926753"/>
+      <w:bookmarkEnd w:id="43"/>
       <w:bookmarkEnd w:id="58"/>
       <w:r>
         <w:rPr>
@@ -16060,7 +16176,7 @@
         </w:rPr>
         <w:t>Data Dictionary</w:t>
       </w:r>
-      <w:bookmarkEnd w:id="59"/>
+      <w:bookmarkEnd w:id="60"/>
     </w:p>
     <w:tbl>
       <w:tblPr>
@@ -17149,30 +17265,30 @@
         <w:pStyle w:val="Heading1"/>
         <w:numPr>
           <w:ilvl w:val="0"/>
-          <w:numId w:val="36"/>
+          <w:numId w:val="9"/>
         </w:numPr>
         <w:rPr>
           <w:rFonts w:cs="Times New Roman"/>
         </w:rPr>
       </w:pPr>
-      <w:bookmarkStart w:id="61" w:name="_Toc234323959"/>
-      <w:bookmarkStart w:id="62" w:name="algorithm-and-implementation"/>
-      <w:bookmarkEnd w:id="38"/>
-      <w:bookmarkEnd w:id="60"/>
+      <w:bookmarkStart w:id="61" w:name="algorithm-and-implementation"/>
+      <w:bookmarkStart w:id="62" w:name="_Toc234926754"/>
+      <w:bookmarkEnd w:id="37"/>
+      <w:bookmarkEnd w:id="59"/>
       <w:r>
         <w:rPr>
           <w:rFonts w:cs="Times New Roman"/>
         </w:rPr>
         <w:t>Algorithm and Implementation</w:t>
       </w:r>
-      <w:bookmarkEnd w:id="61"/>
+      <w:bookmarkEnd w:id="62"/>
     </w:p>
     <w:p>
       <w:pPr>
         <w:pStyle w:val="Heading3"/>
         <w:numPr>
           <w:ilvl w:val="1"/>
-          <w:numId w:val="36"/>
+          <w:numId w:val="9"/>
         </w:numPr>
         <w:rPr>
           <w:rFonts w:cs="Times New Roman"/>
@@ -17330,7 +17446,7 @@
         <w:pStyle w:val="Heading3"/>
         <w:numPr>
           <w:ilvl w:val="1"/>
-          <w:numId w:val="36"/>
+          <w:numId w:val="9"/>
         </w:numPr>
         <w:rPr>
           <w:rFonts w:cs="Times New Roman"/>
@@ -17489,7 +17605,7 @@
         <w:pStyle w:val="Heading3"/>
         <w:numPr>
           <w:ilvl w:val="1"/>
-          <w:numId w:val="36"/>
+          <w:numId w:val="9"/>
         </w:numPr>
         <w:rPr>
           <w:rFonts w:cs="Times New Roman"/>
@@ -17649,7 +17765,7 @@
         <w:pStyle w:val="Heading3"/>
         <w:numPr>
           <w:ilvl w:val="1"/>
-          <w:numId w:val="36"/>
+          <w:numId w:val="9"/>
         </w:numPr>
         <w:rPr>
           <w:rFonts w:cs="Times New Roman"/>
@@ -17808,7 +17924,7 @@
         <w:pStyle w:val="Heading3"/>
         <w:numPr>
           <w:ilvl w:val="1"/>
-          <w:numId w:val="36"/>
+          <w:numId w:val="9"/>
         </w:numPr>
         <w:rPr>
           <w:rFonts w:cs="Times New Roman"/>
@@ -18058,7 +18174,7 @@
         <w:pStyle w:val="Heading3"/>
         <w:numPr>
           <w:ilvl w:val="1"/>
-          <w:numId w:val="36"/>
+          <w:numId w:val="9"/>
         </w:numPr>
         <w:rPr>
           <w:rFonts w:cs="Times New Roman"/>
@@ -18234,7 +18350,7 @@
         <w:pStyle w:val="Heading3"/>
         <w:numPr>
           <w:ilvl w:val="1"/>
-          <w:numId w:val="36"/>
+          <w:numId w:val="9"/>
         </w:numPr>
         <w:rPr>
           <w:rFonts w:cs="Times New Roman"/>
@@ -18462,7 +18578,7 @@
         <w:pStyle w:val="Heading3"/>
         <w:numPr>
           <w:ilvl w:val="1"/>
-          <w:numId w:val="36"/>
+          <w:numId w:val="9"/>
         </w:numPr>
         <w:rPr>
           <w:rFonts w:cs="Times New Roman"/>
@@ -18621,7 +18737,7 @@
         <w:pStyle w:val="Heading3"/>
         <w:numPr>
           <w:ilvl w:val="1"/>
-          <w:numId w:val="36"/>
+          <w:numId w:val="9"/>
         </w:numPr>
         <w:rPr>
           <w:rFonts w:cs="Times New Roman"/>
@@ -18797,7 +18913,7 @@
         <w:pStyle w:val="Heading3"/>
         <w:numPr>
           <w:ilvl w:val="1"/>
-          <w:numId w:val="36"/>
+          <w:numId w:val="9"/>
         </w:numPr>
         <w:rPr>
           <w:rFonts w:cs="Times New Roman"/>
@@ -19025,7 +19141,7 @@
         <w:pStyle w:val="Heading3"/>
         <w:numPr>
           <w:ilvl w:val="1"/>
-          <w:numId w:val="36"/>
+          <w:numId w:val="9"/>
         </w:numPr>
         <w:rPr>
           <w:rFonts w:cs="Times New Roman"/>
@@ -19270,15 +19386,15 @@
         <w:pStyle w:val="Heading1"/>
         <w:numPr>
           <w:ilvl w:val="0"/>
-          <w:numId w:val="36"/>
+          <w:numId w:val="9"/>
         </w:numPr>
         <w:rPr>
           <w:rFonts w:cs="Times New Roman"/>
         </w:rPr>
       </w:pPr>
-      <w:bookmarkStart w:id="74" w:name="_Toc234323960"/>
-      <w:bookmarkStart w:id="75" w:name="X6d3557be40165d011b7173bac1cd2ae3d29e80f"/>
-      <w:bookmarkEnd w:id="62"/>
+      <w:bookmarkStart w:id="74" w:name="X6d3557be40165d011b7173bac1cd2ae3d29e80f"/>
+      <w:bookmarkStart w:id="75" w:name="_Toc234926755"/>
+      <w:bookmarkEnd w:id="61"/>
       <w:bookmarkEnd w:id="73"/>
       <w:r>
         <w:rPr>
@@ -19286,7 +19402,7 @@
         </w:rPr>
         <w:t>Software Requirements Traceability Matrix</w:t>
       </w:r>
-      <w:bookmarkEnd w:id="74"/>
+      <w:bookmarkEnd w:id="75"/>
     </w:p>
     <w:p>
       <w:pPr>
@@ -22174,9 +22290,8 @@
           <w:rFonts w:ascii="Times New Roman" w:hAnsi="Times New Roman" w:cs="Times New Roman"/>
         </w:rPr>
       </w:pPr>
-      <w:bookmarkStart w:id="76" w:name="_Toc234323961"/>
-      <w:bookmarkStart w:id="77" w:name="human-interface-design"/>
-      <w:bookmarkEnd w:id="75"/>
+      <w:bookmarkStart w:id="76" w:name="human-interface-design"/>
+      <w:bookmarkEnd w:id="74"/>
     </w:p>
     <w:p>
       <w:pPr>
@@ -22196,12 +22311,13 @@
         <w:pStyle w:val="Heading1"/>
         <w:numPr>
           <w:ilvl w:val="0"/>
-          <w:numId w:val="36"/>
+          <w:numId w:val="18"/>
         </w:numPr>
         <w:rPr>
           <w:rFonts w:cs="Times New Roman"/>
         </w:rPr>
       </w:pPr>
+      <w:bookmarkStart w:id="77" w:name="_Toc234926756"/>
       <w:r>
         <w:rPr>
           <w:rFonts w:cs="Times New Roman"/>
@@ -22209,25 +22325,19 @@
         <w:lastRenderedPageBreak/>
         <w:t>Human Interface Design</w:t>
       </w:r>
-      <w:bookmarkEnd w:id="76"/>
+      <w:bookmarkEnd w:id="77"/>
     </w:p>
     <w:p>
       <w:pPr>
         <w:pStyle w:val="Heading2"/>
         <w:numPr>
           <w:ilvl w:val="1"/>
-          <w:numId w:val="36"/>
+          <w:numId w:val="19"/>
         </w:numPr>
-        <w:rPr>
-          <w:rFonts w:cs="Times New Roman"/>
-        </w:rPr>
       </w:pPr>
       <w:bookmarkStart w:id="78" w:name="user-interface-overview"/>
-      <w:r>
-        <w:rPr>
-          <w:rFonts w:cs="Times New Roman"/>
-          <w:noProof/>
-        </w:rPr>
+      <w:bookmarkStart w:id="79" w:name="_Toc234926757"/>
+      <w:r>
         <w:pict w14:anchorId="79BE01D9">
           <v:shape id="_x0000_s1033" type="#_x0000_t202" style="position:absolute;left:0;text-align:left;margin-left:266.25pt;margin-top:319.9pt;width:189.5pt;height:20.65pt;z-index:251731968;mso-position-horizontal-relative:text;mso-position-vertical-relative:text" stroked="f">
             <v:textbox style="mso-next-textbox:#_x0000_s1033;mso-fit-shape-to-text:t" inset="0,0,0,0">
@@ -22245,7 +22355,7 @@
                       <w:sz w:val="26"/>
                     </w:rPr>
                   </w:pPr>
-                  <w:bookmarkStart w:id="79" w:name="_Toc234688261"/>
+                  <w:bookmarkStart w:id="80" w:name="_Toc234688261"/>
                   <w:r>
                     <w:rPr>
                       <w:rFonts w:ascii="Times New Roman" w:hAnsi="Times New Roman" w:cs="Times New Roman"/>
@@ -22352,7 +22462,7 @@
                     </w:rPr>
                     <w:t xml:space="preserve"> Mobile Dashboard</w:t>
                   </w:r>
-                  <w:bookmarkEnd w:id="79"/>
+                  <w:bookmarkEnd w:id="80"/>
                 </w:p>
               </w:txbxContent>
             </v:textbox>
@@ -22361,12 +22471,8 @@
         </w:pict>
       </w:r>
       <w:r>
-        <w:rPr>
-          <w:rFonts w:cs="Times New Roman"/>
-          <w:noProof/>
-        </w:rPr>
         <w:drawing>
-          <wp:anchor distT="0" distB="0" distL="114300" distR="114300" simplePos="0" relativeHeight="251668992" behindDoc="0" locked="0" layoutInCell="1" allowOverlap="1" wp14:anchorId="7CF738FE" wp14:editId="44B17601">
+          <wp:anchor distT="0" distB="0" distL="114300" distR="114300" simplePos="0" relativeHeight="251657216" behindDoc="0" locked="0" layoutInCell="1" allowOverlap="1" wp14:anchorId="7CF738FE" wp14:editId="64D82D5E">
             <wp:simplePos x="0" y="0"/>
             <wp:positionH relativeFrom="column">
               <wp:posOffset>3378835</wp:posOffset>
@@ -22422,10 +22528,6 @@
         </w:drawing>
       </w:r>
       <w:r>
-        <w:rPr>
-          <w:rFonts w:cs="Times New Roman"/>
-          <w:noProof/>
-        </w:rPr>
         <w:pict w14:anchorId="655B5ED2">
           <v:shape id="_x0000_s1032" type="#_x0000_t202" style="position:absolute;left:0;text-align:left;margin-left:15.75pt;margin-top:323.3pt;width:196pt;height:20.65pt;z-index:251729920;mso-position-horizontal-relative:text;mso-position-vertical-relative:text" stroked="f">
             <v:textbox style="mso-next-textbox:#_x0000_s1032;mso-fit-shape-to-text:t" inset="0,0,0,0">
@@ -22443,7 +22545,7 @@
                       <w:sz w:val="26"/>
                     </w:rPr>
                   </w:pPr>
-                  <w:bookmarkStart w:id="80" w:name="_Toc234688262"/>
+                  <w:bookmarkStart w:id="81" w:name="_Toc234688262"/>
                   <w:r>
                     <w:rPr>
                       <w:rFonts w:ascii="Times New Roman" w:hAnsi="Times New Roman" w:cs="Times New Roman"/>
@@ -22550,7 +22652,7 @@
                     </w:rPr>
                     <w:t xml:space="preserve"> Mobile Login</w:t>
                   </w:r>
-                  <w:bookmarkEnd w:id="80"/>
+                  <w:bookmarkEnd w:id="81"/>
                 </w:p>
               </w:txbxContent>
             </v:textbox>
@@ -22559,12 +22661,8 @@
         </w:pict>
       </w:r>
       <w:r>
-        <w:rPr>
-          <w:rFonts w:cs="Times New Roman"/>
-          <w:noProof/>
-        </w:rPr>
         <w:drawing>
-          <wp:anchor distT="0" distB="0" distL="114300" distR="114300" simplePos="0" relativeHeight="251625984" behindDoc="0" locked="0" layoutInCell="1" allowOverlap="1" wp14:anchorId="4DB29630" wp14:editId="176CD198">
+          <wp:anchor distT="0" distB="0" distL="114300" distR="114300" simplePos="0" relativeHeight="251637760" behindDoc="0" locked="0" layoutInCell="1" allowOverlap="1" wp14:anchorId="4DB29630" wp14:editId="5C20793E">
             <wp:simplePos x="0" y="0"/>
             <wp:positionH relativeFrom="column">
               <wp:posOffset>198755</wp:posOffset>
@@ -22620,10 +22718,6 @@
         </w:drawing>
       </w:r>
       <w:r>
-        <w:rPr>
-          <w:rFonts w:cs="Times New Roman"/>
-          <w:noProof/>
-        </w:rPr>
         <w:pict w14:anchorId="40584D32">
           <v:shape id="_x0000_s1035" type="#_x0000_t202" style="position:absolute;left:0;text-align:left;margin-left:266.05pt;margin-top:638pt;width:193.4pt;height:.05pt;z-index:251736064;mso-position-horizontal-relative:text;mso-position-vertical-relative:text" stroked="f">
             <v:textbox style="mso-next-textbox:#_x0000_s1035;mso-fit-shape-to-text:t" inset="0,0,0,0">
@@ -22641,7 +22735,7 @@
                       <w:sz w:val="26"/>
                     </w:rPr>
                   </w:pPr>
-                  <w:bookmarkStart w:id="81" w:name="_Toc234688263"/>
+                  <w:bookmarkStart w:id="82" w:name="_Toc234688263"/>
                   <w:r>
                     <w:rPr>
                       <w:rFonts w:ascii="Times New Roman" w:hAnsi="Times New Roman" w:cs="Times New Roman"/>
@@ -22748,7 +22842,7 @@
                     </w:rPr>
                     <w:t xml:space="preserve"> Worker Dashboard</w:t>
                   </w:r>
-                  <w:bookmarkEnd w:id="81"/>
+                  <w:bookmarkEnd w:id="82"/>
                 </w:p>
               </w:txbxContent>
             </v:textbox>
@@ -22757,12 +22851,8 @@
         </w:pict>
       </w:r>
       <w:r>
-        <w:rPr>
-          <w:rFonts w:cs="Times New Roman"/>
-          <w:noProof/>
-        </w:rPr>
         <w:drawing>
-          <wp:anchor distT="0" distB="0" distL="114300" distR="114300" simplePos="0" relativeHeight="251718144" behindDoc="0" locked="0" layoutInCell="1" allowOverlap="1" wp14:anchorId="1BB9F0EC" wp14:editId="159F32CE">
+          <wp:anchor distT="0" distB="0" distL="114300" distR="114300" simplePos="0" relativeHeight="251692032" behindDoc="0" locked="0" layoutInCell="1" allowOverlap="1" wp14:anchorId="1BB9F0EC" wp14:editId="5C845793">
             <wp:simplePos x="0" y="0"/>
             <wp:positionH relativeFrom="column">
               <wp:posOffset>3378835</wp:posOffset>
@@ -22818,10 +22908,6 @@
         </w:drawing>
       </w:r>
       <w:r>
-        <w:rPr>
-          <w:rFonts w:cs="Times New Roman"/>
-          <w:noProof/>
-        </w:rPr>
         <w:pict w14:anchorId="48AE167D">
           <v:shape id="_x0000_s1034" type="#_x0000_t202" style="position:absolute;left:0;text-align:left;margin-left:11.85pt;margin-top:634.95pt;width:196pt;height:.05pt;z-index:251734016;mso-position-horizontal-relative:text;mso-position-vertical-relative:text" stroked="f">
             <v:textbox style="mso-next-textbox:#_x0000_s1034;mso-fit-shape-to-text:t" inset="0,0,0,0">
@@ -22839,7 +22925,7 @@
                       <w:sz w:val="26"/>
                     </w:rPr>
                   </w:pPr>
-                  <w:bookmarkStart w:id="82" w:name="_Toc234688264"/>
+                  <w:bookmarkStart w:id="83" w:name="_Toc234688264"/>
                   <w:r>
                     <w:rPr>
                       <w:rFonts w:ascii="Times New Roman" w:hAnsi="Times New Roman" w:cs="Times New Roman"/>
@@ -22946,7 +23032,7 @@
                     </w:rPr>
                     <w:t xml:space="preserve"> Booking Screen</w:t>
                   </w:r>
-                  <w:bookmarkEnd w:id="82"/>
+                  <w:bookmarkEnd w:id="83"/>
                 </w:p>
               </w:txbxContent>
             </v:textbox>
@@ -22955,12 +23041,8 @@
         </w:pict>
       </w:r>
       <w:r>
-        <w:rPr>
-          <w:rFonts w:cs="Times New Roman"/>
-          <w:noProof/>
-        </w:rPr>
         <w:drawing>
-          <wp:anchor distT="0" distB="0" distL="114300" distR="114300" simplePos="0" relativeHeight="251688448" behindDoc="0" locked="0" layoutInCell="1" allowOverlap="1" wp14:anchorId="05F64AA9" wp14:editId="6F4A6F5D">
+          <wp:anchor distT="0" distB="0" distL="114300" distR="114300" simplePos="0" relativeHeight="251674624" behindDoc="0" locked="0" layoutInCell="1" allowOverlap="1" wp14:anchorId="05F64AA9" wp14:editId="3F709156">
             <wp:simplePos x="0" y="0"/>
             <wp:positionH relativeFrom="column">
               <wp:posOffset>150495</wp:posOffset>
@@ -23016,22 +23098,26 @@
         </w:drawing>
       </w:r>
       <w:r>
-        <w:rPr>
-          <w:rFonts w:cs="Times New Roman"/>
-        </w:rPr>
         <w:t>Mobile App</w:t>
       </w:r>
+      <w:bookmarkEnd w:id="79"/>
     </w:p>
-    <w:bookmarkEnd w:id="77"/>
-    <w:bookmarkEnd w:id="78"/>
     <w:p>
       <w:pPr>
         <w:pStyle w:val="Heading1"/>
-      </w:pPr>
+        <w:numPr>
+          <w:ilvl w:val="0"/>
+          <w:numId w:val="16"/>
+        </w:numPr>
+      </w:pPr>
+      <w:bookmarkStart w:id="84" w:name="_Toc234926758"/>
+      <w:bookmarkEnd w:id="76"/>
+      <w:bookmarkEnd w:id="78"/>
       <w:r>
         <w:lastRenderedPageBreak/>
         <w:t>Appendix A: Glossary of Terms &amp; Acronyms</w:t>
       </w:r>
+      <w:bookmarkEnd w:id="84"/>
     </w:p>
     <w:p>
       <w:pPr>
@@ -23061,16 +23147,16 @@
     <w:p>
       <w:pPr>
         <w:pStyle w:val="Heading2"/>
-        <w:rPr>
-          <w:rFonts w:cs="Times New Roman"/>
-        </w:rPr>
-      </w:pPr>
-      <w:r>
-        <w:rPr>
-          <w:rFonts w:cs="Times New Roman"/>
-        </w:rPr>
+        <w:numPr>
+          <w:ilvl w:val="1"/>
+          <w:numId w:val="17"/>
+        </w:numPr>
+      </w:pPr>
+      <w:bookmarkStart w:id="85" w:name="_Toc234926759"/>
+      <w:r>
         <w:t>A.1 Glossary of Terms &amp; Acronyms</w:t>
       </w:r>
+      <w:bookmarkEnd w:id="85"/>
     </w:p>
     <w:p>
       <w:pPr>
@@ -24598,83 +24684,6 @@
 <file path=word/numbering.xml><?xml version="1.0" encoding="utf-8"?>
 <w:numbering xmlns:wpc="http://schemas.microsoft.com/office/word/2010/wordprocessingCanvas" xmlns:cx="http://schemas.microsoft.com/office/drawing/2014/chartex" xmlns:cx1="http://schemas.microsoft.com/office/drawing/2015/9/8/chartex" xmlns:cx2="http://schemas.microsoft.com/office/drawing/2015/10/21/chartex" xmlns:cx3="http://schemas.microsoft.com/office/drawing/2016/5/9/chartex" xmlns:cx4="http://schemas.microsoft.com/office/drawing/2016/5/10/chartex" xmlns:cx5="http://schemas.microsoft.com/office/drawing/2016/5/11/chartex" xmlns:cx6="http://schemas.microsoft.com/office/drawing/2016/5/12/chartex" xmlns:cx7="http://schemas.microsoft.com/office/drawing/2016/5/13/chartex" xmlns:cx8="http://schemas.microsoft.com/office/drawing/2016/5/14/chartex" xmlns:mc="http://schemas.openxmlformats.org/markup-compatibility/2006" xmlns:aink="http://schemas.microsoft.com/office/drawing/2016/ink" xmlns:am3d="http://schemas.microsoft.com/office/drawing/2017/model3d" xmlns:o="urn:schemas-microsoft-com:office:office" xmlns:oel="http://schemas.microsoft.com/office/2019/extlst" xmlns:r="http://schemas.openxmlformats.org/officeDocument/2006/relationships" xmlns:m="http://schemas.openxmlformats.org/officeDocument/2006/math" xmlns:v="urn:schemas-microsoft-com:vml" xmlns:wp14="http://schemas.microsoft.com/office/word/2010/wordprocessingDrawing" xmlns:wp="http://schemas.openxmlformats.org/drawingml/2006/wordprocessingDrawing" xmlns:w10="urn:schemas-microsoft-com:office:word" xmlns:w="http://schemas.openxmlformats.org/wordprocessingml/2006/main" xmlns:w14="http://schemas.microsoft.com/office/word/2010/wordml" xmlns:w15="http://schemas.microsoft.com/office/word/2012/wordml" xmlns:w16cex="http://schemas.microsoft.com/office/word/2018/wordml/cex" xmlns:w16cid="http://schemas.microsoft.com/office/word/2016/wordml/cid" xmlns:w16="http://schemas.microsoft.com/office/word/2018/wordml" xmlns:w16du="http://schemas.microsoft.com/office/word/2023/wordml/word16du" xmlns:w16sdtdh="http://schemas.microsoft.com/office/word/2020/wordml/sdtdatahash" xmlns:w16sdtfl="http://schemas.microsoft.com/office/word/2024/wordml/sdtformatlock" xmlns:w16se="http://schemas.microsoft.com/office/word/2015/wordml/symex" xmlns:wpg="http://schemas.microsoft.com/office/word/2010/wordprocessingGroup" xmlns:wpi="http://schemas.microsoft.com/office/word/2010/wordprocessingInk" xmlns:wne="http://schemas.microsoft.com/office/word/2006/wordml" xmlns:wps="http://schemas.microsoft.com/office/word/2010/wordprocessingShape" mc:Ignorable="w14 w15 w16se w16cid w16 w16cex w16sdtdh w16sdtfl w16du wp14">
   <w:abstractNum w:abstractNumId="0" w15:restartNumberingAfterBreak="0">
-    <w:nsid w:val="0000A990"/>
-    <w:multiLevelType w:val="multilevel"/>
-    <w:tmpl w:val="9878DE44"/>
-    <w:lvl w:ilvl="0">
-      <w:numFmt w:val="bullet"/>
-      <w:lvlText w:val=" "/>
-      <w:lvlJc w:val="left"/>
-      <w:pPr>
-        <w:ind w:left="720" w:hanging="360"/>
-      </w:pPr>
-    </w:lvl>
-    <w:lvl w:ilvl="1">
-      <w:numFmt w:val="bullet"/>
-      <w:lvlText w:val=" "/>
-      <w:lvlJc w:val="left"/>
-      <w:pPr>
-        <w:ind w:left="1440" w:hanging="360"/>
-      </w:pPr>
-    </w:lvl>
-    <w:lvl w:ilvl="2">
-      <w:numFmt w:val="bullet"/>
-      <w:lvlText w:val=" "/>
-      <w:lvlJc w:val="left"/>
-      <w:pPr>
-        <w:ind w:left="2160" w:hanging="360"/>
-      </w:pPr>
-    </w:lvl>
-    <w:lvl w:ilvl="3">
-      <w:numFmt w:val="bullet"/>
-      <w:lvlText w:val=" "/>
-      <w:lvlJc w:val="left"/>
-      <w:pPr>
-        <w:ind w:left="2880" w:hanging="360"/>
-      </w:pPr>
-    </w:lvl>
-    <w:lvl w:ilvl="4">
-      <w:numFmt w:val="bullet"/>
-      <w:lvlText w:val=" "/>
-      <w:lvlJc w:val="left"/>
-      <w:pPr>
-        <w:ind w:left="3600" w:hanging="360"/>
-      </w:pPr>
-    </w:lvl>
-    <w:lvl w:ilvl="5">
-      <w:numFmt w:val="bullet"/>
-      <w:lvlText w:val=" "/>
-      <w:lvlJc w:val="left"/>
-      <w:pPr>
-        <w:ind w:left="4320" w:hanging="360"/>
-      </w:pPr>
-    </w:lvl>
-    <w:lvl w:ilvl="6">
-      <w:numFmt w:val="bullet"/>
-      <w:lvlText w:val=" "/>
-      <w:lvlJc w:val="left"/>
-      <w:pPr>
-        <w:ind w:left="5040" w:hanging="360"/>
-      </w:pPr>
-    </w:lvl>
-    <w:lvl w:ilvl="7">
-      <w:numFmt w:val="bullet"/>
-      <w:lvlText w:val=" "/>
-      <w:lvlJc w:val="left"/>
-      <w:pPr>
-        <w:ind w:left="5760" w:hanging="360"/>
-      </w:pPr>
-    </w:lvl>
-    <w:lvl w:ilvl="8">
-      <w:numFmt w:val="bullet"/>
-      <w:lvlText w:val=" "/>
-      <w:lvlJc w:val="left"/>
-      <w:pPr>
-        <w:ind w:left="6480" w:hanging="360"/>
-      </w:pPr>
-    </w:lvl>
-  </w:abstractNum>
-  <w:abstractNum w:abstractNumId="1" w15:restartNumberingAfterBreak="0">
     <w:nsid w:val="0000A991"/>
     <w:multiLevelType w:val="multilevel"/>
     <w:tmpl w:val="E28A4C28"/>
@@ -24778,93 +24787,7 @@
       </w:rPr>
     </w:lvl>
   </w:abstractNum>
-  <w:abstractNum w:abstractNumId="2" w15:restartNumberingAfterBreak="0">
-    <w:nsid w:val="004B65EB"/>
-    <w:multiLevelType w:val="multilevel"/>
-    <w:tmpl w:val="0409001F"/>
-    <w:lvl w:ilvl="0">
-      <w:start w:val="1"/>
-      <w:numFmt w:val="decimal"/>
-      <w:lvlText w:val="%1."/>
-      <w:lvlJc w:val="left"/>
-      <w:pPr>
-        <w:ind w:left="360" w:hanging="360"/>
-      </w:pPr>
-    </w:lvl>
-    <w:lvl w:ilvl="1">
-      <w:start w:val="1"/>
-      <w:numFmt w:val="decimal"/>
-      <w:lvlText w:val="%1.%2."/>
-      <w:lvlJc w:val="left"/>
-      <w:pPr>
-        <w:ind w:left="792" w:hanging="432"/>
-      </w:pPr>
-    </w:lvl>
-    <w:lvl w:ilvl="2">
-      <w:start w:val="1"/>
-      <w:numFmt w:val="decimal"/>
-      <w:lvlText w:val="%1.%2.%3."/>
-      <w:lvlJc w:val="left"/>
-      <w:pPr>
-        <w:ind w:left="1224" w:hanging="504"/>
-      </w:pPr>
-    </w:lvl>
-    <w:lvl w:ilvl="3">
-      <w:start w:val="1"/>
-      <w:numFmt w:val="decimal"/>
-      <w:lvlText w:val="%1.%2.%3.%4."/>
-      <w:lvlJc w:val="left"/>
-      <w:pPr>
-        <w:ind w:left="1728" w:hanging="648"/>
-      </w:pPr>
-    </w:lvl>
-    <w:lvl w:ilvl="4">
-      <w:start w:val="1"/>
-      <w:numFmt w:val="decimal"/>
-      <w:lvlText w:val="%1.%2.%3.%4.%5."/>
-      <w:lvlJc w:val="left"/>
-      <w:pPr>
-        <w:ind w:left="2232" w:hanging="792"/>
-      </w:pPr>
-    </w:lvl>
-    <w:lvl w:ilvl="5">
-      <w:start w:val="1"/>
-      <w:numFmt w:val="decimal"/>
-      <w:lvlText w:val="%1.%2.%3.%4.%5.%6."/>
-      <w:lvlJc w:val="left"/>
-      <w:pPr>
-        <w:ind w:left="2736" w:hanging="936"/>
-      </w:pPr>
-    </w:lvl>
-    <w:lvl w:ilvl="6">
-      <w:start w:val="1"/>
-      <w:numFmt w:val="decimal"/>
-      <w:lvlText w:val="%1.%2.%3.%4.%5.%6.%7."/>
-      <w:lvlJc w:val="left"/>
-      <w:pPr>
-        <w:ind w:left="3240" w:hanging="1080"/>
-      </w:pPr>
-    </w:lvl>
-    <w:lvl w:ilvl="7">
-      <w:start w:val="1"/>
-      <w:numFmt w:val="decimal"/>
-      <w:lvlText w:val="%1.%2.%3.%4.%5.%6.%7.%8."/>
-      <w:lvlJc w:val="left"/>
-      <w:pPr>
-        <w:ind w:left="3744" w:hanging="1224"/>
-      </w:pPr>
-    </w:lvl>
-    <w:lvl w:ilvl="8">
-      <w:start w:val="1"/>
-      <w:numFmt w:val="decimal"/>
-      <w:lvlText w:val="%1.%2.%3.%4.%5.%6.%7.%8.%9."/>
-      <w:lvlJc w:val="left"/>
-      <w:pPr>
-        <w:ind w:left="4320" w:hanging="1440"/>
-      </w:pPr>
-    </w:lvl>
-  </w:abstractNum>
-  <w:abstractNum w:abstractNumId="3" w15:restartNumberingAfterBreak="0">
+  <w:abstractNum w:abstractNumId="1" w15:restartNumberingAfterBreak="0">
     <w:nsid w:val="0E0B7A9B"/>
     <w:multiLevelType w:val="multilevel"/>
     <w:tmpl w:val="522AAABE"/>
@@ -24977,7 +24900,7 @@
       </w:rPr>
     </w:lvl>
   </w:abstractNum>
-  <w:abstractNum w:abstractNumId="4" w15:restartNumberingAfterBreak="0">
+  <w:abstractNum w:abstractNumId="2" w15:restartNumberingAfterBreak="0">
     <w:nsid w:val="1DA32CD9"/>
     <w:multiLevelType w:val="multilevel"/>
     <w:tmpl w:val="0A804404"/>
@@ -25082,120 +25005,7 @@
       </w:rPr>
     </w:lvl>
   </w:abstractNum>
-  <w:abstractNum w:abstractNumId="5" w15:restartNumberingAfterBreak="0">
-    <w:nsid w:val="20772FB5"/>
-    <w:multiLevelType w:val="multilevel"/>
-    <w:tmpl w:val="FD08BF36"/>
-    <w:lvl w:ilvl="0">
-      <w:start w:val="1"/>
-      <w:numFmt w:val="none"/>
-      <w:lvlText w:val="1."/>
-      <w:lvlJc w:val="left"/>
-      <w:pPr>
-        <w:ind w:left="360" w:hanging="360"/>
-      </w:pPr>
-      <w:rPr>
-        <w:rFonts w:hint="default"/>
-      </w:rPr>
-    </w:lvl>
-    <w:lvl w:ilvl="1">
-      <w:start w:val="1"/>
-      <w:numFmt w:val="lowerLetter"/>
-      <w:lvlText w:val="%2)"/>
-      <w:lvlJc w:val="left"/>
-      <w:pPr>
-        <w:ind w:left="720" w:hanging="360"/>
-      </w:pPr>
-      <w:rPr>
-        <w:rFonts w:hint="default"/>
-      </w:rPr>
-    </w:lvl>
-    <w:lvl w:ilvl="2">
-      <w:start w:val="1"/>
-      <w:numFmt w:val="lowerRoman"/>
-      <w:lvlText w:val="%3)"/>
-      <w:lvlJc w:val="left"/>
-      <w:pPr>
-        <w:ind w:left="1080" w:hanging="360"/>
-      </w:pPr>
-      <w:rPr>
-        <w:rFonts w:hint="default"/>
-      </w:rPr>
-    </w:lvl>
-    <w:lvl w:ilvl="3">
-      <w:start w:val="1"/>
-      <w:numFmt w:val="decimal"/>
-      <w:lvlText w:val="(%4)"/>
-      <w:lvlJc w:val="left"/>
-      <w:pPr>
-        <w:ind w:left="1440" w:hanging="360"/>
-      </w:pPr>
-      <w:rPr>
-        <w:rFonts w:hint="default"/>
-      </w:rPr>
-    </w:lvl>
-    <w:lvl w:ilvl="4">
-      <w:start w:val="1"/>
-      <w:numFmt w:val="lowerLetter"/>
-      <w:lvlText w:val="(%5)"/>
-      <w:lvlJc w:val="left"/>
-      <w:pPr>
-        <w:ind w:left="1800" w:hanging="360"/>
-      </w:pPr>
-      <w:rPr>
-        <w:rFonts w:hint="default"/>
-      </w:rPr>
-    </w:lvl>
-    <w:lvl w:ilvl="5">
-      <w:start w:val="1"/>
-      <w:numFmt w:val="lowerRoman"/>
-      <w:lvlText w:val="(%6)"/>
-      <w:lvlJc w:val="left"/>
-      <w:pPr>
-        <w:ind w:left="2160" w:hanging="360"/>
-      </w:pPr>
-      <w:rPr>
-        <w:rFonts w:hint="default"/>
-      </w:rPr>
-    </w:lvl>
-    <w:lvl w:ilvl="6">
-      <w:start w:val="1"/>
-      <w:numFmt w:val="decimal"/>
-      <w:lvlText w:val="%7."/>
-      <w:lvlJc w:val="left"/>
-      <w:pPr>
-        <w:ind w:left="2520" w:hanging="360"/>
-      </w:pPr>
-      <w:rPr>
-        <w:rFonts w:hint="default"/>
-      </w:rPr>
-    </w:lvl>
-    <w:lvl w:ilvl="7">
-      <w:start w:val="1"/>
-      <w:numFmt w:val="lowerLetter"/>
-      <w:lvlText w:val="%8."/>
-      <w:lvlJc w:val="left"/>
-      <w:pPr>
-        <w:ind w:left="2880" w:hanging="360"/>
-      </w:pPr>
-      <w:rPr>
-        <w:rFonts w:hint="default"/>
-      </w:rPr>
-    </w:lvl>
-    <w:lvl w:ilvl="8">
-      <w:start w:val="1"/>
-      <w:numFmt w:val="lowerRoman"/>
-      <w:lvlText w:val="%9."/>
-      <w:lvlJc w:val="left"/>
-      <w:pPr>
-        <w:ind w:left="3240" w:hanging="360"/>
-      </w:pPr>
-      <w:rPr>
-        <w:rFonts w:hint="default"/>
-      </w:rPr>
-    </w:lvl>
-  </w:abstractNum>
-  <w:abstractNum w:abstractNumId="6" w15:restartNumberingAfterBreak="0">
+  <w:abstractNum w:abstractNumId="3" w15:restartNumberingAfterBreak="0">
     <w:nsid w:val="2DC47F6D"/>
     <w:multiLevelType w:val="multilevel"/>
     <w:tmpl w:val="522AAABE"/>
@@ -25308,179 +25118,7 @@
       </w:rPr>
     </w:lvl>
   </w:abstractNum>
-  <w:abstractNum w:abstractNumId="7" w15:restartNumberingAfterBreak="0">
-    <w:nsid w:val="2EB17B6D"/>
-    <w:multiLevelType w:val="multilevel"/>
-    <w:tmpl w:val="0409001F"/>
-    <w:lvl w:ilvl="0">
-      <w:start w:val="1"/>
-      <w:numFmt w:val="decimal"/>
-      <w:lvlText w:val="%1."/>
-      <w:lvlJc w:val="left"/>
-      <w:pPr>
-        <w:ind w:left="360" w:hanging="360"/>
-      </w:pPr>
-    </w:lvl>
-    <w:lvl w:ilvl="1">
-      <w:start w:val="1"/>
-      <w:numFmt w:val="decimal"/>
-      <w:lvlText w:val="%1.%2."/>
-      <w:lvlJc w:val="left"/>
-      <w:pPr>
-        <w:ind w:left="792" w:hanging="432"/>
-      </w:pPr>
-    </w:lvl>
-    <w:lvl w:ilvl="2">
-      <w:start w:val="1"/>
-      <w:numFmt w:val="decimal"/>
-      <w:lvlText w:val="%1.%2.%3."/>
-      <w:lvlJc w:val="left"/>
-      <w:pPr>
-        <w:ind w:left="1224" w:hanging="504"/>
-      </w:pPr>
-    </w:lvl>
-    <w:lvl w:ilvl="3">
-      <w:start w:val="1"/>
-      <w:numFmt w:val="decimal"/>
-      <w:lvlText w:val="%1.%2.%3.%4."/>
-      <w:lvlJc w:val="left"/>
-      <w:pPr>
-        <w:ind w:left="1728" w:hanging="648"/>
-      </w:pPr>
-    </w:lvl>
-    <w:lvl w:ilvl="4">
-      <w:start w:val="1"/>
-      <w:numFmt w:val="decimal"/>
-      <w:lvlText w:val="%1.%2.%3.%4.%5."/>
-      <w:lvlJc w:val="left"/>
-      <w:pPr>
-        <w:ind w:left="2232" w:hanging="792"/>
-      </w:pPr>
-    </w:lvl>
-    <w:lvl w:ilvl="5">
-      <w:start w:val="1"/>
-      <w:numFmt w:val="decimal"/>
-      <w:lvlText w:val="%1.%2.%3.%4.%5.%6."/>
-      <w:lvlJc w:val="left"/>
-      <w:pPr>
-        <w:ind w:left="2736" w:hanging="936"/>
-      </w:pPr>
-    </w:lvl>
-    <w:lvl w:ilvl="6">
-      <w:start w:val="1"/>
-      <w:numFmt w:val="decimal"/>
-      <w:lvlText w:val="%1.%2.%3.%4.%5.%6.%7."/>
-      <w:lvlJc w:val="left"/>
-      <w:pPr>
-        <w:ind w:left="3240" w:hanging="1080"/>
-      </w:pPr>
-    </w:lvl>
-    <w:lvl w:ilvl="7">
-      <w:start w:val="1"/>
-      <w:numFmt w:val="decimal"/>
-      <w:lvlText w:val="%1.%2.%3.%4.%5.%6.%7.%8."/>
-      <w:lvlJc w:val="left"/>
-      <w:pPr>
-        <w:ind w:left="3744" w:hanging="1224"/>
-      </w:pPr>
-    </w:lvl>
-    <w:lvl w:ilvl="8">
-      <w:start w:val="1"/>
-      <w:numFmt w:val="decimal"/>
-      <w:lvlText w:val="%1.%2.%3.%4.%5.%6.%7.%8.%9."/>
-      <w:lvlJc w:val="left"/>
-      <w:pPr>
-        <w:ind w:left="4320" w:hanging="1440"/>
-      </w:pPr>
-    </w:lvl>
-  </w:abstractNum>
-  <w:abstractNum w:abstractNumId="8" w15:restartNumberingAfterBreak="0">
-    <w:nsid w:val="360C3A24"/>
-    <w:multiLevelType w:val="multilevel"/>
-    <w:tmpl w:val="0409001F"/>
-    <w:lvl w:ilvl="0">
-      <w:start w:val="1"/>
-      <w:numFmt w:val="decimal"/>
-      <w:lvlText w:val="%1."/>
-      <w:lvlJc w:val="left"/>
-      <w:pPr>
-        <w:ind w:left="360" w:hanging="360"/>
-      </w:pPr>
-    </w:lvl>
-    <w:lvl w:ilvl="1">
-      <w:start w:val="1"/>
-      <w:numFmt w:val="decimal"/>
-      <w:lvlText w:val="%1.%2."/>
-      <w:lvlJc w:val="left"/>
-      <w:pPr>
-        <w:ind w:left="792" w:hanging="432"/>
-      </w:pPr>
-    </w:lvl>
-    <w:lvl w:ilvl="2">
-      <w:start w:val="1"/>
-      <w:numFmt w:val="decimal"/>
-      <w:lvlText w:val="%1.%2.%3."/>
-      <w:lvlJc w:val="left"/>
-      <w:pPr>
-        <w:ind w:left="1224" w:hanging="504"/>
-      </w:pPr>
-    </w:lvl>
-    <w:lvl w:ilvl="3">
-      <w:start w:val="1"/>
-      <w:numFmt w:val="decimal"/>
-      <w:lvlText w:val="%1.%2.%3.%4."/>
-      <w:lvlJc w:val="left"/>
-      <w:pPr>
-        <w:ind w:left="1728" w:hanging="648"/>
-      </w:pPr>
-    </w:lvl>
-    <w:lvl w:ilvl="4">
-      <w:start w:val="1"/>
-      <w:numFmt w:val="decimal"/>
-      <w:lvlText w:val="%1.%2.%3.%4.%5."/>
-      <w:lvlJc w:val="left"/>
-      <w:pPr>
-        <w:ind w:left="2232" w:hanging="792"/>
-      </w:pPr>
-    </w:lvl>
-    <w:lvl w:ilvl="5">
-      <w:start w:val="1"/>
-      <w:numFmt w:val="decimal"/>
-      <w:lvlText w:val="%1.%2.%3.%4.%5.%6."/>
-      <w:lvlJc w:val="left"/>
-      <w:pPr>
-        <w:ind w:left="2736" w:hanging="936"/>
-      </w:pPr>
-    </w:lvl>
-    <w:lvl w:ilvl="6">
-      <w:start w:val="1"/>
-      <w:numFmt w:val="decimal"/>
-      <w:lvlText w:val="%1.%2.%3.%4.%5.%6.%7."/>
-      <w:lvlJc w:val="left"/>
-      <w:pPr>
-        <w:ind w:left="3240" w:hanging="1080"/>
-      </w:pPr>
-    </w:lvl>
-    <w:lvl w:ilvl="7">
-      <w:start w:val="1"/>
-      <w:numFmt w:val="decimal"/>
-      <w:lvlText w:val="%1.%2.%3.%4.%5.%6.%7.%8."/>
-      <w:lvlJc w:val="left"/>
-      <w:pPr>
-        <w:ind w:left="3744" w:hanging="1224"/>
-      </w:pPr>
-    </w:lvl>
-    <w:lvl w:ilvl="8">
-      <w:start w:val="1"/>
-      <w:numFmt w:val="decimal"/>
-      <w:lvlText w:val="%1.%2.%3.%4.%5.%6.%7.%8.%9."/>
-      <w:lvlJc w:val="left"/>
-      <w:pPr>
-        <w:ind w:left="4320" w:hanging="1440"/>
-      </w:pPr>
-    </w:lvl>
-  </w:abstractNum>
-  <w:abstractNum w:abstractNumId="9" w15:restartNumberingAfterBreak="0">
+  <w:abstractNum w:abstractNumId="4" w15:restartNumberingAfterBreak="0">
     <w:nsid w:val="3BC81EC7"/>
     <w:multiLevelType w:val="multilevel"/>
     <w:tmpl w:val="0A804404"/>
@@ -25585,7 +25223,7 @@
       </w:rPr>
     </w:lvl>
   </w:abstractNum>
-  <w:abstractNum w:abstractNumId="10" w15:restartNumberingAfterBreak="0">
+  <w:abstractNum w:abstractNumId="5" w15:restartNumberingAfterBreak="0">
     <w:nsid w:val="3E5F06EB"/>
     <w:multiLevelType w:val="multilevel"/>
     <w:tmpl w:val="522AAABE"/>
@@ -25698,12 +25336,12 @@
       </w:rPr>
     </w:lvl>
   </w:abstractNum>
-  <w:abstractNum w:abstractNumId="11" w15:restartNumberingAfterBreak="0">
-    <w:nsid w:val="63B43510"/>
+  <w:abstractNum w:abstractNumId="6" w15:restartNumberingAfterBreak="0">
+    <w:nsid w:val="4E695988"/>
     <w:multiLevelType w:val="multilevel"/>
-    <w:tmpl w:val="522AAABE"/>
+    <w:tmpl w:val="9C0C255A"/>
     <w:lvl w:ilvl="0">
-      <w:start w:val="2"/>
+      <w:start w:val="8"/>
       <w:numFmt w:val="decimal"/>
       <w:lvlText w:val="%1."/>
       <w:lvlJc w:val="left"/>
@@ -25811,270 +25449,125 @@
       </w:rPr>
     </w:lvl>
   </w:abstractNum>
-  <w:abstractNum w:abstractNumId="12" w15:restartNumberingAfterBreak="0">
-    <w:nsid w:val="675025DA"/>
+  <w:abstractNum w:abstractNumId="7" w15:restartNumberingAfterBreak="0">
+    <w:nsid w:val="523A3DDA"/>
     <w:multiLevelType w:val="multilevel"/>
-    <w:tmpl w:val="0409001F"/>
+    <w:tmpl w:val="1C984F1A"/>
     <w:lvl w:ilvl="0">
-      <w:start w:val="1"/>
+      <w:start w:val="8"/>
       <w:numFmt w:val="decimal"/>
-      <w:lvlText w:val="%1."/>
+      <w:lvlText w:val="%1"/>
       <w:lvlJc w:val="left"/>
       <w:pPr>
         <w:ind w:left="360" w:hanging="360"/>
       </w:pPr>
+      <w:rPr>
+        <w:rFonts w:hint="default"/>
+      </w:rPr>
     </w:lvl>
     <w:lvl w:ilvl="1">
       <w:start w:val="1"/>
       <w:numFmt w:val="decimal"/>
-      <w:lvlText w:val="%1.%2."/>
+      <w:lvlText w:val="%1.%2"/>
       <w:lvlJc w:val="left"/>
       <w:pPr>
-        <w:ind w:left="792" w:hanging="432"/>
-      </w:pPr>
+        <w:ind w:left="720" w:hanging="360"/>
+      </w:pPr>
+      <w:rPr>
+        <w:rFonts w:hint="default"/>
+      </w:rPr>
     </w:lvl>
     <w:lvl w:ilvl="2">
       <w:start w:val="1"/>
       <w:numFmt w:val="decimal"/>
-      <w:lvlText w:val="%1.%2.%3."/>
+      <w:lvlText w:val="%1.%2.%3"/>
       <w:lvlJc w:val="left"/>
       <w:pPr>
-        <w:ind w:left="1224" w:hanging="504"/>
-      </w:pPr>
+        <w:ind w:left="1440" w:hanging="720"/>
+      </w:pPr>
+      <w:rPr>
+        <w:rFonts w:hint="default"/>
+      </w:rPr>
     </w:lvl>
     <w:lvl w:ilvl="3">
       <w:start w:val="1"/>
       <w:numFmt w:val="decimal"/>
-      <w:lvlText w:val="%1.%2.%3.%4."/>
+      <w:lvlText w:val="%1.%2.%3.%4"/>
       <w:lvlJc w:val="left"/>
       <w:pPr>
-        <w:ind w:left="1728" w:hanging="648"/>
-      </w:pPr>
+        <w:ind w:left="1800" w:hanging="720"/>
+      </w:pPr>
+      <w:rPr>
+        <w:rFonts w:hint="default"/>
+      </w:rPr>
     </w:lvl>
     <w:lvl w:ilvl="4">
       <w:start w:val="1"/>
       <w:numFmt w:val="decimal"/>
-      <w:lvlText w:val="%1.%2.%3.%4.%5."/>
+      <w:lvlText w:val="%1.%2.%3.%4.%5"/>
       <w:lvlJc w:val="left"/>
       <w:pPr>
-        <w:ind w:left="2232" w:hanging="792"/>
-      </w:pPr>
+        <w:ind w:left="2520" w:hanging="1080"/>
+      </w:pPr>
+      <w:rPr>
+        <w:rFonts w:hint="default"/>
+      </w:rPr>
     </w:lvl>
     <w:lvl w:ilvl="5">
       <w:start w:val="1"/>
       <w:numFmt w:val="decimal"/>
-      <w:lvlText w:val="%1.%2.%3.%4.%5.%6."/>
+      <w:lvlText w:val="%1.%2.%3.%4.%5.%6"/>
       <w:lvlJc w:val="left"/>
       <w:pPr>
-        <w:ind w:left="2736" w:hanging="936"/>
-      </w:pPr>
+        <w:ind w:left="3240" w:hanging="1440"/>
+      </w:pPr>
+      <w:rPr>
+        <w:rFonts w:hint="default"/>
+      </w:rPr>
     </w:lvl>
     <w:lvl w:ilvl="6">
       <w:start w:val="1"/>
       <w:numFmt w:val="decimal"/>
-      <w:lvlText w:val="%1.%2.%3.%4.%5.%6.%7."/>
+      <w:lvlText w:val="%1.%2.%3.%4.%5.%6.%7"/>
       <w:lvlJc w:val="left"/>
       <w:pPr>
-        <w:ind w:left="3240" w:hanging="1080"/>
-      </w:pPr>
+        <w:ind w:left="3600" w:hanging="1440"/>
+      </w:pPr>
+      <w:rPr>
+        <w:rFonts w:hint="default"/>
+      </w:rPr>
     </w:lvl>
     <w:lvl w:ilvl="7">
       <w:start w:val="1"/>
       <w:numFmt w:val="decimal"/>
-      <w:lvlText w:val="%1.%2.%3.%4.%5.%6.%7.%8."/>
+      <w:lvlText w:val="%1.%2.%3.%4.%5.%6.%7.%8"/>
       <w:lvlJc w:val="left"/>
       <w:pPr>
-        <w:ind w:left="3744" w:hanging="1224"/>
-      </w:pPr>
+        <w:ind w:left="4320" w:hanging="1800"/>
+      </w:pPr>
+      <w:rPr>
+        <w:rFonts w:hint="default"/>
+      </w:rPr>
     </w:lvl>
     <w:lvl w:ilvl="8">
       <w:start w:val="1"/>
       <w:numFmt w:val="decimal"/>
-      <w:lvlText w:val="%1.%2.%3.%4.%5.%6.%7.%8.%9."/>
+      <w:lvlText w:val="%1.%2.%3.%4.%5.%6.%7.%8.%9"/>
       <w:lvlJc w:val="left"/>
       <w:pPr>
-        <w:ind w:left="4320" w:hanging="1440"/>
-      </w:pPr>
+        <w:ind w:left="4680" w:hanging="1800"/>
+      </w:pPr>
+      <w:rPr>
+        <w:rFonts w:hint="default"/>
+      </w:rPr>
     </w:lvl>
   </w:abstractNum>
-  <w:abstractNum w:abstractNumId="13" w15:restartNumberingAfterBreak="0">
-    <w:nsid w:val="6F7650B1"/>
+  <w:abstractNum w:abstractNumId="8" w15:restartNumberingAfterBreak="0">
+    <w:nsid w:val="5F03499C"/>
     <w:multiLevelType w:val="multilevel"/>
-    <w:tmpl w:val="0409001F"/>
+    <w:tmpl w:val="9F3A1BB2"/>
     <w:lvl w:ilvl="0">
-      <w:start w:val="1"/>
-      <w:numFmt w:val="decimal"/>
-      <w:lvlText w:val="%1."/>
-      <w:lvlJc w:val="left"/>
-      <w:pPr>
-        <w:ind w:left="360" w:hanging="360"/>
-      </w:pPr>
-    </w:lvl>
-    <w:lvl w:ilvl="1">
-      <w:start w:val="1"/>
-      <w:numFmt w:val="decimal"/>
-      <w:lvlText w:val="%1.%2."/>
-      <w:lvlJc w:val="left"/>
-      <w:pPr>
-        <w:ind w:left="792" w:hanging="432"/>
-      </w:pPr>
-    </w:lvl>
-    <w:lvl w:ilvl="2">
-      <w:start w:val="1"/>
-      <w:numFmt w:val="decimal"/>
-      <w:lvlText w:val="%1.%2.%3."/>
-      <w:lvlJc w:val="left"/>
-      <w:pPr>
-        <w:ind w:left="1224" w:hanging="504"/>
-      </w:pPr>
-    </w:lvl>
-    <w:lvl w:ilvl="3">
-      <w:start w:val="1"/>
-      <w:numFmt w:val="decimal"/>
-      <w:lvlText w:val="%1.%2.%3.%4."/>
-      <w:lvlJc w:val="left"/>
-      <w:pPr>
-        <w:ind w:left="1728" w:hanging="648"/>
-      </w:pPr>
-    </w:lvl>
-    <w:lvl w:ilvl="4">
-      <w:start w:val="1"/>
-      <w:numFmt w:val="decimal"/>
-      <w:lvlText w:val="%1.%2.%3.%4.%5."/>
-      <w:lvlJc w:val="left"/>
-      <w:pPr>
-        <w:ind w:left="2232" w:hanging="792"/>
-      </w:pPr>
-    </w:lvl>
-    <w:lvl w:ilvl="5">
-      <w:start w:val="1"/>
-      <w:numFmt w:val="decimal"/>
-      <w:lvlText w:val="%1.%2.%3.%4.%5.%6."/>
-      <w:lvlJc w:val="left"/>
-      <w:pPr>
-        <w:ind w:left="2736" w:hanging="936"/>
-      </w:pPr>
-    </w:lvl>
-    <w:lvl w:ilvl="6">
-      <w:start w:val="1"/>
-      <w:numFmt w:val="decimal"/>
-      <w:lvlText w:val="%1.%2.%3.%4.%5.%6.%7."/>
-      <w:lvlJc w:val="left"/>
-      <w:pPr>
-        <w:ind w:left="3240" w:hanging="1080"/>
-      </w:pPr>
-    </w:lvl>
-    <w:lvl w:ilvl="7">
-      <w:start w:val="1"/>
-      <w:numFmt w:val="decimal"/>
-      <w:lvlText w:val="%1.%2.%3.%4.%5.%6.%7.%8."/>
-      <w:lvlJc w:val="left"/>
-      <w:pPr>
-        <w:ind w:left="3744" w:hanging="1224"/>
-      </w:pPr>
-    </w:lvl>
-    <w:lvl w:ilvl="8">
-      <w:start w:val="1"/>
-      <w:numFmt w:val="decimal"/>
-      <w:lvlText w:val="%1.%2.%3.%4.%5.%6.%7.%8.%9."/>
-      <w:lvlJc w:val="left"/>
-      <w:pPr>
-        <w:ind w:left="4320" w:hanging="1440"/>
-      </w:pPr>
-    </w:lvl>
-  </w:abstractNum>
-  <w:abstractNum w:abstractNumId="14" w15:restartNumberingAfterBreak="0">
-    <w:nsid w:val="73252ADF"/>
-    <w:multiLevelType w:val="multilevel"/>
-    <w:tmpl w:val="0409001F"/>
-    <w:lvl w:ilvl="0">
-      <w:start w:val="1"/>
-      <w:numFmt w:val="decimal"/>
-      <w:lvlText w:val="%1."/>
-      <w:lvlJc w:val="left"/>
-      <w:pPr>
-        <w:ind w:left="360" w:hanging="360"/>
-      </w:pPr>
-    </w:lvl>
-    <w:lvl w:ilvl="1">
-      <w:start w:val="1"/>
-      <w:numFmt w:val="decimal"/>
-      <w:lvlText w:val="%1.%2."/>
-      <w:lvlJc w:val="left"/>
-      <w:pPr>
-        <w:ind w:left="792" w:hanging="432"/>
-      </w:pPr>
-    </w:lvl>
-    <w:lvl w:ilvl="2">
-      <w:start w:val="1"/>
-      <w:numFmt w:val="decimal"/>
-      <w:lvlText w:val="%1.%2.%3."/>
-      <w:lvlJc w:val="left"/>
-      <w:pPr>
-        <w:ind w:left="1224" w:hanging="504"/>
-      </w:pPr>
-    </w:lvl>
-    <w:lvl w:ilvl="3">
-      <w:start w:val="1"/>
-      <w:numFmt w:val="decimal"/>
-      <w:lvlText w:val="%1.%2.%3.%4."/>
-      <w:lvlJc w:val="left"/>
-      <w:pPr>
-        <w:ind w:left="1728" w:hanging="648"/>
-      </w:pPr>
-    </w:lvl>
-    <w:lvl w:ilvl="4">
-      <w:start w:val="1"/>
-      <w:numFmt w:val="decimal"/>
-      <w:lvlText w:val="%1.%2.%3.%4.%5."/>
-      <w:lvlJc w:val="left"/>
-      <w:pPr>
-        <w:ind w:left="2232" w:hanging="792"/>
-      </w:pPr>
-    </w:lvl>
-    <w:lvl w:ilvl="5">
-      <w:start w:val="1"/>
-      <w:numFmt w:val="decimal"/>
-      <w:lvlText w:val="%1.%2.%3.%4.%5.%6."/>
-      <w:lvlJc w:val="left"/>
-      <w:pPr>
-        <w:ind w:left="2736" w:hanging="936"/>
-      </w:pPr>
-    </w:lvl>
-    <w:lvl w:ilvl="6">
-      <w:start w:val="1"/>
-      <w:numFmt w:val="decimal"/>
-      <w:lvlText w:val="%1.%2.%3.%4.%5.%6.%7."/>
-      <w:lvlJc w:val="left"/>
-      <w:pPr>
-        <w:ind w:left="3240" w:hanging="1080"/>
-      </w:pPr>
-    </w:lvl>
-    <w:lvl w:ilvl="7">
-      <w:start w:val="1"/>
-      <w:numFmt w:val="decimal"/>
-      <w:lvlText w:val="%1.%2.%3.%4.%5.%6.%7.%8."/>
-      <w:lvlJc w:val="left"/>
-      <w:pPr>
-        <w:ind w:left="3744" w:hanging="1224"/>
-      </w:pPr>
-    </w:lvl>
-    <w:lvl w:ilvl="8">
-      <w:start w:val="1"/>
-      <w:numFmt w:val="decimal"/>
-      <w:lvlText w:val="%1.%2.%3.%4.%5.%6.%7.%8.%9."/>
-      <w:lvlJc w:val="left"/>
-      <w:pPr>
-        <w:ind w:left="4320" w:hanging="1440"/>
-      </w:pPr>
-    </w:lvl>
-  </w:abstractNum>
-  <w:abstractNum w:abstractNumId="15" w15:restartNumberingAfterBreak="0">
-    <w:nsid w:val="7B6F2131"/>
-    <w:multiLevelType w:val="multilevel"/>
-    <w:tmpl w:val="C1D20592"/>
-    <w:lvl w:ilvl="0">
-      <w:start w:val="1"/>
+      <w:start w:val="9"/>
       <w:numFmt w:val="decimal"/>
       <w:lvlText w:val="%1."/>
       <w:lvlJc w:val="left"/>
@@ -26182,239 +25675,290 @@
       </w:rPr>
     </w:lvl>
   </w:abstractNum>
-  <w:abstractNum w:abstractNumId="16" w15:restartNumberingAfterBreak="0">
-    <w:nsid w:val="7BD565E9"/>
-    <w:multiLevelType w:val="hybridMultilevel"/>
-    <w:tmpl w:val="B7EAFA6C"/>
-    <w:lvl w:ilvl="0" w:tplc="0409000F">
+  <w:abstractNum w:abstractNumId="9" w15:restartNumberingAfterBreak="0">
+    <w:nsid w:val="5FD827EC"/>
+    <w:multiLevelType w:val="multilevel"/>
+    <w:tmpl w:val="9F3A1BB2"/>
+    <w:lvl w:ilvl="0">
+      <w:start w:val="9"/>
+      <w:numFmt w:val="decimal"/>
+      <w:lvlText w:val="%1."/>
+      <w:lvlJc w:val="left"/>
+      <w:pPr>
+        <w:ind w:left="360" w:hanging="360"/>
+      </w:pPr>
+      <w:rPr>
+        <w:rFonts w:hint="default"/>
+      </w:rPr>
+    </w:lvl>
+    <w:lvl w:ilvl="1">
+      <w:start w:val="1"/>
+      <w:numFmt w:val="decimal"/>
+      <w:lvlText w:val="%1.%2."/>
+      <w:lvlJc w:val="left"/>
+      <w:pPr>
+        <w:ind w:left="792" w:hanging="432"/>
+      </w:pPr>
+      <w:rPr>
+        <w:rFonts w:hint="default"/>
+      </w:rPr>
+    </w:lvl>
+    <w:lvl w:ilvl="2">
+      <w:start w:val="1"/>
+      <w:numFmt w:val="decimal"/>
+      <w:lvlText w:val="%1.%2.%3."/>
+      <w:lvlJc w:val="left"/>
+      <w:pPr>
+        <w:ind w:left="1224" w:hanging="504"/>
+      </w:pPr>
+      <w:rPr>
+        <w:rFonts w:hint="default"/>
+      </w:rPr>
+    </w:lvl>
+    <w:lvl w:ilvl="3">
+      <w:start w:val="1"/>
+      <w:numFmt w:val="decimal"/>
+      <w:lvlText w:val="%1.%2.%3.%4."/>
+      <w:lvlJc w:val="left"/>
+      <w:pPr>
+        <w:ind w:left="1728" w:hanging="648"/>
+      </w:pPr>
+      <w:rPr>
+        <w:rFonts w:hint="default"/>
+      </w:rPr>
+    </w:lvl>
+    <w:lvl w:ilvl="4">
+      <w:start w:val="1"/>
+      <w:numFmt w:val="decimal"/>
+      <w:lvlText w:val="%1.%2.%3.%4.%5."/>
+      <w:lvlJc w:val="left"/>
+      <w:pPr>
+        <w:ind w:left="2232" w:hanging="792"/>
+      </w:pPr>
+      <w:rPr>
+        <w:rFonts w:hint="default"/>
+      </w:rPr>
+    </w:lvl>
+    <w:lvl w:ilvl="5">
+      <w:start w:val="1"/>
+      <w:numFmt w:val="decimal"/>
+      <w:lvlText w:val="%1.%2.%3.%4.%5.%6."/>
+      <w:lvlJc w:val="left"/>
+      <w:pPr>
+        <w:ind w:left="2736" w:hanging="936"/>
+      </w:pPr>
+      <w:rPr>
+        <w:rFonts w:hint="default"/>
+      </w:rPr>
+    </w:lvl>
+    <w:lvl w:ilvl="6">
+      <w:start w:val="1"/>
+      <w:numFmt w:val="decimal"/>
+      <w:lvlText w:val="%1.%2.%3.%4.%5.%6.%7."/>
+      <w:lvlJc w:val="left"/>
+      <w:pPr>
+        <w:ind w:left="3240" w:hanging="1080"/>
+      </w:pPr>
+      <w:rPr>
+        <w:rFonts w:hint="default"/>
+      </w:rPr>
+    </w:lvl>
+    <w:lvl w:ilvl="7">
+      <w:start w:val="1"/>
+      <w:numFmt w:val="decimal"/>
+      <w:lvlText w:val="%1.%2.%3.%4.%5.%6.%7.%8."/>
+      <w:lvlJc w:val="left"/>
+      <w:pPr>
+        <w:ind w:left="3744" w:hanging="1224"/>
+      </w:pPr>
+      <w:rPr>
+        <w:rFonts w:hint="default"/>
+      </w:rPr>
+    </w:lvl>
+    <w:lvl w:ilvl="8">
+      <w:start w:val="1"/>
+      <w:numFmt w:val="decimal"/>
+      <w:lvlText w:val="%1.%2.%3.%4.%5.%6.%7.%8.%9."/>
+      <w:lvlJc w:val="left"/>
+      <w:pPr>
+        <w:ind w:left="4320" w:hanging="1440"/>
+      </w:pPr>
+      <w:rPr>
+        <w:rFonts w:hint="default"/>
+      </w:rPr>
+    </w:lvl>
+  </w:abstractNum>
+  <w:abstractNum w:abstractNumId="10" w15:restartNumberingAfterBreak="0">
+    <w:nsid w:val="7B6F2131"/>
+    <w:multiLevelType w:val="multilevel"/>
+    <w:tmpl w:val="C1D20592"/>
+    <w:lvl w:ilvl="0">
       <w:start w:val="1"/>
       <w:numFmt w:val="decimal"/>
       <w:lvlText w:val="%1."/>
       <w:lvlJc w:val="left"/>
       <w:pPr>
-        <w:ind w:left="720" w:hanging="360"/>
-      </w:pPr>
+        <w:ind w:left="360" w:hanging="360"/>
+      </w:pPr>
+      <w:rPr>
+        <w:rFonts w:hint="default"/>
+      </w:rPr>
     </w:lvl>
-    <w:lvl w:ilvl="1" w:tplc="04090019" w:tentative="1">
-      <w:start w:val="1"/>
-      <w:numFmt w:val="lowerLetter"/>
-      <w:lvlText w:val="%2."/>
-      <w:lvlJc w:val="left"/>
-      <w:pPr>
-        <w:ind w:left="1440" w:hanging="360"/>
-      </w:pPr>
-    </w:lvl>
-    <w:lvl w:ilvl="2" w:tplc="0409001B" w:tentative="1">
-      <w:start w:val="1"/>
-      <w:numFmt w:val="lowerRoman"/>
-      <w:lvlText w:val="%3."/>
-      <w:lvlJc w:val="right"/>
-      <w:pPr>
-        <w:ind w:left="2160" w:hanging="180"/>
-      </w:pPr>
-    </w:lvl>
-    <w:lvl w:ilvl="3" w:tplc="0409000F" w:tentative="1">
+    <w:lvl w:ilvl="1">
       <w:start w:val="1"/>
       <w:numFmt w:val="decimal"/>
-      <w:lvlText w:val="%4."/>
+      <w:lvlText w:val="%1.%2."/>
       <w:lvlJc w:val="left"/>
       <w:pPr>
-        <w:ind w:left="2880" w:hanging="360"/>
-      </w:pPr>
+        <w:ind w:left="792" w:hanging="432"/>
+      </w:pPr>
+      <w:rPr>
+        <w:rFonts w:hint="default"/>
+      </w:rPr>
     </w:lvl>
-    <w:lvl w:ilvl="4" w:tplc="04090019" w:tentative="1">
-      <w:start w:val="1"/>
-      <w:numFmt w:val="lowerLetter"/>
-      <w:lvlText w:val="%5."/>
-      <w:lvlJc w:val="left"/>
-      <w:pPr>
-        <w:ind w:left="3600" w:hanging="360"/>
-      </w:pPr>
-    </w:lvl>
-    <w:lvl w:ilvl="5" w:tplc="0409001B" w:tentative="1">
-      <w:start w:val="1"/>
-      <w:numFmt w:val="lowerRoman"/>
-      <w:lvlText w:val="%6."/>
-      <w:lvlJc w:val="right"/>
-      <w:pPr>
-        <w:ind w:left="4320" w:hanging="180"/>
-      </w:pPr>
-    </w:lvl>
-    <w:lvl w:ilvl="6" w:tplc="0409000F" w:tentative="1">
+    <w:lvl w:ilvl="2">
       <w:start w:val="1"/>
       <w:numFmt w:val="decimal"/>
-      <w:lvlText w:val="%7."/>
+      <w:lvlText w:val="%1.%2.%3."/>
       <w:lvlJc w:val="left"/>
       <w:pPr>
-        <w:ind w:left="5040" w:hanging="360"/>
-      </w:pPr>
+        <w:ind w:left="1224" w:hanging="504"/>
+      </w:pPr>
+      <w:rPr>
+        <w:rFonts w:hint="default"/>
+      </w:rPr>
     </w:lvl>
-    <w:lvl w:ilvl="7" w:tplc="04090019" w:tentative="1">
+    <w:lvl w:ilvl="3">
       <w:start w:val="1"/>
-      <w:numFmt w:val="lowerLetter"/>
-      <w:lvlText w:val="%8."/>
+      <w:numFmt w:val="decimal"/>
+      <w:lvlText w:val="%1.%2.%3.%4."/>
       <w:lvlJc w:val="left"/>
       <w:pPr>
-        <w:ind w:left="5760" w:hanging="360"/>
-      </w:pPr>
+        <w:ind w:left="1728" w:hanging="648"/>
+      </w:pPr>
+      <w:rPr>
+        <w:rFonts w:hint="default"/>
+      </w:rPr>
     </w:lvl>
-    <w:lvl w:ilvl="8" w:tplc="0409001B" w:tentative="1">
+    <w:lvl w:ilvl="4">
       <w:start w:val="1"/>
-      <w:numFmt w:val="lowerRoman"/>
-      <w:lvlText w:val="%9."/>
-      <w:lvlJc w:val="right"/>
-      <w:pPr>
-        <w:ind w:left="6480" w:hanging="180"/>
-      </w:pPr>
+      <w:numFmt w:val="decimal"/>
+      <w:lvlText w:val="%1.%2.%3.%4.%5."/>
+      <w:lvlJc w:val="left"/>
+      <w:pPr>
+        <w:ind w:left="2232" w:hanging="792"/>
+      </w:pPr>
+      <w:rPr>
+        <w:rFonts w:hint="default"/>
+      </w:rPr>
+    </w:lvl>
+    <w:lvl w:ilvl="5">
+      <w:start w:val="1"/>
+      <w:numFmt w:val="decimal"/>
+      <w:lvlText w:val="%1.%2.%3.%4.%5.%6."/>
+      <w:lvlJc w:val="left"/>
+      <w:pPr>
+        <w:ind w:left="2736" w:hanging="936"/>
+      </w:pPr>
+      <w:rPr>
+        <w:rFonts w:hint="default"/>
+      </w:rPr>
+    </w:lvl>
+    <w:lvl w:ilvl="6">
+      <w:start w:val="1"/>
+      <w:numFmt w:val="decimal"/>
+      <w:lvlText w:val="%1.%2.%3.%4.%5.%6.%7."/>
+      <w:lvlJc w:val="left"/>
+      <w:pPr>
+        <w:ind w:left="3240" w:hanging="1080"/>
+      </w:pPr>
+      <w:rPr>
+        <w:rFonts w:hint="default"/>
+      </w:rPr>
+    </w:lvl>
+    <w:lvl w:ilvl="7">
+      <w:start w:val="1"/>
+      <w:numFmt w:val="decimal"/>
+      <w:lvlText w:val="%1.%2.%3.%4.%5.%6.%7.%8."/>
+      <w:lvlJc w:val="left"/>
+      <w:pPr>
+        <w:ind w:left="3744" w:hanging="1224"/>
+      </w:pPr>
+      <w:rPr>
+        <w:rFonts w:hint="default"/>
+      </w:rPr>
+    </w:lvl>
+    <w:lvl w:ilvl="8">
+      <w:start w:val="1"/>
+      <w:numFmt w:val="decimal"/>
+      <w:lvlText w:val="%1.%2.%3.%4.%5.%6.%7.%8.%9."/>
+      <w:lvlJc w:val="left"/>
+      <w:pPr>
+        <w:ind w:left="4320" w:hanging="1440"/>
+      </w:pPr>
+      <w:rPr>
+        <w:rFonts w:hint="default"/>
+      </w:rPr>
     </w:lvl>
   </w:abstractNum>
-  <w:num w:numId="1" w16cid:durableId="606038169">
+  <w:num w:numId="1" w16cid:durableId="1222718912">
     <w:abstractNumId w:val="0"/>
   </w:num>
-  <w:num w:numId="2" w16cid:durableId="1222718912">
+  <w:num w:numId="2" w16cid:durableId="984310791">
+    <w:abstractNumId w:val="0"/>
+  </w:num>
+  <w:num w:numId="3" w16cid:durableId="197357091">
+    <w:abstractNumId w:val="0"/>
+  </w:num>
+  <w:num w:numId="4" w16cid:durableId="42367860">
+    <w:abstractNumId w:val="0"/>
+  </w:num>
+  <w:num w:numId="5" w16cid:durableId="693383279">
+    <w:abstractNumId w:val="0"/>
+  </w:num>
+  <w:num w:numId="6" w16cid:durableId="1027604630">
+    <w:abstractNumId w:val="0"/>
+  </w:num>
+  <w:num w:numId="7" w16cid:durableId="2133160489">
+    <w:abstractNumId w:val="0"/>
+  </w:num>
+  <w:num w:numId="8" w16cid:durableId="683098588">
+    <w:abstractNumId w:val="0"/>
+  </w:num>
+  <w:num w:numId="9" w16cid:durableId="128404489">
+    <w:abstractNumId w:val="5"/>
+  </w:num>
+  <w:num w:numId="10" w16cid:durableId="869419732">
+    <w:abstractNumId w:val="10"/>
+  </w:num>
+  <w:num w:numId="11" w16cid:durableId="694499405">
+    <w:abstractNumId w:val="3"/>
+  </w:num>
+  <w:num w:numId="12" w16cid:durableId="1584795651">
+    <w:abstractNumId w:val="5"/>
+  </w:num>
+  <w:num w:numId="13" w16cid:durableId="782312310">
     <w:abstractNumId w:val="1"/>
   </w:num>
-  <w:num w:numId="3" w16cid:durableId="984310791">
-    <w:abstractNumId w:val="1"/>
+  <w:num w:numId="14" w16cid:durableId="1798255035">
+    <w:abstractNumId w:val="4"/>
   </w:num>
-  <w:num w:numId="4" w16cid:durableId="197357091">
-    <w:abstractNumId w:val="1"/>
-  </w:num>
-  <w:num w:numId="5" w16cid:durableId="42367860">
-    <w:abstractNumId w:val="1"/>
-  </w:num>
-  <w:num w:numId="6" w16cid:durableId="693383279">
-    <w:abstractNumId w:val="1"/>
-  </w:num>
-  <w:num w:numId="7" w16cid:durableId="1027604630">
-    <w:abstractNumId w:val="1"/>
-  </w:num>
-  <w:num w:numId="8" w16cid:durableId="2133160489">
-    <w:abstractNumId w:val="1"/>
-  </w:num>
-  <w:num w:numId="9" w16cid:durableId="683098588">
-    <w:abstractNumId w:val="1"/>
-  </w:num>
-  <w:num w:numId="10" w16cid:durableId="969480531">
-    <w:abstractNumId w:val="1"/>
-  </w:num>
-  <w:num w:numId="11" w16cid:durableId="1008681612">
-    <w:abstractNumId w:val="1"/>
-  </w:num>
-  <w:num w:numId="12" w16cid:durableId="1034890792">
-    <w:abstractNumId w:val="1"/>
-  </w:num>
-  <w:num w:numId="13" w16cid:durableId="1497527137">
-    <w:abstractNumId w:val="1"/>
-  </w:num>
-  <w:num w:numId="14" w16cid:durableId="1946424045">
-    <w:abstractNumId w:val="1"/>
-  </w:num>
-  <w:num w:numId="15" w16cid:durableId="1461073109">
-    <w:abstractNumId w:val="1"/>
-  </w:num>
-  <w:num w:numId="16" w16cid:durableId="776363879">
-    <w:abstractNumId w:val="1"/>
-  </w:num>
-  <w:num w:numId="17" w16cid:durableId="744030770">
-    <w:abstractNumId w:val="1"/>
-  </w:num>
-  <w:num w:numId="18" w16cid:durableId="1487548619">
-    <w:abstractNumId w:val="1"/>
-  </w:num>
-  <w:num w:numId="19" w16cid:durableId="1498031587">
-    <w:abstractNumId w:val="1"/>
-  </w:num>
-  <w:num w:numId="20" w16cid:durableId="667488078">
-    <w:abstractNumId w:val="1"/>
-  </w:num>
-  <w:num w:numId="21" w16cid:durableId="612132820">
-    <w:abstractNumId w:val="1"/>
-  </w:num>
-  <w:num w:numId="22" w16cid:durableId="1163735676">
-    <w:abstractNumId w:val="1"/>
-  </w:num>
-  <w:num w:numId="23" w16cid:durableId="570384616">
-    <w:abstractNumId w:val="1"/>
-  </w:num>
-  <w:num w:numId="24" w16cid:durableId="115562045">
-    <w:abstractNumId w:val="1"/>
-  </w:num>
-  <w:num w:numId="25" w16cid:durableId="353118295">
-    <w:abstractNumId w:val="1"/>
-  </w:num>
-  <w:num w:numId="26" w16cid:durableId="117796175">
-    <w:abstractNumId w:val="1"/>
-  </w:num>
-  <w:num w:numId="27" w16cid:durableId="760377147">
-    <w:abstractNumId w:val="1"/>
-  </w:num>
-  <w:num w:numId="28" w16cid:durableId="919020028">
-    <w:abstractNumId w:val="1"/>
-  </w:num>
-  <w:num w:numId="29" w16cid:durableId="86466299">
-    <w:abstractNumId w:val="1"/>
-  </w:num>
-  <w:num w:numId="30" w16cid:durableId="1976059263">
-    <w:abstractNumId w:val="1"/>
-  </w:num>
-  <w:num w:numId="31" w16cid:durableId="921571083">
-    <w:abstractNumId w:val="1"/>
-  </w:num>
-  <w:num w:numId="32" w16cid:durableId="845630464">
-    <w:abstractNumId w:val="1"/>
-  </w:num>
-  <w:num w:numId="33" w16cid:durableId="807405154">
-    <w:abstractNumId w:val="16"/>
-  </w:num>
-  <w:num w:numId="34" w16cid:durableId="436340657">
-    <w:abstractNumId w:val="10"/>
-  </w:num>
-  <w:num w:numId="35" w16cid:durableId="227154094">
-    <w:abstractNumId w:val="5"/>
-  </w:num>
-  <w:num w:numId="36" w16cid:durableId="128404489">
-    <w:abstractNumId w:val="10"/>
-  </w:num>
-  <w:num w:numId="37" w16cid:durableId="399446513">
+  <w:num w:numId="15" w16cid:durableId="2109619911">
     <w:abstractNumId w:val="2"/>
   </w:num>
-  <w:num w:numId="38" w16cid:durableId="644744037">
-    <w:abstractNumId w:val="12"/>
-  </w:num>
-  <w:num w:numId="39" w16cid:durableId="1761411998">
-    <w:abstractNumId w:val="14"/>
-  </w:num>
-  <w:num w:numId="40" w16cid:durableId="576743937">
-    <w:abstractNumId w:val="13"/>
-  </w:num>
-  <w:num w:numId="41" w16cid:durableId="406651791">
+  <w:num w:numId="16" w16cid:durableId="1730348130">
     <w:abstractNumId w:val="8"/>
   </w:num>
-  <w:num w:numId="42" w16cid:durableId="768741951">
+  <w:num w:numId="17" w16cid:durableId="715130808">
+    <w:abstractNumId w:val="9"/>
+  </w:num>
+  <w:num w:numId="18" w16cid:durableId="1000472887">
+    <w:abstractNumId w:val="6"/>
+  </w:num>
+  <w:num w:numId="19" w16cid:durableId="1942489882">
     <w:abstractNumId w:val="7"/>
   </w:num>
-  <w:num w:numId="43" w16cid:durableId="869419732">
-    <w:abstractNumId w:val="15"/>
-  </w:num>
-  <w:num w:numId="44" w16cid:durableId="694499405">
-    <w:abstractNumId w:val="6"/>
-  </w:num>
-  <w:num w:numId="45" w16cid:durableId="1333528701">
-    <w:abstractNumId w:val="11"/>
-  </w:num>
-  <w:num w:numId="46" w16cid:durableId="1584795651">
-    <w:abstractNumId w:val="10"/>
-  </w:num>
-  <w:num w:numId="47" w16cid:durableId="782312310">
-    <w:abstractNumId w:val="3"/>
-  </w:num>
-  <w:num w:numId="48" w16cid:durableId="1798255035">
-    <w:abstractNumId w:val="9"/>
-  </w:num>
-  <w:num w:numId="49" w16cid:durableId="2109619911">
-    <w:abstractNumId w:val="4"/>
-  </w:num>
+  <w:numIdMacAtCleanup w:val="19"/>
 </w:numbering>
 </file>
 

</xml_diff>